<commit_message>
docs(core): marca BL-04 como WON'T FIX e documenta precondição
findBaseProperties() assume no máximo 1 ConfigDocument com profile
vazio por ConfigFile — invariante garantida pelo ConfigLoader (único
ponto de construção real de ConfigFile no pipeline), nunca violada
fora de construção manual em teste.

Decisão: não vale complexidade de defesa em profundidade contra um
estado que só existe se a API pública for contornada deliberadamente —
YAGNI. Precondição agora explícita no Javadoc de findBaseProperties,
citando BL-04 em BACKLOG.md. Teste doisDocumentosBaseApenasPrimeiroEUsadoSegundoEPerdido
mantido como tripwire de documentação executável, mesmo sem correção
de lógica prevista.

Refs: BACKLOG.md atualizado — BL-04 fechado como WONT´T BE FIX.
</commit_message>
<xml_diff>
--- a/BACKLOG.docx
+++ b/BACKLOG.docx
@@ -57,21 +57,17 @@
           <mc:Choice Requires="wps">
             <w:drawing>
               <wp:inline distT="0" distB="0" distL="0" distR="0">
-                <wp:extent cx="5944235" cy="19685"/>
+                <wp:extent cx="5944870" cy="20320"/>
                 <wp:effectExtent l="0" t="0" r="0" b="0"/>
-                <wp:docPr id="1" name=""/>
+                <wp:docPr id="1" name="Forma1"/>
                 <a:graphic xmlns:a="http://schemas.openxmlformats.org/drawingml/2006/main">
                   <a:graphicData uri="http://schemas.microsoft.com/office/word/2010/wordprocessingShape">
                     <wps:wsp>
                       <wps:cNvSpPr/>
-                      <wps:nvSpPr>
-                        <wps:cNvPr id="0" name=""/>
-                        <wps:cNvSpPr/>
-                      </wps:nvSpPr>
                       <wps:spPr>
                         <a:xfrm>
                           <a:off x="0" y="0"/>
-                          <a:ext cx="5943600" cy="19080"/>
+                          <a:ext cx="5944320" cy="19800"/>
                         </a:xfrm>
                         <a:prstGeom prst="rect">
                           <a:avLst/>
@@ -85,6 +81,12 @@
                           </a:solidFill>
                         </a:ln>
                       </wps:spPr>
+                      <wps:style>
+                        <a:lnRef idx="0"/>
+                        <a:fillRef idx="0"/>
+                        <a:effectRef idx="0"/>
+                        <a:fontRef idx="minor"/>
+                      </wps:style>
                       <wps:bodyPr/>
                     </wps:wsp>
                   </a:graphicData>
@@ -97,10 +99,10 @@
           </mc:Choice>
           <mc:Fallback>
             <w:pict>
-              <v:rect id="shape_0" fillcolor="white" stroked="t" o:allowincell="f" style="position:absolute;margin-left:0pt;margin-top:-1.55pt;width:467.95pt;height:1.45pt;mso-wrap-style:none;v-text-anchor:middle;mso-position-horizontal:center;mso-position-vertical:top">
+              <v:rect id="shape_0" ID="Forma1" path="m0,0l-2147483645,0l-2147483645,-2147483646l0,-2147483646xe" fillcolor="white" stroked="t" o:allowincell="f" style="position:absolute;margin-left:0pt;margin-top:-1.6pt;width:468pt;height:1.5pt;mso-wrap-style:none;v-text-anchor:middle;mso-position-vertical:top">
                 <v:fill o:detectmouseclick="t" type="solid" color2="black"/>
                 <v:stroke color="black" joinstyle="round" endcap="flat"/>
-                <w10:wrap type="topAndBottom"/>
+                <w10:wrap type="square"/>
               </v:rect>
             </w:pict>
           </mc:Fallback>
@@ -134,7 +136,29 @@
       </w:r>
       <w:r>
         <w:rPr/>
-        <w:t xml:space="preserve"> não é protegido contra mutação externa</w:t>
+        <w:t xml:space="preserve"> não é protegido contra mutação externa </w:t>
+      </w:r>
+      <w:r>
+        <w:rPr>
+          <w:rFonts w:eastAsia="Cambria" w:cs="" w:ascii="Cambria" w:hAnsi="Cambria"/>
+          <w:kern w:val="0"/>
+          <w:sz w:val="20"/>
+          <w:szCs w:val="20"/>
+          <w:lang w:val="en-US" w:eastAsia="en-US" w:bidi="ar-SA"/>
+        </w:rPr>
+        <w:t xml:space="preserve">🟢 </w:t>
+      </w:r>
+      <w:r>
+        <w:rPr>
+          <w:rFonts w:eastAsia="Cambria" w:cs="" w:ascii="Cambria" w:hAnsi="Cambria"/>
+          <w:b/>
+          <w:bCs/>
+          <w:kern w:val="0"/>
+          <w:sz w:val="20"/>
+          <w:szCs w:val="20"/>
+          <w:lang w:val="en-US" w:eastAsia="en-US" w:bidi="ar-SA"/>
+        </w:rPr>
+        <w:t xml:space="preserve"> DONE</w:t>
       </w:r>
     </w:p>
     <w:p>
@@ -473,21 +497,17 @@
           <mc:Choice Requires="wps">
             <w:drawing>
               <wp:inline distT="0" distB="0" distL="0" distR="0">
-                <wp:extent cx="5944235" cy="19685"/>
+                <wp:extent cx="5944870" cy="20320"/>
                 <wp:effectExtent l="0" t="0" r="0" b="0"/>
-                <wp:docPr id="2" name=""/>
+                <wp:docPr id="2" name="Forma2"/>
                 <a:graphic xmlns:a="http://schemas.openxmlformats.org/drawingml/2006/main">
                   <a:graphicData uri="http://schemas.microsoft.com/office/word/2010/wordprocessingShape">
                     <wps:wsp>
                       <wps:cNvSpPr/>
-                      <wps:nvSpPr>
-                        <wps:cNvPr id="1" name=""/>
-                        <wps:cNvSpPr/>
-                      </wps:nvSpPr>
                       <wps:spPr>
                         <a:xfrm>
                           <a:off x="0" y="0"/>
-                          <a:ext cx="5943600" cy="19080"/>
+                          <a:ext cx="5944320" cy="19800"/>
                         </a:xfrm>
                         <a:prstGeom prst="rect">
                           <a:avLst/>
@@ -501,6 +521,12 @@
                           </a:solidFill>
                         </a:ln>
                       </wps:spPr>
+                      <wps:style>
+                        <a:lnRef idx="0"/>
+                        <a:fillRef idx="0"/>
+                        <a:effectRef idx="0"/>
+                        <a:fontRef idx="minor"/>
+                      </wps:style>
                       <wps:bodyPr/>
                     </wps:wsp>
                   </a:graphicData>
@@ -513,10 +539,10 @@
           </mc:Choice>
           <mc:Fallback>
             <w:pict>
-              <v:rect id="shape_0" fillcolor="white" stroked="t" o:allowincell="f" style="position:absolute;margin-left:0pt;margin-top:-1.55pt;width:467.95pt;height:1.45pt;mso-wrap-style:none;v-text-anchor:middle;mso-position-horizontal:center;mso-position-vertical:top">
+              <v:rect id="shape_0" ID="Forma2" path="m0,0l-2147483645,0l-2147483645,-2147483646l0,-2147483646xe" fillcolor="white" stroked="t" o:allowincell="f" style="position:absolute;margin-left:0pt;margin-top:-1.6pt;width:468pt;height:1.5pt;mso-wrap-style:none;v-text-anchor:middle;mso-position-vertical:top">
                 <v:fill o:detectmouseclick="t" type="solid" color2="black"/>
                 <v:stroke color="black" joinstyle="round" endcap="flat"/>
-                <w10:wrap type="topAndBottom"/>
+                <w10:wrap type="square"/>
               </v:rect>
             </w:pict>
           </mc:Fallback>
@@ -951,21 +977,17 @@
           <mc:Choice Requires="wps">
             <w:drawing>
               <wp:inline distT="0" distB="0" distL="0" distR="0">
-                <wp:extent cx="5944235" cy="19685"/>
+                <wp:extent cx="5944870" cy="20320"/>
                 <wp:effectExtent l="0" t="0" r="0" b="0"/>
-                <wp:docPr id="3" name=""/>
+                <wp:docPr id="3" name="Forma3"/>
                 <a:graphic xmlns:a="http://schemas.openxmlformats.org/drawingml/2006/main">
                   <a:graphicData uri="http://schemas.microsoft.com/office/word/2010/wordprocessingShape">
                     <wps:wsp>
                       <wps:cNvSpPr/>
-                      <wps:nvSpPr>
-                        <wps:cNvPr id="2" name=""/>
-                        <wps:cNvSpPr/>
-                      </wps:nvSpPr>
                       <wps:spPr>
                         <a:xfrm>
                           <a:off x="0" y="0"/>
-                          <a:ext cx="5943600" cy="19080"/>
+                          <a:ext cx="5944320" cy="19800"/>
                         </a:xfrm>
                         <a:prstGeom prst="rect">
                           <a:avLst/>
@@ -979,6 +1001,12 @@
                           </a:solidFill>
                         </a:ln>
                       </wps:spPr>
+                      <wps:style>
+                        <a:lnRef idx="0"/>
+                        <a:fillRef idx="0"/>
+                        <a:effectRef idx="0"/>
+                        <a:fontRef idx="minor"/>
+                      </wps:style>
                       <wps:bodyPr/>
                     </wps:wsp>
                   </a:graphicData>
@@ -991,17 +1019,17 @@
           </mc:Choice>
           <mc:Fallback>
             <w:pict>
-              <v:rect id="shape_0" fillcolor="white" stroked="t" o:allowincell="f" style="position:absolute;margin-left:0pt;margin-top:-1.55pt;width:467.95pt;height:1.45pt;mso-wrap-style:none;v-text-anchor:middle;mso-position-horizontal:center;mso-position-vertical:top">
+              <v:rect id="shape_0" ID="Forma3" path="m0,0l-2147483645,0l-2147483645,-2147483646l0,-2147483646xe" fillcolor="white" stroked="t" o:allowincell="f" style="position:absolute;margin-left:0pt;margin-top:-1.6pt;width:468pt;height:1.5pt;mso-wrap-style:none;v-text-anchor:middle;mso-position-vertical:top">
                 <v:fill o:detectmouseclick="t" type="solid" color2="black"/>
                 <v:stroke color="black" joinstyle="round" endcap="flat"/>
-                <w10:wrap type="topAndBottom"/>
+                <w10:wrap type="square"/>
               </v:rect>
             </w:pict>
           </mc:Fallback>
         </mc:AlternateContent>
       </w:r>
-      <w:bookmarkStart w:id="1" w:name="prioridade-alta"/>
-      <w:bookmarkStart w:id="2" w:name="X7c72cd1b778b1c55d0a88895c0230f1ecf96d2f"/>
+      <w:bookmarkStart w:id="1" w:name="X7c72cd1b778b1c55d0a88895c0230f1ecf96d2f"/>
+      <w:bookmarkStart w:id="2" w:name="prioridade-alta"/>
       <w:bookmarkEnd w:id="1"/>
       <w:bookmarkEnd w:id="2"/>
     </w:p>
@@ -1478,21 +1506,17 @@
           <mc:Choice Requires="wps">
             <w:drawing>
               <wp:inline distT="0" distB="0" distL="0" distR="0">
-                <wp:extent cx="5944235" cy="19685"/>
+                <wp:extent cx="5944870" cy="20320"/>
                 <wp:effectExtent l="0" t="0" r="0" b="0"/>
-                <wp:docPr id="4" name=""/>
+                <wp:docPr id="4" name="Forma4"/>
                 <a:graphic xmlns:a="http://schemas.openxmlformats.org/drawingml/2006/main">
                   <a:graphicData uri="http://schemas.microsoft.com/office/word/2010/wordprocessingShape">
                     <wps:wsp>
                       <wps:cNvSpPr/>
-                      <wps:nvSpPr>
-                        <wps:cNvPr id="3" name=""/>
-                        <wps:cNvSpPr/>
-                      </wps:nvSpPr>
                       <wps:spPr>
                         <a:xfrm>
                           <a:off x="0" y="0"/>
-                          <a:ext cx="5943600" cy="19080"/>
+                          <a:ext cx="5944320" cy="19800"/>
                         </a:xfrm>
                         <a:prstGeom prst="rect">
                           <a:avLst/>
@@ -1506,6 +1530,12 @@
                           </a:solidFill>
                         </a:ln>
                       </wps:spPr>
+                      <wps:style>
+                        <a:lnRef idx="0"/>
+                        <a:fillRef idx="0"/>
+                        <a:effectRef idx="0"/>
+                        <a:fontRef idx="minor"/>
+                      </wps:style>
                       <wps:bodyPr/>
                     </wps:wsp>
                   </a:graphicData>
@@ -1518,17 +1548,17 @@
           </mc:Choice>
           <mc:Fallback>
             <w:pict>
-              <v:rect id="shape_0" fillcolor="white" stroked="t" o:allowincell="f" style="position:absolute;margin-left:0pt;margin-top:-1.55pt;width:467.95pt;height:1.45pt;mso-wrap-style:none;v-text-anchor:middle;mso-position-horizontal:center;mso-position-vertical:top">
+              <v:rect id="shape_0" ID="Forma4" path="m0,0l-2147483645,0l-2147483645,-2147483646l0,-2147483646xe" fillcolor="white" stroked="t" o:allowincell="f" style="position:absolute;margin-left:0pt;margin-top:-1.6pt;width:468pt;height:1.5pt;mso-wrap-style:none;v-text-anchor:middle;mso-position-vertical:top">
                 <v:fill o:detectmouseclick="t" type="solid" color2="black"/>
                 <v:stroke color="black" joinstyle="round" endcap="flat"/>
-                <w10:wrap type="topAndBottom"/>
+                <w10:wrap type="square"/>
               </v:rect>
             </w:pict>
           </mc:Fallback>
         </mc:AlternateContent>
       </w:r>
-      <w:bookmarkStart w:id="3" w:name="prioridade-média"/>
-      <w:bookmarkStart w:id="4" w:name="X9b741333e57b3589bfb1a2a444e91fafd5d91e9"/>
+      <w:bookmarkStart w:id="3" w:name="X9b741333e57b3589bfb1a2a444e91fafd5d91e9"/>
+      <w:bookmarkStart w:id="4" w:name="prioridade-média"/>
       <w:bookmarkEnd w:id="3"/>
       <w:bookmarkEnd w:id="4"/>
     </w:p>
@@ -1559,7 +1589,53 @@
       </w:r>
       <w:r>
         <w:rPr/>
-        <w:t xml:space="preserve"> perde dado silenciosamente se invariante de “documento único-base” for violada</w:t>
+        <w:t xml:space="preserve"> perde dado silenciosamente se invariante de “documento único-base” for violada </w:t>
+      </w:r>
+      <w:r>
+        <w:rPr>
+          <w:rFonts w:ascii="JetBrains Mono" w:hAnsi="JetBrains Mono"/>
+          <w:b w:val="false"/>
+          <w:i/>
+          <w:color w:val="5F826B"/>
+          <w:sz w:val="20"/>
+        </w:rPr>
+        <w:t xml:space="preserve"> </w:t>
+      </w:r>
+      <w:r>
+        <w:rPr>
+          <w:rFonts w:eastAsia="Cambria" w:cs="" w:ascii="JetBrains Mono" w:hAnsi="JetBrains Mono"/>
+          <w:b/>
+          <w:bCs/>
+          <w:i/>
+          <w:color w:val="5F826B"/>
+          <w:kern w:val="0"/>
+          <w:sz w:val="20"/>
+          <w:szCs w:val="20"/>
+          <w:lang w:val="en-US" w:eastAsia="en-US" w:bidi="ar-SA"/>
+        </w:rPr>
+        <w:t xml:space="preserve">🟡  </w:t>
+      </w:r>
+      <w:r>
+        <w:rPr>
+          <w:rFonts w:ascii="JetBrains Mono" w:hAnsi="JetBrains Mono"/>
+          <w:b/>
+          <w:bCs/>
+          <w:i/>
+          <w:color w:val="5F826B"/>
+          <w:sz w:val="20"/>
+        </w:rPr>
+        <w:t xml:space="preserve">WON´T FIX </w:t>
+      </w:r>
+      <w:r>
+        <w:rPr>
+          <w:rFonts w:ascii="JetBrains Mono" w:hAnsi="JetBrains Mono"/>
+          <w:b/>
+          <w:bCs/>
+          <w:i/>
+          <w:color w:val="5F826B"/>
+          <w:sz w:val="20"/>
+        </w:rPr>
+        <w:t>BENEFìCIO IRRELEVANTE</w:t>
       </w:r>
     </w:p>
     <w:p>
@@ -1834,21 +1910,17 @@
           <mc:Choice Requires="wps">
             <w:drawing>
               <wp:inline distT="0" distB="0" distL="0" distR="0">
-                <wp:extent cx="5944235" cy="19685"/>
+                <wp:extent cx="5944870" cy="20320"/>
                 <wp:effectExtent l="0" t="0" r="0" b="0"/>
-                <wp:docPr id="5" name=""/>
+                <wp:docPr id="5" name="Forma5"/>
                 <a:graphic xmlns:a="http://schemas.openxmlformats.org/drawingml/2006/main">
                   <a:graphicData uri="http://schemas.microsoft.com/office/word/2010/wordprocessingShape">
                     <wps:wsp>
                       <wps:cNvSpPr/>
-                      <wps:nvSpPr>
-                        <wps:cNvPr id="4" name=""/>
-                        <wps:cNvSpPr/>
-                      </wps:nvSpPr>
                       <wps:spPr>
                         <a:xfrm>
                           <a:off x="0" y="0"/>
-                          <a:ext cx="5943600" cy="19080"/>
+                          <a:ext cx="5944320" cy="19800"/>
                         </a:xfrm>
                         <a:prstGeom prst="rect">
                           <a:avLst/>
@@ -1862,6 +1934,12 @@
                           </a:solidFill>
                         </a:ln>
                       </wps:spPr>
+                      <wps:style>
+                        <a:lnRef idx="0"/>
+                        <a:fillRef idx="0"/>
+                        <a:effectRef idx="0"/>
+                        <a:fontRef idx="minor"/>
+                      </wps:style>
                       <wps:bodyPr/>
                     </wps:wsp>
                   </a:graphicData>
@@ -1874,17 +1952,17 @@
           </mc:Choice>
           <mc:Fallback>
             <w:pict>
-              <v:rect id="shape_0" fillcolor="white" stroked="t" o:allowincell="f" style="position:absolute;margin-left:0pt;margin-top:-1.55pt;width:467.95pt;height:1.45pt;mso-wrap-style:none;v-text-anchor:middle;mso-position-horizontal:center;mso-position-vertical:top">
+              <v:rect id="shape_0" ID="Forma5" path="m0,0l-2147483645,0l-2147483645,-2147483646l0,-2147483646xe" fillcolor="white" stroked="t" o:allowincell="f" style="position:absolute;margin-left:0pt;margin-top:-1.6pt;width:468pt;height:1.5pt;mso-wrap-style:none;v-text-anchor:middle;mso-position-vertical:top">
                 <v:fill o:detectmouseclick="t" type="solid" color2="black"/>
                 <v:stroke color="black" joinstyle="round" endcap="flat"/>
-                <w10:wrap type="topAndBottom"/>
+                <w10:wrap type="square"/>
               </v:rect>
             </w:pict>
           </mc:Fallback>
         </mc:AlternateContent>
       </w:r>
-      <w:bookmarkStart w:id="5" w:name="prioridade-baixa"/>
-      <w:bookmarkStart w:id="6" w:name="X3a54c0342006129b1435b8bcbbb127b41c6d466"/>
+      <w:bookmarkStart w:id="5" w:name="X3a54c0342006129b1435b8bcbbb127b41c6d466"/>
+      <w:bookmarkStart w:id="6" w:name="prioridade-baixa"/>
       <w:bookmarkEnd w:id="5"/>
       <w:bookmarkEnd w:id="6"/>
     </w:p>
@@ -2012,17 +2090,7 @@
           <w:szCs w:val="20"/>
           <w:lang w:val="en-US" w:eastAsia="en-US" w:bidi="ar-SA"/>
         </w:rPr>
-        <w:t xml:space="preserve">🟢  </w:t>
-      </w:r>
-      <w:r>
-        <w:rPr>
-          <w:rFonts w:eastAsia="Cambria" w:cs="" w:ascii="Cambria" w:hAnsi="Cambria"/>
-          <w:kern w:val="0"/>
-          <w:sz w:val="20"/>
-          <w:szCs w:val="20"/>
-          <w:lang w:val="en-US" w:eastAsia="en-US" w:bidi="ar-SA"/>
-        </w:rPr>
-        <w:t>DONE</w:t>
+        <w:t>🟢  DONE</w:t>
       </w:r>
     </w:p>
     <w:p>
@@ -2082,21 +2150,17 @@
           <mc:Choice Requires="wps">
             <w:drawing>
               <wp:inline distT="0" distB="0" distL="0" distR="0">
-                <wp:extent cx="5944235" cy="19685"/>
+                <wp:extent cx="5944870" cy="20320"/>
                 <wp:effectExtent l="0" t="0" r="0" b="0"/>
-                <wp:docPr id="6" name=""/>
+                <wp:docPr id="6" name="Forma6"/>
                 <a:graphic xmlns:a="http://schemas.openxmlformats.org/drawingml/2006/main">
                   <a:graphicData uri="http://schemas.microsoft.com/office/word/2010/wordprocessingShape">
                     <wps:wsp>
                       <wps:cNvSpPr/>
-                      <wps:nvSpPr>
-                        <wps:cNvPr id="5" name=""/>
-                        <wps:cNvSpPr/>
-                      </wps:nvSpPr>
                       <wps:spPr>
                         <a:xfrm>
                           <a:off x="0" y="0"/>
-                          <a:ext cx="5943600" cy="19080"/>
+                          <a:ext cx="5944320" cy="19800"/>
                         </a:xfrm>
                         <a:prstGeom prst="rect">
                           <a:avLst/>
@@ -2110,6 +2174,12 @@
                           </a:solidFill>
                         </a:ln>
                       </wps:spPr>
+                      <wps:style>
+                        <a:lnRef idx="0"/>
+                        <a:fillRef idx="0"/>
+                        <a:effectRef idx="0"/>
+                        <a:fontRef idx="minor"/>
+                      </wps:style>
                       <wps:bodyPr/>
                     </wps:wsp>
                   </a:graphicData>
@@ -2122,17 +2192,17 @@
           </mc:Choice>
           <mc:Fallback>
             <w:pict>
-              <v:rect id="shape_0" fillcolor="white" stroked="t" o:allowincell="f" style="position:absolute;margin-left:0pt;margin-top:-1.55pt;width:467.95pt;height:1.45pt;mso-wrap-style:none;v-text-anchor:middle;mso-position-horizontal:center;mso-position-vertical:top">
+              <v:rect id="shape_0" ID="Forma6" path="m0,0l-2147483645,0l-2147483645,-2147483646l0,-2147483646xe" fillcolor="white" stroked="t" o:allowincell="f" style="position:absolute;margin-left:0pt;margin-top:-1.6pt;width:468pt;height:1.5pt;mso-wrap-style:none;v-text-anchor:middle;mso-position-vertical:top">
                 <v:fill o:detectmouseclick="t" type="solid" color2="black"/>
                 <v:stroke color="black" joinstyle="round" endcap="flat"/>
-                <w10:wrap type="topAndBottom"/>
+                <w10:wrap type="square"/>
               </v:rect>
             </w:pict>
           </mc:Fallback>
         </mc:AlternateContent>
       </w:r>
-      <w:bookmarkStart w:id="9" w:name="Xd2672ef09caee65f572b7861e8017b52de4f948"/>
-      <w:bookmarkStart w:id="10" w:name="X1c6ba726c84726b7df98fbf6dbd1942e0ec2d66"/>
+      <w:bookmarkStart w:id="9" w:name="X1c6ba726c84726b7df98fbf6dbd1942e0ec2d66"/>
+      <w:bookmarkStart w:id="10" w:name="Xd2672ef09caee65f572b7861e8017b52de4f948"/>
       <w:bookmarkEnd w:id="9"/>
       <w:bookmarkEnd w:id="10"/>
     </w:p>
@@ -2176,8 +2246,8 @@
       <w:tblGrid>
         <w:gridCol w:w="960"/>
         <w:gridCol w:w="4368"/>
-        <w:gridCol w:w="1644"/>
-        <w:gridCol w:w="2387"/>
+        <w:gridCol w:w="1645"/>
+        <w:gridCol w:w="2386"/>
       </w:tblGrid>
       <w:tr>
         <w:trPr>
@@ -2194,7 +2264,8 @@
           <w:p>
             <w:pPr>
               <w:pStyle w:val="Compact"/>
-              <w:widowControl/>
+              <w:widowControl w:val="false"/>
+              <w:suppressAutoHyphens w:val="true"/>
               <w:spacing w:before="36" w:after="36"/>
               <w:jc w:val="left"/>
               <w:rPr>
@@ -2228,7 +2299,8 @@
           <w:p>
             <w:pPr>
               <w:pStyle w:val="Compact"/>
-              <w:widowControl/>
+              <w:widowControl w:val="false"/>
+              <w:suppressAutoHyphens w:val="true"/>
               <w:spacing w:before="36" w:after="36"/>
               <w:jc w:val="left"/>
               <w:rPr>
@@ -2253,7 +2325,7 @@
         </w:tc>
         <w:tc>
           <w:tcPr>
-            <w:tcW w:w="1644" w:type="dxa"/>
+            <w:tcW w:w="1645" w:type="dxa"/>
             <w:tcBorders>
               <w:bottom w:val="single" w:sz="6" w:space="0" w:color="000000"/>
             </w:tcBorders>
@@ -2262,7 +2334,8 @@
           <w:p>
             <w:pPr>
               <w:pStyle w:val="Compact"/>
-              <w:widowControl/>
+              <w:widowControl w:val="false"/>
+              <w:suppressAutoHyphens w:val="true"/>
               <w:spacing w:before="36" w:after="36"/>
               <w:jc w:val="left"/>
               <w:rPr>
@@ -2287,7 +2360,7 @@
         </w:tc>
         <w:tc>
           <w:tcPr>
-            <w:tcW w:w="2387" w:type="dxa"/>
+            <w:tcW w:w="2386" w:type="dxa"/>
             <w:tcBorders>
               <w:bottom w:val="single" w:sz="6" w:space="0" w:color="000000"/>
             </w:tcBorders>
@@ -2296,7 +2369,8 @@
           <w:p>
             <w:pPr>
               <w:pStyle w:val="Compact"/>
-              <w:widowControl/>
+              <w:widowControl w:val="false"/>
+              <w:suppressAutoHyphens w:val="true"/>
               <w:spacing w:before="36" w:after="36"/>
               <w:jc w:val="left"/>
               <w:rPr>
@@ -2330,7 +2404,8 @@
           <w:p>
             <w:pPr>
               <w:pStyle w:val="Compact"/>
-              <w:widowControl/>
+              <w:widowControl w:val="false"/>
+              <w:suppressAutoHyphens w:val="true"/>
               <w:spacing w:before="36" w:after="36"/>
               <w:jc w:val="left"/>
               <w:rPr>
@@ -2361,7 +2436,8 @@
           <w:p>
             <w:pPr>
               <w:pStyle w:val="Compact"/>
-              <w:widowControl/>
+              <w:widowControl w:val="false"/>
+              <w:suppressAutoHyphens w:val="true"/>
               <w:spacing w:before="36" w:after="36"/>
               <w:jc w:val="left"/>
               <w:rPr/>
@@ -2391,13 +2467,14 @@
         </w:tc>
         <w:tc>
           <w:tcPr>
-            <w:tcW w:w="1644" w:type="dxa"/>
+            <w:tcW w:w="1645" w:type="dxa"/>
             <w:tcBorders/>
           </w:tcPr>
           <w:p>
             <w:pPr>
               <w:pStyle w:val="Compact"/>
-              <w:widowControl/>
+              <w:widowControl w:val="false"/>
+              <w:suppressAutoHyphens w:val="true"/>
               <w:spacing w:before="36" w:after="36"/>
               <w:jc w:val="left"/>
               <w:rPr>
@@ -2432,13 +2509,14 @@
         </w:tc>
         <w:tc>
           <w:tcPr>
-            <w:tcW w:w="2387" w:type="dxa"/>
+            <w:tcW w:w="2386" w:type="dxa"/>
             <w:tcBorders/>
           </w:tcPr>
           <w:p>
             <w:pPr>
               <w:pStyle w:val="Compact"/>
-              <w:widowControl/>
+              <w:widowControl w:val="false"/>
+              <w:suppressAutoHyphens w:val="true"/>
               <w:spacing w:before="36" w:after="36"/>
               <w:jc w:val="left"/>
               <w:rPr>
@@ -2472,7 +2550,8 @@
           <w:p>
             <w:pPr>
               <w:pStyle w:val="Compact"/>
-              <w:widowControl/>
+              <w:widowControl w:val="false"/>
+              <w:suppressAutoHyphens w:val="true"/>
               <w:spacing w:before="36" w:after="36"/>
               <w:jc w:val="left"/>
               <w:rPr>
@@ -2503,7 +2582,8 @@
           <w:p>
             <w:pPr>
               <w:pStyle w:val="Compact"/>
-              <w:widowControl/>
+              <w:widowControl w:val="false"/>
+              <w:suppressAutoHyphens w:val="true"/>
               <w:spacing w:before="36" w:after="36"/>
               <w:jc w:val="left"/>
               <w:rPr>
@@ -2528,13 +2608,14 @@
         </w:tc>
         <w:tc>
           <w:tcPr>
-            <w:tcW w:w="1644" w:type="dxa"/>
+            <w:tcW w:w="1645" w:type="dxa"/>
             <w:tcBorders/>
           </w:tcPr>
           <w:p>
             <w:pPr>
               <w:pStyle w:val="Compact"/>
-              <w:widowControl/>
+              <w:widowControl w:val="false"/>
+              <w:suppressAutoHyphens w:val="true"/>
               <w:spacing w:before="36" w:after="36"/>
               <w:jc w:val="left"/>
               <w:rPr>
@@ -2569,13 +2650,14 @@
         </w:tc>
         <w:tc>
           <w:tcPr>
-            <w:tcW w:w="2387" w:type="dxa"/>
+            <w:tcW w:w="2386" w:type="dxa"/>
             <w:tcBorders/>
           </w:tcPr>
           <w:p>
             <w:pPr>
               <w:pStyle w:val="Compact"/>
-              <w:widowControl/>
+              <w:widowControl w:val="false"/>
+              <w:suppressAutoHyphens w:val="true"/>
               <w:spacing w:before="36" w:after="36"/>
               <w:jc w:val="left"/>
               <w:rPr>
@@ -2609,7 +2691,8 @@
           <w:p>
             <w:pPr>
               <w:pStyle w:val="Compact"/>
-              <w:widowControl/>
+              <w:widowControl w:val="false"/>
+              <w:suppressAutoHyphens w:val="true"/>
               <w:spacing w:before="36" w:after="36"/>
               <w:jc w:val="left"/>
               <w:rPr>
@@ -2640,7 +2723,8 @@
           <w:p>
             <w:pPr>
               <w:pStyle w:val="Compact"/>
-              <w:widowControl/>
+              <w:widowControl w:val="false"/>
+              <w:suppressAutoHyphens w:val="true"/>
               <w:spacing w:before="36" w:after="36"/>
               <w:jc w:val="left"/>
               <w:rPr>
@@ -2665,13 +2749,14 @@
         </w:tc>
         <w:tc>
           <w:tcPr>
-            <w:tcW w:w="1644" w:type="dxa"/>
+            <w:tcW w:w="1645" w:type="dxa"/>
             <w:tcBorders/>
           </w:tcPr>
           <w:p>
             <w:pPr>
               <w:pStyle w:val="Compact"/>
-              <w:widowControl/>
+              <w:widowControl w:val="false"/>
+              <w:suppressAutoHyphens w:val="true"/>
               <w:spacing w:before="36" w:after="36"/>
               <w:jc w:val="left"/>
               <w:rPr>
@@ -2706,13 +2791,14 @@
         </w:tc>
         <w:tc>
           <w:tcPr>
-            <w:tcW w:w="2387" w:type="dxa"/>
+            <w:tcW w:w="2386" w:type="dxa"/>
             <w:tcBorders/>
           </w:tcPr>
           <w:p>
             <w:pPr>
               <w:pStyle w:val="Compact"/>
-              <w:widowControl/>
+              <w:widowControl w:val="false"/>
+              <w:suppressAutoHyphens w:val="true"/>
               <w:spacing w:before="36" w:after="36"/>
               <w:jc w:val="left"/>
               <w:rPr>
@@ -2746,7 +2832,8 @@
           <w:p>
             <w:pPr>
               <w:pStyle w:val="Compact"/>
-              <w:widowControl/>
+              <w:widowControl w:val="false"/>
+              <w:suppressAutoHyphens w:val="true"/>
               <w:spacing w:before="36" w:after="36"/>
               <w:jc w:val="left"/>
               <w:rPr>
@@ -2777,7 +2864,8 @@
           <w:p>
             <w:pPr>
               <w:pStyle w:val="Compact"/>
-              <w:widowControl/>
+              <w:widowControl w:val="false"/>
+              <w:suppressAutoHyphens w:val="true"/>
               <w:spacing w:before="36" w:after="36"/>
               <w:jc w:val="left"/>
               <w:rPr>
@@ -2802,13 +2890,14 @@
         </w:tc>
         <w:tc>
           <w:tcPr>
-            <w:tcW w:w="1644" w:type="dxa"/>
+            <w:tcW w:w="1645" w:type="dxa"/>
             <w:tcBorders/>
           </w:tcPr>
           <w:p>
             <w:pPr>
               <w:pStyle w:val="Compact"/>
-              <w:widowControl/>
+              <w:widowControl w:val="false"/>
+              <w:suppressAutoHyphens w:val="true"/>
               <w:spacing w:before="36" w:after="36"/>
               <w:jc w:val="left"/>
               <w:rPr>
@@ -2843,13 +2932,14 @@
         </w:tc>
         <w:tc>
           <w:tcPr>
-            <w:tcW w:w="2387" w:type="dxa"/>
+            <w:tcW w:w="2386" w:type="dxa"/>
             <w:tcBorders/>
           </w:tcPr>
           <w:p>
             <w:pPr>
               <w:pStyle w:val="Compact"/>
-              <w:widowControl/>
+              <w:widowControl w:val="false"/>
+              <w:suppressAutoHyphens w:val="true"/>
               <w:spacing w:before="36" w:after="36"/>
               <w:jc w:val="left"/>
               <w:rPr>
@@ -2883,7 +2973,8 @@
           <w:p>
             <w:pPr>
               <w:pStyle w:val="Compact"/>
-              <w:widowControl/>
+              <w:widowControl w:val="false"/>
+              <w:suppressAutoHyphens w:val="true"/>
               <w:spacing w:before="36" w:after="36"/>
               <w:jc w:val="left"/>
               <w:rPr>
@@ -2914,7 +3005,8 @@
           <w:p>
             <w:pPr>
               <w:pStyle w:val="Compact"/>
-              <w:widowControl/>
+              <w:widowControl w:val="false"/>
+              <w:suppressAutoHyphens w:val="true"/>
               <w:spacing w:before="36" w:after="36"/>
               <w:jc w:val="left"/>
               <w:rPr>
@@ -2939,13 +3031,14 @@
         </w:tc>
         <w:tc>
           <w:tcPr>
-            <w:tcW w:w="1644" w:type="dxa"/>
+            <w:tcW w:w="1645" w:type="dxa"/>
             <w:tcBorders/>
           </w:tcPr>
           <w:p>
             <w:pPr>
               <w:pStyle w:val="Compact"/>
-              <w:widowControl/>
+              <w:widowControl w:val="false"/>
+              <w:suppressAutoHyphens w:val="true"/>
               <w:spacing w:before="36" w:after="36"/>
               <w:jc w:val="left"/>
               <w:rPr>
@@ -2980,13 +3073,14 @@
         </w:tc>
         <w:tc>
           <w:tcPr>
-            <w:tcW w:w="2387" w:type="dxa"/>
+            <w:tcW w:w="2386" w:type="dxa"/>
             <w:tcBorders/>
           </w:tcPr>
           <w:p>
             <w:pPr>
               <w:pStyle w:val="Compact"/>
-              <w:widowControl/>
+              <w:widowControl w:val="false"/>
+              <w:suppressAutoHyphens w:val="true"/>
               <w:spacing w:before="36" w:after="36"/>
               <w:jc w:val="left"/>
               <w:rPr>
@@ -3020,7 +3114,8 @@
           <w:p>
             <w:pPr>
               <w:pStyle w:val="Compact"/>
-              <w:widowControl/>
+              <w:widowControl w:val="false"/>
+              <w:suppressAutoHyphens w:val="true"/>
               <w:spacing w:before="36" w:after="36"/>
               <w:jc w:val="left"/>
               <w:rPr>
@@ -3051,7 +3146,8 @@
           <w:p>
             <w:pPr>
               <w:pStyle w:val="Compact"/>
-              <w:widowControl/>
+              <w:widowControl w:val="false"/>
+              <w:suppressAutoHyphens w:val="true"/>
               <w:spacing w:before="36" w:after="36"/>
               <w:jc w:val="left"/>
               <w:rPr>
@@ -3076,13 +3172,14 @@
         </w:tc>
         <w:tc>
           <w:tcPr>
-            <w:tcW w:w="1644" w:type="dxa"/>
+            <w:tcW w:w="1645" w:type="dxa"/>
             <w:tcBorders/>
           </w:tcPr>
           <w:p>
             <w:pPr>
               <w:pStyle w:val="Compact"/>
-              <w:widowControl/>
+              <w:widowControl w:val="false"/>
+              <w:suppressAutoHyphens w:val="true"/>
               <w:spacing w:before="36" w:after="36"/>
               <w:jc w:val="left"/>
               <w:rPr>
@@ -3117,13 +3214,14 @@
         </w:tc>
         <w:tc>
           <w:tcPr>
-            <w:tcW w:w="2387" w:type="dxa"/>
+            <w:tcW w:w="2386" w:type="dxa"/>
             <w:tcBorders/>
           </w:tcPr>
           <w:p>
             <w:pPr>
               <w:pStyle w:val="Compact"/>
-              <w:widowControl/>
+              <w:widowControl w:val="false"/>
+              <w:suppressAutoHyphens w:val="true"/>
               <w:spacing w:before="36" w:after="36"/>
               <w:jc w:val="left"/>
               <w:rPr>
@@ -3157,7 +3255,8 @@
           <w:p>
             <w:pPr>
               <w:pStyle w:val="Compact"/>
-              <w:widowControl/>
+              <w:widowControl w:val="false"/>
+              <w:suppressAutoHyphens w:val="true"/>
               <w:spacing w:before="36" w:after="36"/>
               <w:jc w:val="left"/>
               <w:rPr>
@@ -3188,7 +3287,8 @@
           <w:p>
             <w:pPr>
               <w:pStyle w:val="Compact"/>
-              <w:widowControl/>
+              <w:widowControl w:val="false"/>
+              <w:suppressAutoHyphens w:val="true"/>
               <w:spacing w:before="36" w:after="36"/>
               <w:jc w:val="left"/>
               <w:rPr>
@@ -3213,13 +3313,14 @@
         </w:tc>
         <w:tc>
           <w:tcPr>
-            <w:tcW w:w="1644" w:type="dxa"/>
+            <w:tcW w:w="1645" w:type="dxa"/>
             <w:tcBorders/>
           </w:tcPr>
           <w:p>
             <w:pPr>
               <w:pStyle w:val="Compact"/>
-              <w:widowControl/>
+              <w:widowControl w:val="false"/>
+              <w:suppressAutoHyphens w:val="true"/>
               <w:spacing w:before="36" w:after="36"/>
               <w:jc w:val="left"/>
               <w:rPr>
@@ -3254,13 +3355,14 @@
         </w:tc>
         <w:tc>
           <w:tcPr>
-            <w:tcW w:w="2387" w:type="dxa"/>
+            <w:tcW w:w="2386" w:type="dxa"/>
             <w:tcBorders/>
           </w:tcPr>
           <w:p>
             <w:pPr>
               <w:pStyle w:val="Compact"/>
-              <w:widowControl/>
+              <w:widowControl w:val="false"/>
+              <w:suppressAutoHyphens w:val="true"/>
               <w:spacing w:before="36" w:after="36"/>
               <w:jc w:val="left"/>
               <w:rPr>
@@ -3291,17 +3393,7 @@
                 <w:szCs w:val="20"/>
                 <w:lang w:val="en-US" w:eastAsia="en-US" w:bidi="ar-SA"/>
               </w:rPr>
-              <w:t xml:space="preserve"> 🟢 🟢  </w:t>
-            </w:r>
-            <w:r>
-              <w:rPr>
-                <w:rFonts w:eastAsia="Cambria" w:cs=""/>
-                <w:kern w:val="0"/>
-                <w:sz w:val="20"/>
-                <w:szCs w:val="20"/>
-                <w:lang w:val="en-US" w:eastAsia="en-US" w:bidi="ar-SA"/>
-              </w:rPr>
-              <w:t>DONE</w:t>
+              <w:t xml:space="preserve"> 🟢 🟢  DONE</w:t>
             </w:r>
           </w:p>
         </w:tc>
@@ -3609,6 +3701,7 @@
     <w:qFormat/>
     <w:pPr>
       <w:widowControl/>
+      <w:suppressAutoHyphens w:val="true"/>
       <w:bidi w:val="0"/>
       <w:spacing w:before="0" w:after="200"/>
       <w:jc w:val="left"/>
@@ -4235,6 +4328,7 @@
       <w:keepNext w:val="true"/>
       <w:keepLines/>
       <w:widowControl/>
+      <w:suppressAutoHyphens w:val="true"/>
       <w:bidi w:val="0"/>
       <w:spacing w:before="0" w:after="200"/>
       <w:jc w:val="center"/>
@@ -4256,6 +4350,7 @@
       <w:keepNext w:val="true"/>
       <w:keepLines/>
       <w:widowControl/>
+      <w:suppressAutoHyphens w:val="true"/>
       <w:bidi w:val="0"/>
       <w:spacing w:before="0" w:after="200"/>
       <w:jc w:val="center"/>
@@ -4338,6 +4433,7 @@
     <w:qFormat/>
     <w:pPr>
       <w:widowControl/>
+      <w:suppressAutoHyphens w:val="true"/>
       <w:bidi w:val="0"/>
       <w:spacing w:before="100" w:after="100"/>
       <w:ind w:left="480" w:right="480" w:hanging="0"/>

</xml_diff>

<commit_message>
fix(rule): refine SCG003 wildcard CORS severity classification
Refine SCG003 to distinguish global CORS wildcards from scoped wildcard patterns. Global `*` combined with `allow-credentials=true` remains HIGH severity, while non-global wildcard patterns are classified as MEDIUM.

Expand SCG003 test coverage to include origin/pattern interactions, list-based configuration, unresolved placeholders, and different `allow-credentials` states.

Also ignore the `dependency-reduced-pom.xml` generated by the Maven Shade Plugin during packaging.
</commit_message>
<xml_diff>
--- a/BACKLOG.docx
+++ b/BACKLOG.docx
@@ -8866,6 +8866,726 @@
           <w:lang w:val="pt-BR"/>
         </w:rPr>
       </w:pPr>
+      <w:r>
+        <w:rPr>
+          <w:rFonts w:asciiTheme="majorHAnsi" w:hAnsiTheme="majorHAnsi" w:cstheme="majorHAnsi"/>
+          <w:lang w:val="pt-BR"/>
+        </w:rPr>
+        <w:t># Itens Novos (sessão de hoje — revisão das regras de CORS)</w:t>
+      </w:r>
+    </w:p>
+    <w:p>
+      <w:pPr>
+        <w:spacing w:after="0"/>
+        <w:rPr>
+          <w:rFonts w:asciiTheme="majorHAnsi" w:hAnsiTheme="majorHAnsi" w:cstheme="majorHAnsi"/>
+          <w:lang w:val="pt-BR"/>
+        </w:rPr>
+      </w:pPr>
+    </w:p>
+    <w:p>
+      <w:pPr>
+        <w:spacing w:after="0"/>
+        <w:rPr>
+          <w:rFonts w:asciiTheme="majorHAnsi" w:hAnsiTheme="majorHAnsi" w:cstheme="majorHAnsi"/>
+          <w:lang w:val="pt-BR"/>
+        </w:rPr>
+      </w:pPr>
+      <w:r>
+        <w:rPr>
+          <w:rFonts w:asciiTheme="majorHAnsi" w:hAnsiTheme="majorHAnsi" w:cstheme="majorHAnsi"/>
+          <w:lang w:val="pt-BR"/>
+        </w:rPr>
+        <w:t xml:space="preserve"> BL-22 — Regras de CORS (SCG003/004/005) só cobrem Actuator, não CORS de aplicação configurado programaticamente</w:t>
+      </w:r>
+    </w:p>
+    <w:p>
+      <w:pPr>
+        <w:spacing w:after="0"/>
+        <w:rPr>
+          <w:rFonts w:asciiTheme="majorHAnsi" w:hAnsiTheme="majorHAnsi" w:cstheme="majorHAnsi"/>
+          <w:lang w:val="pt-BR"/>
+        </w:rPr>
+      </w:pPr>
+    </w:p>
+    <w:p>
+      <w:pPr>
+        <w:spacing w:after="0"/>
+        <w:rPr>
+          <w:rFonts w:asciiTheme="majorHAnsi" w:hAnsiTheme="majorHAnsi" w:cstheme="majorHAnsi"/>
+          <w:lang w:val="pt-BR"/>
+        </w:rPr>
+      </w:pPr>
+      <w:r>
+        <w:rPr>
+          <w:rFonts w:asciiTheme="majorHAnsi" w:hAnsiTheme="majorHAnsi" w:cstheme="majorHAnsi"/>
+          <w:lang w:val="pt-BR"/>
+        </w:rPr>
+        <w:t>Onde: `CorsWildcardWithCredentialsRule`, `CorsInsecureProtocolsRule`,</w:t>
+      </w:r>
+    </w:p>
+    <w:p>
+      <w:pPr>
+        <w:spacing w:after="0"/>
+        <w:rPr>
+          <w:rFonts w:asciiTheme="majorHAnsi" w:hAnsiTheme="majorHAnsi" w:cstheme="majorHAnsi"/>
+          <w:lang w:val="pt-BR"/>
+        </w:rPr>
+      </w:pPr>
+      <w:r>
+        <w:rPr>
+          <w:rFonts w:asciiTheme="majorHAnsi" w:hAnsiTheme="majorHAnsi" w:cstheme="majorHAnsi"/>
+          <w:lang w:val="pt-BR"/>
+        </w:rPr>
+        <w:t>`CorsPermissiveMethodsAndHeadersRule` — todas restritas a</w:t>
+      </w:r>
+    </w:p>
+    <w:p>
+      <w:pPr>
+        <w:spacing w:after="0"/>
+        <w:rPr>
+          <w:rFonts w:asciiTheme="majorHAnsi" w:hAnsiTheme="majorHAnsi" w:cstheme="majorHAnsi"/>
+          <w:lang w:val="pt-BR"/>
+        </w:rPr>
+      </w:pPr>
+      <w:r>
+        <w:rPr>
+          <w:rFonts w:asciiTheme="majorHAnsi" w:hAnsiTheme="majorHAnsi" w:cstheme="majorHAnsi"/>
+          <w:lang w:val="pt-BR"/>
+        </w:rPr>
+        <w:t>`</w:t>
+      </w:r>
+      <w:proofErr w:type="gramStart"/>
+      <w:r>
+        <w:rPr>
+          <w:rFonts w:asciiTheme="majorHAnsi" w:hAnsiTheme="majorHAnsi" w:cstheme="majorHAnsi"/>
+          <w:lang w:val="pt-BR"/>
+        </w:rPr>
+        <w:t>management.endpoints.web.cors</w:t>
+      </w:r>
+      <w:proofErr w:type="gramEnd"/>
+      <w:r>
+        <w:rPr>
+          <w:rFonts w:asciiTheme="majorHAnsi" w:hAnsiTheme="majorHAnsi" w:cstheme="majorHAnsi"/>
+          <w:lang w:val="pt-BR"/>
+        </w:rPr>
+        <w:t>.*`.</w:t>
+      </w:r>
+    </w:p>
+    <w:p>
+      <w:pPr>
+        <w:spacing w:after="0"/>
+        <w:rPr>
+          <w:rFonts w:asciiTheme="majorHAnsi" w:hAnsiTheme="majorHAnsi" w:cstheme="majorHAnsi"/>
+          <w:lang w:val="pt-BR"/>
+        </w:rPr>
+      </w:pPr>
+    </w:p>
+    <w:p>
+      <w:pPr>
+        <w:spacing w:after="0"/>
+        <w:rPr>
+          <w:rFonts w:asciiTheme="majorHAnsi" w:hAnsiTheme="majorHAnsi" w:cstheme="majorHAnsi"/>
+          <w:lang w:val="pt-BR"/>
+        </w:rPr>
+      </w:pPr>
+      <w:r>
+        <w:rPr>
+          <w:rFonts w:asciiTheme="majorHAnsi" w:hAnsiTheme="majorHAnsi" w:cstheme="majorHAnsi"/>
+          <w:lang w:val="pt-BR"/>
+        </w:rPr>
+        <w:t>Problema: o Spring MVC (CORS de controllers de aplicação, distinto do CORS do</w:t>
+      </w:r>
+    </w:p>
+    <w:p>
+      <w:pPr>
+        <w:spacing w:after="0"/>
+        <w:rPr>
+          <w:rFonts w:asciiTheme="majorHAnsi" w:hAnsiTheme="majorHAnsi" w:cstheme="majorHAnsi"/>
+          <w:lang w:val="pt-BR"/>
+        </w:rPr>
+      </w:pPr>
+      <w:r>
+        <w:rPr>
+          <w:rFonts w:asciiTheme="majorHAnsi" w:hAnsiTheme="majorHAnsi" w:cstheme="majorHAnsi"/>
+          <w:lang w:val="pt-BR"/>
+        </w:rPr>
+        <w:t>Actuator) não expõe nenhuma propriedade nativa bindável via `application.yml`/</w:t>
+      </w:r>
+    </w:p>
+    <w:p>
+      <w:pPr>
+        <w:spacing w:after="0"/>
+        <w:rPr>
+          <w:rFonts w:asciiTheme="majorHAnsi" w:hAnsiTheme="majorHAnsi" w:cstheme="majorHAnsi"/>
+          <w:lang w:val="pt-BR"/>
+        </w:rPr>
+      </w:pPr>
+      <w:proofErr w:type="gramStart"/>
+      <w:r>
+        <w:rPr>
+          <w:rFonts w:asciiTheme="majorHAnsi" w:hAnsiTheme="majorHAnsi" w:cstheme="majorHAnsi"/>
+          <w:lang w:val="pt-BR"/>
+        </w:rPr>
+        <w:t>`.properties</w:t>
+      </w:r>
+      <w:proofErr w:type="gramEnd"/>
+      <w:r>
+        <w:rPr>
+          <w:rFonts w:asciiTheme="majorHAnsi" w:hAnsiTheme="majorHAnsi" w:cstheme="majorHAnsi"/>
+          <w:lang w:val="pt-BR"/>
+        </w:rPr>
+        <w:t>`. Confirmado contra o código-fonte oficial do Spring Boot</w:t>
+      </w:r>
+    </w:p>
+    <w:p>
+      <w:pPr>
+        <w:spacing w:after="0"/>
+        <w:rPr>
+          <w:rFonts w:asciiTheme="majorHAnsi" w:hAnsiTheme="majorHAnsi" w:cstheme="majorHAnsi"/>
+          <w:lang w:val="pt-BR"/>
+        </w:rPr>
+      </w:pPr>
+      <w:r>
+        <w:rPr>
+          <w:rFonts w:asciiTheme="majorHAnsi" w:hAnsiTheme="majorHAnsi" w:cstheme="majorHAnsi"/>
+          <w:lang w:val="pt-BR"/>
+        </w:rPr>
+        <w:t>(`CorsEndpointProperties.java`, `spring-projects/spring-boot` no GitHub): só</w:t>
+      </w:r>
+    </w:p>
+    <w:p>
+      <w:pPr>
+        <w:spacing w:after="0"/>
+        <w:rPr>
+          <w:rFonts w:asciiTheme="majorHAnsi" w:hAnsiTheme="majorHAnsi" w:cstheme="majorHAnsi"/>
+          <w:lang w:val="pt-BR"/>
+        </w:rPr>
+      </w:pPr>
+      <w:r>
+        <w:rPr>
+          <w:rFonts w:asciiTheme="majorHAnsi" w:hAnsiTheme="majorHAnsi" w:cstheme="majorHAnsi"/>
+          <w:lang w:val="pt-BR"/>
+        </w:rPr>
+        <w:t>`</w:t>
+      </w:r>
+      <w:proofErr w:type="gramStart"/>
+      <w:r>
+        <w:rPr>
+          <w:rFonts w:asciiTheme="majorHAnsi" w:hAnsiTheme="majorHAnsi" w:cstheme="majorHAnsi"/>
+          <w:lang w:val="pt-BR"/>
+        </w:rPr>
+        <w:t>management.endpoints.web.cors</w:t>
+      </w:r>
+      <w:proofErr w:type="gramEnd"/>
+      <w:r>
+        <w:rPr>
+          <w:rFonts w:asciiTheme="majorHAnsi" w:hAnsiTheme="majorHAnsi" w:cstheme="majorHAnsi"/>
+          <w:lang w:val="pt-BR"/>
+        </w:rPr>
+        <w:t>` é um prefixo `@ConfigurationProperties` real. A</w:t>
+      </w:r>
+    </w:p>
+    <w:p>
+      <w:pPr>
+        <w:spacing w:after="0"/>
+        <w:rPr>
+          <w:rFonts w:asciiTheme="majorHAnsi" w:hAnsiTheme="majorHAnsi" w:cstheme="majorHAnsi"/>
+          <w:lang w:val="pt-BR"/>
+        </w:rPr>
+      </w:pPr>
+      <w:r>
+        <w:rPr>
+          <w:rFonts w:asciiTheme="majorHAnsi" w:hAnsiTheme="majorHAnsi" w:cstheme="majorHAnsi"/>
+          <w:lang w:val="pt-BR"/>
+        </w:rPr>
+        <w:t>configuração documentada de CORS para controllers de aplicação é sempre</w:t>
+      </w:r>
+    </w:p>
+    <w:p>
+      <w:pPr>
+        <w:spacing w:after="0"/>
+        <w:rPr>
+          <w:rFonts w:asciiTheme="majorHAnsi" w:hAnsiTheme="majorHAnsi" w:cstheme="majorHAnsi"/>
+          <w:lang w:val="pt-BR"/>
+        </w:rPr>
+      </w:pPr>
+      <w:r>
+        <w:rPr>
+          <w:rFonts w:asciiTheme="majorHAnsi" w:hAnsiTheme="majorHAnsi" w:cstheme="majorHAnsi"/>
+          <w:lang w:val="pt-BR"/>
+        </w:rPr>
+        <w:t>programática — `WebMvcConfigurer.addCorsMappings</w:t>
+      </w:r>
+      <w:proofErr w:type="gramStart"/>
+      <w:r>
+        <w:rPr>
+          <w:rFonts w:asciiTheme="majorHAnsi" w:hAnsiTheme="majorHAnsi" w:cstheme="majorHAnsi"/>
+          <w:lang w:val="pt-BR"/>
+        </w:rPr>
+        <w:t>()`</w:t>
+      </w:r>
+      <w:proofErr w:type="gramEnd"/>
+      <w:r>
+        <w:rPr>
+          <w:rFonts w:asciiTheme="majorHAnsi" w:hAnsiTheme="majorHAnsi" w:cstheme="majorHAnsi"/>
+          <w:lang w:val="pt-BR"/>
+        </w:rPr>
+        <w:t>, `@CrossOrigin`, ou XML</w:t>
+      </w:r>
+    </w:p>
+    <w:p>
+      <w:pPr>
+        <w:spacing w:after="0"/>
+        <w:rPr>
+          <w:rFonts w:asciiTheme="majorHAnsi" w:hAnsiTheme="majorHAnsi" w:cstheme="majorHAnsi"/>
+          <w:lang w:val="pt-BR"/>
+        </w:rPr>
+      </w:pPr>
+      <w:r>
+        <w:rPr>
+          <w:rFonts w:asciiTheme="majorHAnsi" w:hAnsiTheme="majorHAnsi" w:cstheme="majorHAnsi"/>
+          <w:lang w:val="pt-BR"/>
+        </w:rPr>
+        <w:t>`&lt;mvc:cors&gt;`. Uma versão anterior destas regras também verificava</w:t>
+      </w:r>
+    </w:p>
+    <w:p>
+      <w:pPr>
+        <w:spacing w:after="0"/>
+        <w:rPr>
+          <w:rFonts w:asciiTheme="majorHAnsi" w:hAnsiTheme="majorHAnsi" w:cstheme="majorHAnsi"/>
+          <w:lang w:val="pt-BR"/>
+        </w:rPr>
+      </w:pPr>
+      <w:r>
+        <w:rPr>
+          <w:rFonts w:asciiTheme="majorHAnsi" w:hAnsiTheme="majorHAnsi" w:cstheme="majorHAnsi"/>
+          <w:lang w:val="pt-BR"/>
+        </w:rPr>
+        <w:t>`</w:t>
+      </w:r>
+      <w:proofErr w:type="gramStart"/>
+      <w:r>
+        <w:rPr>
+          <w:rFonts w:asciiTheme="majorHAnsi" w:hAnsiTheme="majorHAnsi" w:cstheme="majorHAnsi"/>
+          <w:lang w:val="pt-BR"/>
+        </w:rPr>
+        <w:t>spring.mvc.cors</w:t>
+      </w:r>
+      <w:proofErr w:type="gramEnd"/>
+      <w:r>
+        <w:rPr>
+          <w:rFonts w:asciiTheme="majorHAnsi" w:hAnsiTheme="majorHAnsi" w:cstheme="majorHAnsi"/>
+          <w:lang w:val="pt-BR"/>
+        </w:rPr>
+        <w:t>.*`, presumindo (incorretamente — alucinação de outra IA, sem</w:t>
+      </w:r>
+    </w:p>
+    <w:p>
+      <w:pPr>
+        <w:spacing w:after="0"/>
+        <w:rPr>
+          <w:rFonts w:asciiTheme="majorHAnsi" w:hAnsiTheme="majorHAnsi" w:cstheme="majorHAnsi"/>
+          <w:lang w:val="pt-BR"/>
+        </w:rPr>
+      </w:pPr>
+      <w:r>
+        <w:rPr>
+          <w:rFonts w:asciiTheme="majorHAnsi" w:hAnsiTheme="majorHAnsi" w:cstheme="majorHAnsi"/>
+          <w:lang w:val="pt-BR"/>
+        </w:rPr>
+        <w:lastRenderedPageBreak/>
+        <w:t>verificação) que existia binding equivalente para MVC; essas chaves nunca</w:t>
+      </w:r>
+    </w:p>
+    <w:p>
+      <w:pPr>
+        <w:spacing w:after="0"/>
+        <w:rPr>
+          <w:rFonts w:asciiTheme="majorHAnsi" w:hAnsiTheme="majorHAnsi" w:cstheme="majorHAnsi"/>
+          <w:lang w:val="pt-BR"/>
+        </w:rPr>
+      </w:pPr>
+      <w:r>
+        <w:rPr>
+          <w:rFonts w:asciiTheme="majorHAnsi" w:hAnsiTheme="majorHAnsi" w:cstheme="majorHAnsi"/>
+          <w:lang w:val="pt-BR"/>
+        </w:rPr>
+        <w:t>bateriam com nenhuma config real e foram removidas.</w:t>
+      </w:r>
+    </w:p>
+    <w:p>
+      <w:pPr>
+        <w:spacing w:after="0"/>
+        <w:rPr>
+          <w:rFonts w:asciiTheme="majorHAnsi" w:hAnsiTheme="majorHAnsi" w:cstheme="majorHAnsi"/>
+          <w:lang w:val="pt-BR"/>
+        </w:rPr>
+      </w:pPr>
+    </w:p>
+    <w:p>
+      <w:pPr>
+        <w:spacing w:after="0"/>
+        <w:rPr>
+          <w:rFonts w:asciiTheme="majorHAnsi" w:hAnsiTheme="majorHAnsi" w:cstheme="majorHAnsi"/>
+          <w:lang w:val="pt-BR"/>
+        </w:rPr>
+      </w:pPr>
+      <w:r>
+        <w:rPr>
+          <w:rFonts w:asciiTheme="majorHAnsi" w:hAnsiTheme="majorHAnsi" w:cstheme="majorHAnsi"/>
+          <w:lang w:val="pt-BR"/>
+        </w:rPr>
+        <w:t>Por que importa: CORS mal configurado em endpoints de aplicação (não-Actuator)</w:t>
+      </w:r>
+    </w:p>
+    <w:p>
+      <w:pPr>
+        <w:spacing w:after="0"/>
+        <w:rPr>
+          <w:rFonts w:asciiTheme="majorHAnsi" w:hAnsiTheme="majorHAnsi" w:cstheme="majorHAnsi"/>
+          <w:lang w:val="pt-BR"/>
+        </w:rPr>
+      </w:pPr>
+      <w:r>
+        <w:rPr>
+          <w:rFonts w:asciiTheme="majorHAnsi" w:hAnsiTheme="majorHAnsi" w:cstheme="majorHAnsi"/>
+          <w:lang w:val="pt-BR"/>
+        </w:rPr>
+        <w:t>é, provavelmente, o cenário mais comum e mais crítico na prática — muito mais</w:t>
+      </w:r>
+    </w:p>
+    <w:p>
+      <w:pPr>
+        <w:spacing w:after="0"/>
+        <w:rPr>
+          <w:rFonts w:asciiTheme="majorHAnsi" w:hAnsiTheme="majorHAnsi" w:cstheme="majorHAnsi"/>
+          <w:lang w:val="pt-BR"/>
+        </w:rPr>
+      </w:pPr>
+      <w:r>
+        <w:rPr>
+          <w:rFonts w:asciiTheme="majorHAnsi" w:hAnsiTheme="majorHAnsi" w:cstheme="majorHAnsi"/>
+          <w:lang w:val="pt-BR"/>
+        </w:rPr>
+        <w:t>que CORS do Actuator. As três regras hoje são estruturalmente cegas pra esse</w:t>
+      </w:r>
+    </w:p>
+    <w:p>
+      <w:pPr>
+        <w:spacing w:after="0"/>
+        <w:rPr>
+          <w:rFonts w:asciiTheme="majorHAnsi" w:hAnsiTheme="majorHAnsi" w:cstheme="majorHAnsi"/>
+          <w:lang w:val="pt-BR"/>
+        </w:rPr>
+      </w:pPr>
+      <w:r>
+        <w:rPr>
+          <w:rFonts w:asciiTheme="majorHAnsi" w:hAnsiTheme="majorHAnsi" w:cstheme="majorHAnsi"/>
+          <w:lang w:val="pt-BR"/>
+        </w:rPr>
+        <w:t>cenário, porque o `spring-config-guard` só lê arquivos de configuração, nunca</w:t>
+      </w:r>
+    </w:p>
+    <w:p>
+      <w:pPr>
+        <w:spacing w:after="0"/>
+        <w:rPr>
+          <w:rFonts w:asciiTheme="majorHAnsi" w:hAnsiTheme="majorHAnsi" w:cstheme="majorHAnsi"/>
+          <w:lang w:val="pt-BR"/>
+        </w:rPr>
+      </w:pPr>
+      <w:r>
+        <w:rPr>
+          <w:rFonts w:asciiTheme="majorHAnsi" w:hAnsiTheme="majorHAnsi" w:cstheme="majorHAnsi"/>
+          <w:lang w:val="pt-BR"/>
+        </w:rPr>
+        <w:t>código Java/bytecode/AST. Isso não é um bug específico das regras — é uma</w:t>
+      </w:r>
+    </w:p>
+    <w:p>
+      <w:pPr>
+        <w:spacing w:after="0"/>
+        <w:rPr>
+          <w:rFonts w:asciiTheme="majorHAnsi" w:hAnsiTheme="majorHAnsi" w:cstheme="majorHAnsi"/>
+          <w:lang w:val="pt-BR"/>
+        </w:rPr>
+      </w:pPr>
+      <w:r>
+        <w:rPr>
+          <w:rFonts w:asciiTheme="majorHAnsi" w:hAnsiTheme="majorHAnsi" w:cstheme="majorHAnsi"/>
+          <w:lang w:val="pt-BR"/>
+        </w:rPr>
+        <w:t>limitação de escopo do projeto inteiro que se manifesta com força particular</w:t>
+      </w:r>
+    </w:p>
+    <w:p>
+      <w:pPr>
+        <w:spacing w:after="0"/>
+        <w:rPr>
+          <w:rFonts w:asciiTheme="majorHAnsi" w:hAnsiTheme="majorHAnsi" w:cstheme="majorHAnsi"/>
+          <w:lang w:val="pt-BR"/>
+        </w:rPr>
+      </w:pPr>
+      <w:r>
+        <w:rPr>
+          <w:rFonts w:asciiTheme="majorHAnsi" w:hAnsiTheme="majorHAnsi" w:cstheme="majorHAnsi"/>
+          <w:lang w:val="pt-BR"/>
+        </w:rPr>
+        <w:t>aqui.</w:t>
+      </w:r>
+    </w:p>
+    <w:p>
+      <w:pPr>
+        <w:spacing w:after="0"/>
+        <w:rPr>
+          <w:rFonts w:asciiTheme="majorHAnsi" w:hAnsiTheme="majorHAnsi" w:cstheme="majorHAnsi"/>
+          <w:lang w:val="pt-BR"/>
+        </w:rPr>
+      </w:pPr>
+    </w:p>
+    <w:p>
+      <w:pPr>
+        <w:spacing w:after="0"/>
+        <w:rPr>
+          <w:rFonts w:asciiTheme="majorHAnsi" w:hAnsiTheme="majorHAnsi" w:cstheme="majorHAnsi"/>
+          <w:lang w:val="pt-BR"/>
+        </w:rPr>
+      </w:pPr>
+      <w:r>
+        <w:rPr>
+          <w:rFonts w:asciiTheme="majorHAnsi" w:hAnsiTheme="majorHAnsi" w:cstheme="majorHAnsi"/>
+          <w:lang w:val="pt-BR"/>
+        </w:rPr>
+        <w:t>Confirmado com código: sim — a ausência de propriedade nativa para MVC CORS</w:t>
+      </w:r>
+    </w:p>
+    <w:p>
+      <w:pPr>
+        <w:spacing w:after="0"/>
+        <w:rPr>
+          <w:rFonts w:asciiTheme="majorHAnsi" w:hAnsiTheme="majorHAnsi" w:cstheme="majorHAnsi"/>
+          <w:lang w:val="pt-BR"/>
+        </w:rPr>
+      </w:pPr>
+      <w:r>
+        <w:rPr>
+          <w:rFonts w:asciiTheme="majorHAnsi" w:hAnsiTheme="majorHAnsi" w:cstheme="majorHAnsi"/>
+          <w:lang w:val="pt-BR"/>
+        </w:rPr>
+        <w:t>foi verificada contra o código-fonte oficial do Spring Boot (GitHub), não</w:t>
+      </w:r>
+    </w:p>
+    <w:p>
+      <w:pPr>
+        <w:spacing w:after="0"/>
+        <w:rPr>
+          <w:rFonts w:asciiTheme="majorHAnsi" w:hAnsiTheme="majorHAnsi" w:cstheme="majorHAnsi"/>
+          <w:lang w:val="pt-BR"/>
+        </w:rPr>
+      </w:pPr>
+      <w:r>
+        <w:rPr>
+          <w:rFonts w:asciiTheme="majorHAnsi" w:hAnsiTheme="majorHAnsi" w:cstheme="majorHAnsi"/>
+          <w:lang w:val="pt-BR"/>
+        </w:rPr>
+        <w:t>apenas documentação de terceiros.</w:t>
+      </w:r>
+    </w:p>
+    <w:p>
+      <w:pPr>
+        <w:spacing w:after="0"/>
+        <w:rPr>
+          <w:rFonts w:asciiTheme="majorHAnsi" w:hAnsiTheme="majorHAnsi" w:cstheme="majorHAnsi"/>
+          <w:lang w:val="pt-BR"/>
+        </w:rPr>
+      </w:pPr>
+    </w:p>
+    <w:p>
+      <w:pPr>
+        <w:spacing w:after="0"/>
+        <w:rPr>
+          <w:rFonts w:asciiTheme="majorHAnsi" w:hAnsiTheme="majorHAnsi" w:cstheme="majorHAnsi"/>
+          <w:lang w:val="pt-BR"/>
+        </w:rPr>
+      </w:pPr>
+      <w:r>
+        <w:rPr>
+          <w:rFonts w:asciiTheme="majorHAnsi" w:hAnsiTheme="majorHAnsi" w:cstheme="majorHAnsi"/>
+          <w:lang w:val="pt-BR"/>
+        </w:rPr>
+        <w:t>Custo de correção estimado: alto, e talvez fora do alcance realista do</w:t>
+      </w:r>
+    </w:p>
+    <w:p>
+      <w:pPr>
+        <w:spacing w:after="0"/>
+        <w:rPr>
+          <w:rFonts w:asciiTheme="majorHAnsi" w:hAnsiTheme="majorHAnsi" w:cstheme="majorHAnsi"/>
+          <w:lang w:val="pt-BR"/>
+        </w:rPr>
+      </w:pPr>
+      <w:r>
+        <w:rPr>
+          <w:rFonts w:asciiTheme="majorHAnsi" w:hAnsiTheme="majorHAnsi" w:cstheme="majorHAnsi"/>
+          <w:lang w:val="pt-BR"/>
+        </w:rPr>
+        <w:t>projeto como está hoje — cobrir CORS configurado via `WebMvcConfigurer`</w:t>
+      </w:r>
+    </w:p>
+    <w:p>
+      <w:pPr>
+        <w:spacing w:after="0"/>
+        <w:rPr>
+          <w:rFonts w:asciiTheme="majorHAnsi" w:hAnsiTheme="majorHAnsi" w:cstheme="majorHAnsi"/>
+          <w:lang w:val="pt-BR"/>
+        </w:rPr>
+      </w:pPr>
+      <w:r>
+        <w:rPr>
+          <w:rFonts w:asciiTheme="majorHAnsi" w:hAnsiTheme="majorHAnsi" w:cstheme="majorHAnsi"/>
+          <w:lang w:val="pt-BR"/>
+        </w:rPr>
+        <w:t>exigiria análise estática de código Java (parsing de AST, ex: via JavaParser</w:t>
+      </w:r>
+    </w:p>
+    <w:p>
+      <w:pPr>
+        <w:spacing w:after="0"/>
+        <w:rPr>
+          <w:rFonts w:asciiTheme="majorHAnsi" w:hAnsiTheme="majorHAnsi" w:cstheme="majorHAnsi"/>
+          <w:lang w:val="pt-BR"/>
+        </w:rPr>
+      </w:pPr>
+      <w:r>
+        <w:rPr>
+          <w:rFonts w:asciiTheme="majorHAnsi" w:hAnsiTheme="majorHAnsi" w:cstheme="majorHAnsi"/>
+          <w:lang w:val="pt-BR"/>
+        </w:rPr>
+        <w:t>ou similar), uma mudança de natureza fundamental na ferramenta, que hoje só</w:t>
+      </w:r>
+    </w:p>
+    <w:p>
+      <w:pPr>
+        <w:spacing w:after="0"/>
+        <w:rPr>
+          <w:rFonts w:asciiTheme="majorHAnsi" w:hAnsiTheme="majorHAnsi" w:cstheme="majorHAnsi"/>
+          <w:lang w:val="pt-BR"/>
+        </w:rPr>
+      </w:pPr>
+      <w:r>
+        <w:rPr>
+          <w:rFonts w:asciiTheme="majorHAnsi" w:hAnsiTheme="majorHAnsi" w:cstheme="majorHAnsi"/>
+          <w:lang w:val="pt-BR"/>
+        </w:rPr>
+        <w:t>processa YAML/properties. Não é uma correção de regra, é uma nova capacidade</w:t>
+      </w:r>
+    </w:p>
+    <w:p>
+      <w:pPr>
+        <w:spacing w:after="0"/>
+        <w:rPr>
+          <w:rFonts w:asciiTheme="majorHAnsi" w:hAnsiTheme="majorHAnsi" w:cstheme="majorHAnsi"/>
+          <w:lang w:val="pt-BR"/>
+        </w:rPr>
+      </w:pPr>
+      <w:r>
+        <w:rPr>
+          <w:rFonts w:asciiTheme="majorHAnsi" w:hAnsiTheme="majorHAnsi" w:cstheme="majorHAnsi"/>
+          <w:lang w:val="pt-BR"/>
+        </w:rPr>
+        <w:t>do motor inteiro.</w:t>
+      </w:r>
+    </w:p>
+    <w:p>
+      <w:pPr>
+        <w:spacing w:after="0"/>
+        <w:rPr>
+          <w:rFonts w:asciiTheme="majorHAnsi" w:hAnsiTheme="majorHAnsi" w:cstheme="majorHAnsi"/>
+          <w:lang w:val="pt-BR"/>
+        </w:rPr>
+      </w:pPr>
+    </w:p>
+    <w:p>
+      <w:pPr>
+        <w:spacing w:after="0"/>
+        <w:rPr>
+          <w:rFonts w:asciiTheme="majorHAnsi" w:hAnsiTheme="majorHAnsi" w:cstheme="majorHAnsi"/>
+          <w:lang w:val="pt-BR"/>
+        </w:rPr>
+      </w:pPr>
+      <w:r>
+        <w:rPr>
+          <w:rFonts w:asciiTheme="majorHAnsi" w:hAnsiTheme="majorHAnsi" w:cstheme="majorHAnsi"/>
+          <w:lang w:val="pt-BR"/>
+        </w:rPr>
+        <w:t>Status: registrado, não iniciado. Documentar essa limitação claramente</w:t>
+      </w:r>
+    </w:p>
+    <w:p>
+      <w:pPr>
+        <w:spacing w:after="0"/>
+        <w:rPr>
+          <w:rFonts w:asciiTheme="majorHAnsi" w:hAnsiTheme="majorHAnsi" w:cstheme="majorHAnsi"/>
+          <w:lang w:val="pt-BR"/>
+        </w:rPr>
+      </w:pPr>
+      <w:r>
+        <w:rPr>
+          <w:rFonts w:asciiTheme="majorHAnsi" w:hAnsiTheme="majorHAnsi" w:cstheme="majorHAnsi"/>
+          <w:lang w:val="pt-BR"/>
+        </w:rPr>
+        <w:t>(README, descrição das regras) é mais urgente e barato que resolver a limitação</w:t>
+      </w:r>
+    </w:p>
+    <w:p>
+      <w:pPr>
+        <w:spacing w:after="0"/>
+        <w:rPr>
+          <w:rFonts w:asciiTheme="majorHAnsi" w:hAnsiTheme="majorHAnsi" w:cstheme="majorHAnsi"/>
+          <w:lang w:val="pt-BR"/>
+        </w:rPr>
+      </w:pPr>
+      <w:r>
+        <w:rPr>
+          <w:rFonts w:asciiTheme="majorHAnsi" w:hAnsiTheme="majorHAnsi" w:cstheme="majorHAnsi"/>
+          <w:lang w:val="pt-BR"/>
+        </w:rPr>
+        <w:t>em si — usuários precisam saber que "SCG003/004/005 sem finding" não significa</w:t>
+      </w:r>
+    </w:p>
+    <w:p>
+      <w:pPr>
+        <w:spacing w:after="0"/>
+        <w:rPr>
+          <w:rFonts w:asciiTheme="majorHAnsi" w:hAnsiTheme="majorHAnsi" w:cstheme="majorHAnsi"/>
+          <w:lang w:val="pt-BR"/>
+        </w:rPr>
+      </w:pPr>
+      <w:r>
+        <w:rPr>
+          <w:rFonts w:asciiTheme="majorHAnsi" w:hAnsiTheme="majorHAnsi" w:cstheme="majorHAnsi"/>
+          <w:lang w:val="pt-BR"/>
+        </w:rPr>
+        <w:t>"CORS seguro", só significa "CORS do Actuator, se configurado via properties,</w:t>
+      </w:r>
+    </w:p>
+    <w:p>
+      <w:pPr>
+        <w:spacing w:after="0"/>
+        <w:rPr>
+          <w:rFonts w:asciiTheme="majorHAnsi" w:hAnsiTheme="majorHAnsi" w:cstheme="majorHAnsi"/>
+          <w:lang w:val="pt-BR"/>
+        </w:rPr>
+      </w:pPr>
+      <w:r>
+        <w:rPr>
+          <w:rFonts w:asciiTheme="majorHAnsi" w:hAnsiTheme="majorHAnsi" w:cstheme="majorHAnsi"/>
+          <w:lang w:val="pt-BR"/>
+        </w:rPr>
+        <w:t>está seguro".</w:t>
+      </w:r>
     </w:p>
     <w:p>
       <w:pPr>
@@ -8899,22 +9619,20 @@
             <w:pPr>
               <w:spacing w:after="0"/>
               <w:rPr>
-                <w:rFonts w:asciiTheme="majorHAnsi" w:hAnsiTheme="majorHAnsi" w:cstheme="majorHAnsi"/>
+                <w:rFonts w:ascii="Segoe UI Emoji" w:hAnsi="Segoe UI Emoji" w:cs="Segoe UI Emoji"/>
                 <w:b/>
                 <w:bCs/>
                 <w:i/>
                 <w:iCs/>
-                <w:lang w:val="pt-BR"/>
               </w:rPr>
             </w:pPr>
             <w:r>
               <w:rPr>
-                <w:rFonts w:asciiTheme="majorHAnsi" w:hAnsiTheme="majorHAnsi" w:cstheme="majorHAnsi"/>
+                <w:rFonts w:ascii="Segoe UI Emoji" w:hAnsi="Segoe UI Emoji" w:cs="Segoe UI Emoji"/>
                 <w:b/>
                 <w:bCs/>
                 <w:i/>
                 <w:iCs/>
-                <w:lang w:val="pt-BR"/>
               </w:rPr>
               <w:t>#</w:t>
             </w:r>
@@ -8929,7 +9647,7 @@
             <w:pPr>
               <w:spacing w:after="0"/>
               <w:rPr>
-                <w:rFonts w:asciiTheme="majorHAnsi" w:hAnsiTheme="majorHAnsi" w:cstheme="majorHAnsi"/>
+                <w:rFonts w:ascii="Segoe UI Emoji" w:hAnsi="Segoe UI Emoji" w:cs="Segoe UI Emoji"/>
                 <w:b/>
                 <w:bCs/>
                 <w:i/>
@@ -8938,7 +9656,7 @@
             </w:pPr>
             <w:r>
               <w:rPr>
-                <w:rFonts w:asciiTheme="majorHAnsi" w:hAnsiTheme="majorHAnsi" w:cstheme="majorHAnsi"/>
+                <w:rFonts w:ascii="Segoe UI Emoji" w:hAnsi="Segoe UI Emoji" w:cs="Segoe UI Emoji"/>
                 <w:b/>
                 <w:bCs/>
                 <w:i/>
@@ -9592,13 +10310,7 @@
                 <w:rFonts w:asciiTheme="majorHAnsi" w:hAnsiTheme="majorHAnsi" w:cstheme="majorHAnsi"/>
               </w:rPr>
               <w:lastRenderedPageBreak/>
-              <w:t>BL-</w:t>
-            </w:r>
-            <w:r>
-              <w:rPr>
-                <w:rFonts w:asciiTheme="majorHAnsi" w:hAnsiTheme="majorHAnsi" w:cstheme="majorHAnsi"/>
-              </w:rPr>
-              <w:t>20</w:t>
+              <w:t>BL-20</w:t>
             </w:r>
           </w:p>
         </w:tc>
@@ -9629,14 +10341,20 @@
             <w:pPr>
               <w:spacing w:after="0"/>
               <w:rPr>
-                <w:rFonts w:ascii="Segoe UI Emoji" w:hAnsi="Segoe UI Emoji" w:cs="Segoe UI Emoji"/>
+                <w:rFonts w:asciiTheme="majorHAnsi" w:hAnsiTheme="majorHAnsi" w:cstheme="majorHAnsi"/>
               </w:rPr>
             </w:pPr>
             <w:r>
               <w:rPr>
                 <w:rFonts w:ascii="Segoe UI Emoji" w:hAnsi="Segoe UI Emoji" w:cs="Segoe UI Emoji"/>
               </w:rPr>
-              <w:t>🟢 Baixa (limitação pré-existente, documentada agora)</w:t>
+              <w:t>🟢</w:t>
+            </w:r>
+            <w:r>
+              <w:rPr>
+                <w:rFonts w:asciiTheme="majorHAnsi" w:hAnsiTheme="majorHAnsi" w:cstheme="majorHAnsi"/>
+              </w:rPr>
+              <w:t xml:space="preserve"> Baixa (limitação pré-existente, documentada agora)</w:t>
             </w:r>
           </w:p>
         </w:tc>
@@ -9649,7 +10367,6 @@
               <w:spacing w:after="0"/>
               <w:rPr>
                 <w:rFonts w:asciiTheme="majorHAnsi" w:hAnsiTheme="majorHAnsi" w:cstheme="majorHAnsi"/>
-                <w:u w:val="single"/>
               </w:rPr>
             </w:pPr>
             <w:r>
@@ -9657,6 +10374,96 @@
                 <w:rFonts w:asciiTheme="majorHAnsi" w:hAnsiTheme="majorHAnsi" w:cstheme="majorHAnsi"/>
               </w:rPr>
               <w:t>Médio-alto (precisa de convenção de escape)</w:t>
+            </w:r>
+          </w:p>
+        </w:tc>
+      </w:tr>
+      <w:tr>
+        <w:tc>
+          <w:tcPr>
+            <w:tcW w:w="978" w:type="dxa"/>
+          </w:tcPr>
+          <w:p>
+            <w:pPr>
+              <w:spacing w:after="0"/>
+              <w:rPr>
+                <w:rFonts w:asciiTheme="majorHAnsi" w:hAnsiTheme="majorHAnsi" w:cstheme="majorHAnsi"/>
+              </w:rPr>
+            </w:pPr>
+            <w:r>
+              <w:rPr>
+                <w:rFonts w:asciiTheme="majorHAnsi" w:hAnsiTheme="majorHAnsi" w:cstheme="majorHAnsi"/>
+              </w:rPr>
+              <w:t>BL-2</w:t>
+            </w:r>
+            <w:r>
+              <w:rPr>
+                <w:rFonts w:asciiTheme="majorHAnsi" w:hAnsiTheme="majorHAnsi" w:cstheme="majorHAnsi"/>
+              </w:rPr>
+              <w:t>1</w:t>
+            </w:r>
+          </w:p>
+        </w:tc>
+        <w:tc>
+          <w:tcPr>
+            <w:tcW w:w="4479" w:type="dxa"/>
+          </w:tcPr>
+          <w:p>
+            <w:pPr>
+              <w:spacing w:after="0"/>
+              <w:rPr>
+                <w:rFonts w:asciiTheme="majorHAnsi" w:hAnsiTheme="majorHAnsi" w:cstheme="majorHAnsi"/>
+              </w:rPr>
+            </w:pPr>
+            <w:r>
+              <w:rPr>
+                <w:rFonts w:asciiTheme="majorHAnsi" w:hAnsiTheme="majorHAnsi" w:cstheme="majorHAnsi"/>
+              </w:rPr>
+              <w:t>Regras de CORS só cobrem Actuator, não CORS de aplicação (MVC) configurado via código</w:t>
+            </w:r>
+          </w:p>
+        </w:tc>
+        <w:tc>
+          <w:tcPr>
+            <w:tcW w:w="1977" w:type="dxa"/>
+          </w:tcPr>
+          <w:p>
+            <w:pPr>
+              <w:spacing w:after="0"/>
+              <w:rPr>
+                <w:rFonts w:ascii="Segoe UI Emoji" w:hAnsi="Segoe UI Emoji" w:cs="Segoe UI Emoji"/>
+              </w:rPr>
+            </w:pPr>
+            <w:r>
+              <w:rPr>
+                <w:rFonts w:ascii="Segoe UI Emoji" w:hAnsi="Segoe UI Emoji" w:cs="Segoe UI Emoji"/>
+              </w:rPr>
+              <w:t>🟡</w:t>
+            </w:r>
+            <w:r>
+              <w:rPr>
+                <w:rFonts w:asciiTheme="majorHAnsi" w:hAnsiTheme="majorHAnsi" w:cstheme="majorHAnsi"/>
+              </w:rPr>
+              <w:t xml:space="preserve"> Média (limitação estrutural, documentação urgente)</w:t>
+            </w:r>
+          </w:p>
+        </w:tc>
+        <w:tc>
+          <w:tcPr>
+            <w:tcW w:w="2104" w:type="dxa"/>
+          </w:tcPr>
+          <w:p>
+            <w:pPr>
+              <w:spacing w:after="0"/>
+              <w:rPr>
+                <w:rFonts w:asciiTheme="majorHAnsi" w:hAnsiTheme="majorHAnsi" w:cstheme="majorHAnsi"/>
+              </w:rPr>
+            </w:pPr>
+            <w:r>
+              <w:rPr>
+                <w:rFonts w:asciiTheme="majorHAnsi" w:hAnsiTheme="majorHAnsi" w:cstheme="majorHAnsi"/>
+              </w:rPr>
+              <w:t>Alto (exigiria análise de AST Java)</w:t>
             </w:r>
           </w:p>
         </w:tc>

</xml_diff>

<commit_message>
refactor(rules): split SCG005 CORS exposed headers by browser risk levels
- Refactor CorsPermissiveMethodsAndHeadersRule (SCG005) to classify exposed headers into distinct severity tiers:
  * MEDIUM: Authorization, X-Auth-Token (effective credential exposure to JS)
  * LOW: Set-Cookie, Set-Cookie2 (inefficient due to WHATWG browser forbidden response header restrictions)
  * INFO: Cookie (direction anomaly / request header misplaced in response exposure)
- Remove generic SENSITIVE_HEADERS static set in favor of categorized sets.
- Add comprehensive test scenarios in CorsPermissiveMethodsAndHeadersRuleTest covering case insensitivity, YAML list parsing, placeholders with defaults, whitespace stripping, and mixed severity outputs.
</commit_message>
<xml_diff>
--- a/BACKLOG.docx
+++ b/BACKLOG.docx
@@ -66,6 +66,7 @@
       <w:pPr>
         <w:pStyle w:val="Ttulo4"/>
       </w:pPr>
+      <w:proofErr w:type="gramStart"/>
       <w:r>
         <w:rPr>
           <w:rFonts w:ascii="Cambria" w:eastAsia="Cambria" w:hAnsi="Cambria"/>
@@ -81,12 +82,22 @@
           <w:sz w:val="20"/>
           <w:szCs w:val="20"/>
         </w:rPr>
-        <w:t xml:space="preserve"> DONE commit </w:t>
-      </w:r>
+        <w:t xml:space="preserve"> DONE</w:t>
+      </w:r>
+      <w:proofErr w:type="gramEnd"/>
       <w:r>
         <w:rPr>
           <w:rFonts w:ascii="Cambria" w:eastAsia="Cambria" w:hAnsi="Cambria"/>
           <w:b/>
+          <w:sz w:val="20"/>
+          <w:szCs w:val="20"/>
+        </w:rPr>
+        <w:t xml:space="preserve"> commit </w:t>
+      </w:r>
+      <w:r>
+        <w:rPr>
+          <w:rFonts w:ascii="Cambria" w:eastAsia="Cambria" w:hAnsi="Cambria"/>
+          <w:b/>
           <w:color w:val="C9211E"/>
         </w:rPr>
         <w:t>942cbf9</w:t>
@@ -143,7 +154,21 @@
         <w:rPr>
           <w:rStyle w:val="VerbatimChar"/>
         </w:rPr>
-        <w:t>Map&lt;String,String&gt;</w:t>
+        <w:t>Map&lt;</w:t>
+      </w:r>
+      <w:proofErr w:type="gramStart"/>
+      <w:r>
+        <w:rPr>
+          <w:rStyle w:val="VerbatimChar"/>
+        </w:rPr>
+        <w:t>String,String</w:t>
+      </w:r>
+      <w:proofErr w:type="gramEnd"/>
+      <w:r>
+        <w:rPr>
+          <w:rStyle w:val="VerbatimChar"/>
+        </w:rPr>
+        <w:t>&gt;</w:t>
       </w:r>
       <w:r>
         <w:t xml:space="preserve"> exposto por </w:t>
@@ -182,22 +207,58 @@
         <w:t>EffectiveConfig</w:t>
       </w:r>
       <w:r>
-        <w:t xml:space="preserve"> pode chamar </w:t>
+        <w:t xml:space="preserve"> pode </w:t>
+      </w:r>
+      <w:proofErr w:type="gramStart"/>
+      <w:r>
+        <w:t xml:space="preserve">chamar </w:t>
       </w:r>
       <w:r>
         <w:rPr>
           <w:rStyle w:val="VerbatimChar"/>
         </w:rPr>
-        <w:t>.properties().put(...)</w:t>
-      </w:r>
-      <w:r>
-        <w:t xml:space="preserve"> ou </w:t>
-      </w:r>
+        <w:t>.properties</w:t>
+      </w:r>
+      <w:proofErr w:type="gramEnd"/>
       <w:r>
         <w:rPr>
           <w:rStyle w:val="VerbatimChar"/>
         </w:rPr>
-        <w:t>.remove(...)</w:t>
+        <w:t>(</w:t>
+      </w:r>
+      <w:proofErr w:type="gramStart"/>
+      <w:r>
+        <w:rPr>
+          <w:rStyle w:val="VerbatimChar"/>
+        </w:rPr>
+        <w:t>).put</w:t>
+      </w:r>
+      <w:proofErr w:type="gramEnd"/>
+      <w:r>
+        <w:rPr>
+          <w:rStyle w:val="VerbatimChar"/>
+        </w:rPr>
+        <w:t>(...)</w:t>
+      </w:r>
+      <w:r>
+        <w:t xml:space="preserve"> </w:t>
+      </w:r>
+      <w:proofErr w:type="gramStart"/>
+      <w:r>
+        <w:t xml:space="preserve">ou </w:t>
+      </w:r>
+      <w:r>
+        <w:rPr>
+          <w:rStyle w:val="VerbatimChar"/>
+        </w:rPr>
+        <w:t>.remove</w:t>
+      </w:r>
+      <w:proofErr w:type="gramEnd"/>
+      <w:r>
+        <w:rPr>
+          <w:rStyle w:val="VerbatimChar"/>
+        </w:rPr>
+        <w:t>(...)</w:t>
       </w:r>
       <w:r>
         <w:t xml:space="preserve"> livremente.</w:t>
@@ -297,11 +358,33 @@
       <w:r>
         <w:t xml:space="preserve"> sim — </w:t>
       </w:r>
+      <w:proofErr w:type="gramStart"/>
       <w:r>
         <w:rPr>
           <w:rStyle w:val="VerbatimChar"/>
         </w:rPr>
-        <w:t>dev.properties().put("chave-maliciosa", "x")</w:t>
+        <w:t>dev.properties</w:t>
+      </w:r>
+      <w:proofErr w:type="gramEnd"/>
+      <w:r>
+        <w:rPr>
+          <w:rStyle w:val="VerbatimChar"/>
+        </w:rPr>
+        <w:t>(</w:t>
+      </w:r>
+      <w:proofErr w:type="gramStart"/>
+      <w:r>
+        <w:rPr>
+          <w:rStyle w:val="VerbatimChar"/>
+        </w:rPr>
+        <w:t>).put</w:t>
+      </w:r>
+      <w:proofErr w:type="gramEnd"/>
+      <w:r>
+        <w:rPr>
+          <w:rStyle w:val="VerbatimChar"/>
+        </w:rPr>
+        <w:t>("chave-maliciosa", "x")</w:t>
       </w:r>
       <w:r>
         <w:t xml:space="preserve"> foi aceito sem exceção, e a mutação persistiu em leituras subsequentes do mesmo objeto.</w:t>
@@ -480,7 +563,21 @@
         <w:rPr>
           <w:rStyle w:val="VerbatimChar"/>
         </w:rPr>
-        <w:t>spring.config.activate.on-profile: base</w:t>
+        <w:t>spring.</w:t>
+      </w:r>
+      <w:proofErr w:type="gramStart"/>
+      <w:r>
+        <w:rPr>
+          <w:rStyle w:val="VerbatimChar"/>
+        </w:rPr>
+        <w:t>config.activate</w:t>
+      </w:r>
+      <w:proofErr w:type="gramEnd"/>
+      <w:r>
+        <w:rPr>
+          <w:rStyle w:val="VerbatimChar"/>
+        </w:rPr>
+        <w:t>.on-profile: base</w:t>
       </w:r>
       <w:r>
         <w:t xml:space="preserve"> é sintaticamente válido. Como </w:t>
@@ -528,11 +625,19 @@
       <w:r>
         <w:t xml:space="preserve"> o resultado de </w:t>
       </w:r>
+      <w:proofErr w:type="gramStart"/>
       <w:r>
         <w:rPr>
           <w:rStyle w:val="VerbatimChar"/>
         </w:rPr>
-        <w:t>merge()</w:t>
+        <w:t>merge(</w:t>
+      </w:r>
+      <w:proofErr w:type="gramEnd"/>
+      <w:r>
+        <w:rPr>
+          <w:rStyle w:val="VerbatimChar"/>
+        </w:rPr>
+        <w:t>)</w:t>
       </w:r>
       <w:r>
         <w:t xml:space="preserve"> passa a conter </w:t>
@@ -565,11 +670,19 @@
       <w:r>
         <w:t xml:space="preserve"> — uma sintética (config incondicional) e outra do profile nomeado pelo usuário (já fundida com o base). Qualquer busca por rótulo (</w:t>
       </w:r>
+      <w:proofErr w:type="gramStart"/>
       <w:r>
         <w:rPr>
           <w:rStyle w:val="VerbatimChar"/>
         </w:rPr>
-        <w:t>findFirst()</w:t>
+        <w:t>findFirst(</w:t>
+      </w:r>
+      <w:proofErr w:type="gramEnd"/>
+      <w:r>
+        <w:rPr>
+          <w:rStyle w:val="VerbatimChar"/>
+        </w:rPr>
+        <w:t>)</w:t>
       </w:r>
       <w:r>
         <w:t xml:space="preserve">, </w:t>
@@ -617,11 +730,19 @@
       <w:r>
         <w:t xml:space="preserve"> sim — </w:t>
       </w:r>
+      <w:proofErr w:type="gramStart"/>
       <w:r>
         <w:rPr>
           <w:rStyle w:val="VerbatimChar"/>
         </w:rPr>
-        <w:t>merge()</w:t>
+        <w:t>merge(</w:t>
+      </w:r>
+      <w:proofErr w:type="gramEnd"/>
+      <w:r>
+        <w:rPr>
+          <w:rStyle w:val="VerbatimChar"/>
+        </w:rPr>
+        <w:t>)</w:t>
       </w:r>
       <w:r>
         <w:t xml:space="preserve"> gerou 2 </w:t>
@@ -709,8 +830,58 @@
         <w:rPr>
           <w:rStyle w:val="VerbatimChar"/>
         </w:rPr>
-        <w:t>sealed    interface ProfileLabel { record Synthetic(), record Named(String name) }</w:t>
-      </w:r>
+        <w:t xml:space="preserve">sealed    interface ProfileLabel </w:t>
+      </w:r>
+      <w:proofErr w:type="gramStart"/>
+      <w:r>
+        <w:rPr>
+          <w:rStyle w:val="VerbatimChar"/>
+        </w:rPr>
+        <w:t>{ record</w:t>
+      </w:r>
+      <w:proofErr w:type="gramEnd"/>
+      <w:r>
+        <w:rPr>
+          <w:rStyle w:val="VerbatimChar"/>
+        </w:rPr>
+        <w:t xml:space="preserve"> </w:t>
+      </w:r>
+      <w:proofErr w:type="gramStart"/>
+      <w:r>
+        <w:rPr>
+          <w:rStyle w:val="VerbatimChar"/>
+        </w:rPr>
+        <w:t>Synthetic(</w:t>
+      </w:r>
+      <w:proofErr w:type="gramEnd"/>
+      <w:r>
+        <w:rPr>
+          <w:rStyle w:val="VerbatimChar"/>
+        </w:rPr>
+        <w:t xml:space="preserve">), record </w:t>
+      </w:r>
+      <w:proofErr w:type="gramStart"/>
+      <w:r>
+        <w:rPr>
+          <w:rStyle w:val="VerbatimChar"/>
+        </w:rPr>
+        <w:t>Named(</w:t>
+      </w:r>
+      <w:proofErr w:type="gramEnd"/>
+      <w:r>
+        <w:rPr>
+          <w:rStyle w:val="VerbatimChar"/>
+        </w:rPr>
+        <w:t>String name</w:t>
+      </w:r>
+      <w:proofErr w:type="gramStart"/>
+      <w:r>
+        <w:rPr>
+          <w:rStyle w:val="VerbatimChar"/>
+        </w:rPr>
+        <w:t>) }</w:t>
+      </w:r>
+      <w:proofErr w:type="gramEnd"/>
       <w:r>
         <w:t xml:space="preserve">). Isso reabre a decisão de design anterior de manter </w:t>
       </w:r>
@@ -893,11 +1064,19 @@
       <w:r>
         <w:t xml:space="preserve">): </w:t>
       </w:r>
+      <w:proofErr w:type="gramStart"/>
       <w:r>
         <w:rPr>
           <w:rStyle w:val="VerbatimChar"/>
         </w:rPr>
-        <w:t>flatten()</w:t>
+        <w:t>flatten(</w:t>
+      </w:r>
+      <w:proofErr w:type="gramEnd"/>
+      <w:r>
+        <w:rPr>
+          <w:rStyle w:val="VerbatimChar"/>
+        </w:rPr>
+        <w:t>)</w:t>
       </w:r>
       <w:r>
         <w:t xml:space="preserve"> produz </w:t>
@@ -933,6 +1112,7 @@
         <w:t xml:space="preserve">. </w:t>
       </w:r>
       <w:bookmarkStart w:id="3" w:name="_Hlk236679610"/>
+      <w:proofErr w:type="gramStart"/>
       <w:r>
         <w:rPr>
           <w:rFonts w:eastAsia="Cambria"/>
@@ -942,7 +1122,11 @@
         <w:t xml:space="preserve">🟢  </w:t>
       </w:r>
       <w:r>
-        <w:t xml:space="preserve">DONE  </w:t>
+        <w:t>DONE</w:t>
+      </w:r>
+      <w:proofErr w:type="gramEnd"/>
+      <w:r>
+        <w:t xml:space="preserve">  </w:t>
       </w:r>
       <w:bookmarkEnd w:id="3"/>
       <w:r>
@@ -983,7 +1167,21 @@
         <w:rPr>
           <w:rStyle w:val="VerbatimChar"/>
         </w:rPr>
-        <w:t>allowed-origins: "a.com,b.com"</w:t>
+        <w:t>allowed-origins: "</w:t>
+      </w:r>
+      <w:proofErr w:type="gramStart"/>
+      <w:r>
+        <w:rPr>
+          <w:rStyle w:val="VerbatimChar"/>
+        </w:rPr>
+        <w:t>a.com,b.com</w:t>
+      </w:r>
+      <w:proofErr w:type="gramEnd"/>
+      <w:r>
+        <w:rPr>
+          <w:rStyle w:val="VerbatimChar"/>
+        </w:rPr>
+        <w:t>"</w:t>
       </w:r>
       <w:r>
         <w:t xml:space="preserve">, sintaxe válida e documentada do Spring para popular </w:t>
@@ -1016,11 +1214,19 @@
       <w:r>
         <w:t xml:space="preserve"> (</w:t>
       </w:r>
+      <w:proofErr w:type="gramStart"/>
       <w:r>
         <w:rPr>
           <w:rStyle w:val="VerbatimChar"/>
         </w:rPr>
-        <w:t>cors.allowed-origins</w:t>
+        <w:t>cors.allowed</w:t>
+      </w:r>
+      <w:proofErr w:type="gramEnd"/>
+      <w:r>
+        <w:rPr>
+          <w:rStyle w:val="VerbatimChar"/>
+        </w:rPr>
+        <w:t>-origins</w:t>
       </w:r>
       <w:r>
         <w:t xml:space="preserve">), que não aciona a purga. O resultado é um estado inconsistente — a chave nova coexiste com os índices órfãos do base </w:t>
@@ -1029,11 +1235,33 @@
         <w:lastRenderedPageBreak/>
         <w:t>(</w:t>
       </w:r>
+      <w:proofErr w:type="gramStart"/>
       <w:r>
         <w:rPr>
           <w:rStyle w:val="VerbatimChar"/>
         </w:rPr>
-        <w:t>cors.allowed-origins[0]</w:t>
+        <w:t>cors.allowed</w:t>
+      </w:r>
+      <w:proofErr w:type="gramEnd"/>
+      <w:r>
+        <w:rPr>
+          <w:rStyle w:val="VerbatimChar"/>
+        </w:rPr>
+        <w:t>-</w:t>
+      </w:r>
+      <w:proofErr w:type="gramStart"/>
+      <w:r>
+        <w:rPr>
+          <w:rStyle w:val="VerbatimChar"/>
+        </w:rPr>
+        <w:t>origins[</w:t>
+      </w:r>
+      <w:proofErr w:type="gramEnd"/>
+      <w:r>
+        <w:rPr>
+          <w:rStyle w:val="VerbatimChar"/>
+        </w:rPr>
+        <w:t>0]</w:t>
       </w:r>
       <w:r>
         <w:t xml:space="preserve">, </w:t>
@@ -1050,6 +1278,7 @@
       <w:r>
         <w:t xml:space="preserve">             </w:t>
       </w:r>
+      <w:proofErr w:type="gramStart"/>
       <w:r>
         <w:rPr>
           <w:rFonts w:eastAsia="Cambria"/>
@@ -1059,7 +1288,11 @@
         <w:t xml:space="preserve">🟢  </w:t>
       </w:r>
       <w:r>
-        <w:t xml:space="preserve">DONE  commit </w:t>
+        <w:t>DONE</w:t>
+      </w:r>
+      <w:proofErr w:type="gramEnd"/>
+      <w:r>
+        <w:t xml:space="preserve">  commit </w:t>
       </w:r>
       <w:r>
         <w:rPr>
@@ -1133,20 +1366,50 @@
       <w:r>
         <w:t xml:space="preserve">. Requer nova lógica de detecção em pelo menos um dos dois pontos: - Para (a): </w:t>
       </w:r>
+      <w:proofErr w:type="gramStart"/>
       <w:r>
         <w:rPr>
           <w:rStyle w:val="VerbatimChar"/>
         </w:rPr>
-        <w:t>flatten()</w:t>
+        <w:t>flatten(</w:t>
+      </w:r>
+      <w:proofErr w:type="gramEnd"/>
+      <w:r>
+        <w:rPr>
+          <w:rStyle w:val="VerbatimChar"/>
+        </w:rPr>
+        <w:t>)</w:t>
       </w:r>
       <w:r>
         <w:t xml:space="preserve"> poderia emitir uma chave-sentinela quando encontrar uma lista vazia (ex: </w:t>
       </w:r>
+      <w:proofErr w:type="gramStart"/>
       <w:r>
         <w:rPr>
           <w:rStyle w:val="VerbatimChar"/>
         </w:rPr>
-        <w:t>cors.allowed-origins.__empty__ = true</w:t>
+        <w:t>cors.allowed</w:t>
+      </w:r>
+      <w:proofErr w:type="gramEnd"/>
+      <w:r>
+        <w:rPr>
+          <w:rStyle w:val="VerbatimChar"/>
+        </w:rPr>
+        <w:t>-</w:t>
+      </w:r>
+      <w:proofErr w:type="gramStart"/>
+      <w:r>
+        <w:rPr>
+          <w:rStyle w:val="VerbatimChar"/>
+        </w:rPr>
+        <w:t>origins._</w:t>
+      </w:r>
+      <w:proofErr w:type="gramEnd"/>
+      <w:r>
+        <w:rPr>
+          <w:rStyle w:val="VerbatimChar"/>
+        </w:rPr>
+        <w:t>_empty__ = true</w:t>
       </w:r>
       <w:r>
         <w:t xml:space="preserve">), permitindo que </w:t>
@@ -1158,7 +1421,15 @@
         <w:t>mergeProperties</w:t>
       </w:r>
       <w:r>
-        <w:t xml:space="preserve"> reconheça a intenção de “lista redefinida como vazia” e purgue mesmo sem chaves indexadas no overlay. - Para (b): </w:t>
+        <w:t xml:space="preserve"> reconheça </w:t>
+      </w:r>
+      <w:proofErr w:type="gramStart"/>
+      <w:r>
+        <w:t>a</w:t>
+      </w:r>
+      <w:proofErr w:type="gramEnd"/>
+      <w:r>
+        <w:t xml:space="preserve"> intenção de “lista redefinida como vazia” e purgue mesmo sem chaves indexadas no overlay. - Para (b): </w:t>
       </w:r>
       <w:r>
         <w:rPr>
@@ -1284,7 +1555,11 @@
         <w:t>findBaseProperties</w:t>
       </w:r>
       <w:r>
-        <w:t xml:space="preserve"> perde dado silenciosamente se invariante de “documento único-base” for violada </w:t>
+        <w:t xml:space="preserve"> perde dado silenciosamente se invariante de “documento único-base” for </w:t>
+      </w:r>
+      <w:proofErr w:type="gramStart"/>
+      <w:r>
+        <w:t xml:space="preserve">violada </w:t>
       </w:r>
       <w:r>
         <w:rPr>
@@ -1302,7 +1577,18 @@
           <w:sz w:val="20"/>
           <w:szCs w:val="20"/>
         </w:rPr>
-        <w:t xml:space="preserve">🟡  </w:t>
+        <w:t>🟡</w:t>
+      </w:r>
+      <w:proofErr w:type="gramEnd"/>
+      <w:r>
+        <w:rPr>
+          <w:rFonts w:ascii="JetBrains Mono" w:eastAsia="Cambria" w:hAnsi="JetBrains Mono"/>
+          <w:b/>
+          <w:color w:val="5F826B"/>
+          <w:sz w:val="20"/>
+          <w:szCs w:val="20"/>
+        </w:rPr>
+        <w:t xml:space="preserve">  </w:t>
       </w:r>
       <w:r>
         <w:rPr>
@@ -1595,7 +1881,21 @@
         <w:rPr>
           <w:rStyle w:val="VerbatimChar"/>
         </w:rPr>
-        <w:t>on-profile: "prod &amp; !test"</w:t>
+        <w:t xml:space="preserve">on-profile: "prod </w:t>
+      </w:r>
+      <w:proofErr w:type="gramStart"/>
+      <w:r>
+        <w:rPr>
+          <w:rStyle w:val="VerbatimChar"/>
+        </w:rPr>
+        <w:t>&amp; !test</w:t>
+      </w:r>
+      <w:proofErr w:type="gramEnd"/>
+      <w:r>
+        <w:rPr>
+          <w:rStyle w:val="VerbatimChar"/>
+        </w:rPr>
+        <w:t>"</w:t>
       </w:r>
       <w:r>
         <w:t xml:space="preserve"> (lógica booleana de profiles) está fora de escopo. Tratado hoje como profile “complexo/desconhecido” — comportamento exato ainda a formalizar com teste dedicado.</w:t>
@@ -1635,12 +1935,14 @@
       <w:r>
         <w:t xml:space="preserve"> contra o base (nunca </w:t>
       </w:r>
+      <w:proofErr w:type="gramStart"/>
       <w:r>
         <w:rPr>
           <w:rStyle w:val="VerbatimChar"/>
         </w:rPr>
         <w:t>dev,mysql</w:t>
       </w:r>
+      <w:proofErr w:type="gramEnd"/>
       <w:r>
         <w:t xml:space="preserve"> juntos, por exemplo). Fora de escopo por decisão deliberada — explode combinatoriamente (2^N profiles) se implementado ingenuamente.</w:t>
       </w:r>
@@ -1654,6 +1956,7 @@
       <w:r>
         <w:t xml:space="preserve">BL-07 — Teste placeholder de documento vazio após último separador </w:t>
       </w:r>
+      <w:proofErr w:type="gramStart"/>
       <w:r>
         <w:rPr>
           <w:rFonts w:eastAsia="Cambria"/>
@@ -1674,6 +1977,7 @@
         </w:rPr>
         <w:t>DONE</w:t>
       </w:r>
+      <w:proofErr w:type="gramEnd"/>
       <w:r>
         <w:rPr>
           <w:rFonts w:eastAsiaTheme="minorHAnsi" w:cstheme="minorBidi"/>
@@ -1704,11 +2008,19 @@
       <w:r>
         <w:t xml:space="preserve"> ainda falha propositalmente (</w:t>
       </w:r>
+      <w:proofErr w:type="gramStart"/>
       <w:r>
         <w:rPr>
           <w:rStyle w:val="VerbatimChar"/>
         </w:rPr>
-        <w:t>assertTrue(false, ...)</w:t>
+        <w:t>assertTrue(</w:t>
+      </w:r>
+      <w:proofErr w:type="gramEnd"/>
+      <w:r>
+        <w:rPr>
+          <w:rStyle w:val="VerbatimChar"/>
+        </w:rPr>
+        <w:t>false, ...)</w:t>
       </w:r>
       <w:r>
         <w:t xml:space="preserve">). A lógica já foi validada via sandbox — falta só formalizar o </w:t>
@@ -1739,7 +2051,21 @@
         <w:rPr>
           <w:color w:val="EE0000"/>
         </w:rPr>
-        <w:t>Itens Novos (descobertos em revisão externa — mesma classe de bug do BL-03)</w:t>
+        <w:t xml:space="preserve">Itens Novos (descobertos em revisão externa — mesma classe de bug </w:t>
+      </w:r>
+      <w:proofErr w:type="gramStart"/>
+      <w:r>
+        <w:rPr>
+          <w:color w:val="EE0000"/>
+        </w:rPr>
+        <w:t>do</w:t>
+      </w:r>
+      <w:proofErr w:type="gramEnd"/>
+      <w:r>
+        <w:rPr>
+          <w:color w:val="EE0000"/>
+        </w:rPr>
+        <w:t xml:space="preserve"> BL-03)</w:t>
       </w:r>
     </w:p>
     <w:p>
@@ -1749,38 +2075,70 @@
       <w:r>
         <w:t xml:space="preserve">Um dev externo revisou o commit do BL-03(a) e questionou se a correção (sentinela para lista vazia) generalizava para outras estruturas do YAML que também “desaparecem” ao serem achatadas. A crítica continha imprecisões (confundiu a camada sintática do YAML com a camada de binding real do Spring — Set/Array/Collection customizada não são categorias distintas no nosso </w:t>
       </w:r>
+      <w:proofErr w:type="gramStart"/>
       <w:r>
         <w:rPr>
           <w:rStyle w:val="VerbatimChar"/>
         </w:rPr>
-        <w:t>flatten()</w:t>
-      </w:r>
-      <w:r>
-        <w:t xml:space="preserve">, e a alegação de que a correção só cobria o caso concreto </w:t>
-      </w:r>
+        <w:t>flatten(</w:t>
+      </w:r>
+      <w:proofErr w:type="gramEnd"/>
       <w:r>
         <w:rPr>
           <w:rStyle w:val="VerbatimChar"/>
         </w:rPr>
+        <w:t>)</w:t>
+      </w:r>
+      <w:r>
+        <w:t xml:space="preserve">, e </w:t>
+      </w:r>
+      <w:proofErr w:type="gramStart"/>
+      <w:r>
+        <w:t>a</w:t>
+      </w:r>
+      <w:proofErr w:type="gramEnd"/>
+      <w:r>
+        <w:t xml:space="preserve"> alegação de que a correção só cobria o caso concreto </w:t>
+      </w:r>
+      <w:r>
+        <w:rPr>
+          <w:rStyle w:val="VerbatimChar"/>
+        </w:rPr>
         <w:t>allowed-origins</w:t>
       </w:r>
       <w:r>
         <w:t xml:space="preserve"> estava incorreta, já que a sentinela opera por TIPO de nó, não por nome de propriedade — confirmado com teste usando </w:t>
       </w:r>
+      <w:proofErr w:type="gramStart"/>
       <w:r>
         <w:rPr>
           <w:rStyle w:val="VerbatimChar"/>
         </w:rPr>
-        <w:t>spring.kafka. bootstrap-servers</w:t>
+        <w:t>spring.kafka</w:t>
+      </w:r>
+      <w:proofErr w:type="gramEnd"/>
+      <w:r>
+        <w:rPr>
+          <w:rStyle w:val="VerbatimChar"/>
+        </w:rPr>
+        <w:t>. bootstrap-servers</w:t>
       </w:r>
       <w:r>
         <w:t xml:space="preserve"> e </w:t>
       </w:r>
+      <w:proofErr w:type="gramStart"/>
       <w:r>
         <w:rPr>
           <w:rStyle w:val="VerbatimChar"/>
         </w:rPr>
-        <w:t>management.endpoints.web.exposure.exclude</w:t>
+        <w:t>management.endpoints.web.exposure</w:t>
+      </w:r>
+      <w:proofErr w:type="gramEnd"/>
+      <w:r>
+        <w:rPr>
+          <w:rStyle w:val="VerbatimChar"/>
+        </w:rPr>
+        <w:t>.exclude</w:t>
       </w:r>
       <w:r>
         <w:t>). Mas dois pontos genuínos foram confirmados com código:</w:t>
@@ -1878,18 +2236,19 @@
           <w:color w:val="auto"/>
           <w:lang w:val="pt-BR"/>
         </w:rPr>
-        <w:t xml:space="preserve"> ConfigLoader.flatten(), branch de Map&lt;?,?&gt; — </w:t>
-      </w:r>
-      <w:r>
-        <w:rPr>
-          <w:b/>
+        <w:t xml:space="preserve"> ConfigLoader.flatten(), branch de Map</w:t>
+      </w:r>
+      <w:proofErr w:type="gramStart"/>
+      <w:r>
+        <w:rPr>
           <w:i w:val="0"/>
           <w:iCs/>
           <w:color w:val="auto"/>
           <w:lang w:val="pt-BR"/>
         </w:rPr>
-        <w:t>diferente e NÃO tocado</w:t>
-      </w:r>
+        <w:t>&lt;?,?</w:t>
+      </w:r>
+      <w:proofErr w:type="gramEnd"/>
       <w:r>
         <w:rPr>
           <w:i w:val="0"/>
@@ -1897,59 +2256,58 @@
           <w:color w:val="auto"/>
           <w:lang w:val="pt-BR"/>
         </w:rPr>
-        <w:t xml:space="preserve"> pelo branch de List&lt;?&gt; que o BL-03(a) corrigiu.</w:t>
-      </w:r>
-    </w:p>
-    <w:p>
-      <w:pPr>
-        <w:pStyle w:val="Ttulo4"/>
-        <w:rPr>
+        <w:t xml:space="preserve">&gt; — </w:t>
+      </w:r>
+      <w:r>
+        <w:rPr>
+          <w:b/>
           <w:i w:val="0"/>
           <w:iCs/>
           <w:color w:val="auto"/>
           <w:lang w:val="pt-BR"/>
         </w:rPr>
-      </w:pPr>
-      <w:r>
-        <w:rPr>
-          <w:b/>
+        <w:t>diferente e NÃO tocado</w:t>
+      </w:r>
+      <w:r>
+        <w:rPr>
           <w:i w:val="0"/>
           <w:iCs/>
           <w:color w:val="auto"/>
           <w:lang w:val="pt-BR"/>
         </w:rPr>
-        <w:t>Problema:</w:t>
-      </w:r>
-      <w:r>
+        <w:t xml:space="preserve"> pelo branch de List&lt;?&gt; que o BL-03(a) corrigiu.</w:t>
+      </w:r>
+    </w:p>
+    <w:p>
+      <w:pPr>
+        <w:pStyle w:val="Ttulo4"/>
         <w:rPr>
           <w:i w:val="0"/>
           <w:iCs/>
           <w:color w:val="auto"/>
           <w:lang w:val="pt-BR"/>
         </w:rPr>
-        <w:t xml:space="preserve"> assim como uma List vazia não gerava nenhuma chave achatada antes do BL-03(a), um Map vazio (headers: {}) também não gera — o for sobre map.entrySet() simplesmente não itera nada. Mesmo sintoma, mesma causa raiz conceitual, mas nó de tipo diferente e branch de código diferente — o BL-03(a) NÃO resolveu isso de graça.</w:t>
-      </w:r>
-    </w:p>
-    <w:p>
-      <w:pPr>
-        <w:pStyle w:val="Ttulo4"/>
-        <w:rPr>
+      </w:pPr>
+      <w:r>
+        <w:rPr>
+          <w:b/>
           <w:i w:val="0"/>
           <w:iCs/>
           <w:color w:val="auto"/>
           <w:lang w:val="pt-BR"/>
         </w:rPr>
-      </w:pPr>
-      <w:r>
-        <w:rPr>
-          <w:b/>
+        <w:t>Problema:</w:t>
+      </w:r>
+      <w:r>
+        <w:rPr>
           <w:i w:val="0"/>
           <w:iCs/>
           <w:color w:val="auto"/>
           <w:lang w:val="pt-BR"/>
         </w:rPr>
-        <w:t>Confirmado com código:</w:t>
-      </w:r>
+        <w:t xml:space="preserve"> assim como uma List vazia não gerava nenhuma chave achatada antes do BL-03(a), um Map vazio (headers: {}) também não gera — o for sobre </w:t>
+      </w:r>
+      <w:proofErr w:type="gramStart"/>
       <w:r>
         <w:rPr>
           <w:i w:val="0"/>
@@ -1957,48 +2315,49 @@
           <w:color w:val="auto"/>
           <w:lang w:val="pt-BR"/>
         </w:rPr>
-        <w:t xml:space="preserve"> sim — flatten() de {"headers": {}} devolve mapa achatado vazio.</w:t>
-      </w:r>
-    </w:p>
-    <w:p>
-      <w:pPr>
-        <w:pStyle w:val="Ttulo4"/>
+        <w:t>map.entrySet</w:t>
+      </w:r>
+      <w:proofErr w:type="gramEnd"/>
+      <w:r>
         <w:rPr>
           <w:i w:val="0"/>
           <w:iCs/>
           <w:color w:val="auto"/>
           <w:lang w:val="pt-BR"/>
         </w:rPr>
-      </w:pPr>
-      <w:r>
-        <w:rPr>
-          <w:b/>
+        <w:t>() simplesmente não itera nada. Mesmo sintoma, mesma causa raiz conceitual, mas nó de tipo diferente e branch de código diferente — o BL-03(a) NÃO resolveu isso de graça.</w:t>
+      </w:r>
+    </w:p>
+    <w:p>
+      <w:pPr>
+        <w:pStyle w:val="Ttulo4"/>
+        <w:rPr>
           <w:i w:val="0"/>
           <w:iCs/>
           <w:color w:val="auto"/>
           <w:lang w:val="pt-BR"/>
         </w:rPr>
-        <w:t>Custo de correção estimado:</w:t>
-      </w:r>
-      <w:r>
-        <w:rPr>
+      </w:pPr>
+      <w:r>
+        <w:rPr>
+          <w:b/>
           <w:i w:val="0"/>
           <w:iCs/>
           <w:color w:val="auto"/>
           <w:lang w:val="pt-BR"/>
         </w:rPr>
-        <w:t xml:space="preserve"> </w:t>
-      </w:r>
-      <w:r>
-        <w:rPr>
-          <w:b/>
+        <w:t>Confirmado com código:</w:t>
+      </w:r>
+      <w:r>
+        <w:rPr>
           <w:i w:val="0"/>
           <w:iCs/>
           <w:color w:val="auto"/>
           <w:lang w:val="pt-BR"/>
         </w:rPr>
-        <w:t>baixo-médio</w:t>
-      </w:r>
+        <w:t xml:space="preserve"> sim — </w:t>
+      </w:r>
+      <w:proofErr w:type="gramStart"/>
       <w:r>
         <w:rPr>
           <w:i w:val="0"/>
@@ -2006,7 +2365,86 @@
           <w:color w:val="auto"/>
           <w:lang w:val="pt-BR"/>
         </w:rPr>
-        <w:t>. Provavelmente a mesma técnica de sentinela do BL-03(a) resolve, adaptada pra Map vazio (ex: headers.__empty_map__ = true), com a mesma lógica de purga e remoção antes de expor a EffectiveConfig.</w:t>
+        <w:t>flatten(</w:t>
+      </w:r>
+      <w:proofErr w:type="gramEnd"/>
+      <w:r>
+        <w:rPr>
+          <w:i w:val="0"/>
+          <w:iCs/>
+          <w:color w:val="auto"/>
+          <w:lang w:val="pt-BR"/>
+        </w:rPr>
+        <w:t>) de {"headers": {}} devolve mapa achatado vazio.</w:t>
+      </w:r>
+    </w:p>
+    <w:p>
+      <w:pPr>
+        <w:pStyle w:val="Ttulo4"/>
+        <w:rPr>
+          <w:i w:val="0"/>
+          <w:iCs/>
+          <w:color w:val="auto"/>
+          <w:lang w:val="pt-BR"/>
+        </w:rPr>
+      </w:pPr>
+      <w:r>
+        <w:rPr>
+          <w:b/>
+          <w:i w:val="0"/>
+          <w:iCs/>
+          <w:color w:val="auto"/>
+          <w:lang w:val="pt-BR"/>
+        </w:rPr>
+        <w:t>Custo de correção estimado:</w:t>
+      </w:r>
+      <w:r>
+        <w:rPr>
+          <w:i w:val="0"/>
+          <w:iCs/>
+          <w:color w:val="auto"/>
+          <w:lang w:val="pt-BR"/>
+        </w:rPr>
+        <w:t xml:space="preserve"> </w:t>
+      </w:r>
+      <w:r>
+        <w:rPr>
+          <w:b/>
+          <w:i w:val="0"/>
+          <w:iCs/>
+          <w:color w:val="auto"/>
+          <w:lang w:val="pt-BR"/>
+        </w:rPr>
+        <w:t>baixo-médio</w:t>
+      </w:r>
+      <w:r>
+        <w:rPr>
+          <w:i w:val="0"/>
+          <w:iCs/>
+          <w:color w:val="auto"/>
+          <w:lang w:val="pt-BR"/>
+        </w:rPr>
+        <w:t xml:space="preserve">. Provavelmente a mesma técnica de sentinela do BL-03(a) resolve, adaptada pra Map vazio (ex: </w:t>
+      </w:r>
+      <w:proofErr w:type="gramStart"/>
+      <w:r>
+        <w:rPr>
+          <w:i w:val="0"/>
+          <w:iCs/>
+          <w:color w:val="auto"/>
+          <w:lang w:val="pt-BR"/>
+        </w:rPr>
+        <w:t>headers._</w:t>
+      </w:r>
+      <w:proofErr w:type="gramEnd"/>
+      <w:r>
+        <w:rPr>
+          <w:i w:val="0"/>
+          <w:iCs/>
+          <w:color w:val="auto"/>
+          <w:lang w:val="pt-BR"/>
+        </w:rPr>
+        <w:t>_empty_map__ = true), com a mesma lógica de purga e remoção antes de expor a EffectiveConfig.</w:t>
       </w:r>
     </w:p>
     <w:p>
@@ -2233,7 +2671,15 @@
         <w:t>Por que este é mais complexo que BL-08:</w:t>
       </w:r>
       <w:r>
-        <w:t xml:space="preserve"> ao contrário de lista/map vazio (onde a intenção é clara — “limpar o que o base tinha”), um escalar </w:t>
+        <w:t xml:space="preserve"> ao contrário de lista/map vazio (onde </w:t>
+      </w:r>
+      <w:proofErr w:type="gramStart"/>
+      <w:r>
+        <w:t>a</w:t>
+      </w:r>
+      <w:proofErr w:type="gramEnd"/>
+      <w:r>
+        <w:t xml:space="preserve"> intenção é clara — “limpar o que o base tinha”), um escalar </w:t>
       </w:r>
       <w:r>
         <w:rPr>
@@ -2364,7 +2810,25 @@
           <w:b/>
           <w:bCs/>
         </w:rPr>
-        <w:t xml:space="preserve"> BL-10 — Comportamento de `exposure.include` com `*` misturado a endpoints nomeados</w:t>
+        <w:t xml:space="preserve"> BL-10 — Comportamento de `</w:t>
+      </w:r>
+      <w:proofErr w:type="gramStart"/>
+      <w:r>
+        <w:rPr>
+          <w:rFonts w:asciiTheme="majorHAnsi" w:hAnsiTheme="majorHAnsi" w:cstheme="majorHAnsi"/>
+          <w:b/>
+          <w:bCs/>
+        </w:rPr>
+        <w:t>exposure.include</w:t>
+      </w:r>
+      <w:proofErr w:type="gramEnd"/>
+      <w:r>
+        <w:rPr>
+          <w:rFonts w:asciiTheme="majorHAnsi" w:hAnsiTheme="majorHAnsi" w:cstheme="majorHAnsi"/>
+          <w:b/>
+          <w:bCs/>
+        </w:rPr>
+        <w:t>` com `*` misturado a endpoints nomeados</w:t>
       </w:r>
     </w:p>
     <w:p>
@@ -2450,7 +2914,35 @@
         <w:rPr>
           <w:rFonts w:asciiTheme="majorHAnsi" w:hAnsiTheme="majorHAnsi" w:cstheme="majorHAnsi"/>
         </w:rPr>
-        <w:t>`management.endpoints.web.exposure.include=health,*`. Discovery page (`/actuator`) retornou</w:t>
+        <w:t>`</w:t>
+      </w:r>
+      <w:proofErr w:type="gramStart"/>
+      <w:r>
+        <w:rPr>
+          <w:rFonts w:asciiTheme="majorHAnsi" w:hAnsiTheme="majorHAnsi" w:cstheme="majorHAnsi"/>
+        </w:rPr>
+        <w:t>management.endpoints.web.exposure</w:t>
+      </w:r>
+      <w:proofErr w:type="gramEnd"/>
+      <w:r>
+        <w:rPr>
+          <w:rFonts w:asciiTheme="majorHAnsi" w:hAnsiTheme="majorHAnsi" w:cstheme="majorHAnsi"/>
+        </w:rPr>
+        <w:t>.include=</w:t>
+      </w:r>
+      <w:proofErr w:type="gramStart"/>
+      <w:r>
+        <w:rPr>
+          <w:rFonts w:asciiTheme="majorHAnsi" w:hAnsiTheme="majorHAnsi" w:cstheme="majorHAnsi"/>
+        </w:rPr>
+        <w:t>health,*</w:t>
+      </w:r>
+      <w:proofErr w:type="gramEnd"/>
+      <w:r>
+        <w:rPr>
+          <w:rFonts w:asciiTheme="majorHAnsi" w:hAnsiTheme="majorHAnsi" w:cstheme="majorHAnsi"/>
+        </w:rPr>
+        <w:t>`. Discovery page (`/actuator`) retornou</w:t>
       </w:r>
     </w:p>
     <w:p>
@@ -2504,7 +2996,43 @@
           <w:b/>
           <w:bCs/>
         </w:rPr>
-        <w:t xml:space="preserve"> BL-11 — ActuatorExposureRule ignorava management.endpoint.&lt;id&gt;.access,</w:t>
+        <w:t xml:space="preserve"> BL-11 — ActuatorExposureRule ignorava </w:t>
+      </w:r>
+      <w:proofErr w:type="gramStart"/>
+      <w:r>
+        <w:rPr>
+          <w:rFonts w:asciiTheme="majorHAnsi" w:hAnsiTheme="majorHAnsi" w:cstheme="majorHAnsi"/>
+          <w:b/>
+          <w:bCs/>
+        </w:rPr>
+        <w:t>management.endpoint</w:t>
+      </w:r>
+      <w:proofErr w:type="gramEnd"/>
+      <w:r>
+        <w:rPr>
+          <w:rFonts w:asciiTheme="majorHAnsi" w:hAnsiTheme="majorHAnsi" w:cstheme="majorHAnsi"/>
+          <w:b/>
+          <w:bCs/>
+        </w:rPr>
+        <w:t>.&lt;id</w:t>
+      </w:r>
+      <w:proofErr w:type="gramStart"/>
+      <w:r>
+        <w:rPr>
+          <w:rFonts w:asciiTheme="majorHAnsi" w:hAnsiTheme="majorHAnsi" w:cstheme="majorHAnsi"/>
+          <w:b/>
+          <w:bCs/>
+        </w:rPr>
+        <w:t>&gt;.access</w:t>
+      </w:r>
+      <w:proofErr w:type="gramEnd"/>
+      <w:r>
+        <w:rPr>
+          <w:rFonts w:asciiTheme="majorHAnsi" w:hAnsiTheme="majorHAnsi" w:cstheme="majorHAnsi"/>
+          <w:b/>
+          <w:bCs/>
+        </w:rPr>
+        <w:t>,</w:t>
       </w:r>
     </w:p>
     <w:p>
@@ -2624,21 +3152,77 @@
         <w:rPr>
           <w:rFonts w:asciiTheme="majorHAnsi" w:hAnsiTheme="majorHAnsi" w:cstheme="majorHAnsi"/>
         </w:rPr>
-        <w:t xml:space="preserve">   `management.endpoint.shutdown.access` default = `none` (desde 3.4);</w:t>
-      </w:r>
-    </w:p>
-    <w:p>
-      <w:pPr>
-        <w:spacing w:after="0"/>
-        <w:rPr>
-          <w:rFonts w:asciiTheme="majorHAnsi" w:hAnsiTheme="majorHAnsi" w:cstheme="majorHAnsi"/>
-        </w:rPr>
-      </w:pPr>
-      <w:r>
-        <w:rPr>
-          <w:rFonts w:asciiTheme="majorHAnsi" w:hAnsiTheme="majorHAnsi" w:cstheme="majorHAnsi"/>
-        </w:rPr>
-        <w:t xml:space="preserve">   `management.endpoint.heapdump.access` default = `none` a partir da 3.5 (era `unrestricted`</w:t>
+        <w:t xml:space="preserve">   `</w:t>
+      </w:r>
+      <w:proofErr w:type="gramStart"/>
+      <w:r>
+        <w:rPr>
+          <w:rFonts w:asciiTheme="majorHAnsi" w:hAnsiTheme="majorHAnsi" w:cstheme="majorHAnsi"/>
+        </w:rPr>
+        <w:t>management.endpoint</w:t>
+      </w:r>
+      <w:proofErr w:type="gramEnd"/>
+      <w:r>
+        <w:rPr>
+          <w:rFonts w:asciiTheme="majorHAnsi" w:hAnsiTheme="majorHAnsi" w:cstheme="majorHAnsi"/>
+        </w:rPr>
+        <w:t>.</w:t>
+      </w:r>
+      <w:proofErr w:type="gramStart"/>
+      <w:r>
+        <w:rPr>
+          <w:rFonts w:asciiTheme="majorHAnsi" w:hAnsiTheme="majorHAnsi" w:cstheme="majorHAnsi"/>
+        </w:rPr>
+        <w:t>shutdown.access</w:t>
+      </w:r>
+      <w:proofErr w:type="gramEnd"/>
+      <w:r>
+        <w:rPr>
+          <w:rFonts w:asciiTheme="majorHAnsi" w:hAnsiTheme="majorHAnsi" w:cstheme="majorHAnsi"/>
+        </w:rPr>
+        <w:t>` default = `none` (desde 3.4);</w:t>
+      </w:r>
+    </w:p>
+    <w:p>
+      <w:pPr>
+        <w:spacing w:after="0"/>
+        <w:rPr>
+          <w:rFonts w:asciiTheme="majorHAnsi" w:hAnsiTheme="majorHAnsi" w:cstheme="majorHAnsi"/>
+        </w:rPr>
+      </w:pPr>
+      <w:r>
+        <w:rPr>
+          <w:rFonts w:asciiTheme="majorHAnsi" w:hAnsiTheme="majorHAnsi" w:cstheme="majorHAnsi"/>
+        </w:rPr>
+        <w:t xml:space="preserve">   `</w:t>
+      </w:r>
+      <w:proofErr w:type="gramStart"/>
+      <w:r>
+        <w:rPr>
+          <w:rFonts w:asciiTheme="majorHAnsi" w:hAnsiTheme="majorHAnsi" w:cstheme="majorHAnsi"/>
+        </w:rPr>
+        <w:t>management.endpoint</w:t>
+      </w:r>
+      <w:proofErr w:type="gramEnd"/>
+      <w:r>
+        <w:rPr>
+          <w:rFonts w:asciiTheme="majorHAnsi" w:hAnsiTheme="majorHAnsi" w:cstheme="majorHAnsi"/>
+        </w:rPr>
+        <w:t>.</w:t>
+      </w:r>
+      <w:proofErr w:type="gramStart"/>
+      <w:r>
+        <w:rPr>
+          <w:rFonts w:asciiTheme="majorHAnsi" w:hAnsiTheme="majorHAnsi" w:cstheme="majorHAnsi"/>
+        </w:rPr>
+        <w:t>heapdump.access</w:t>
+      </w:r>
+      <w:proofErr w:type="gramEnd"/>
+      <w:r>
+        <w:rPr>
+          <w:rFonts w:asciiTheme="majorHAnsi" w:hAnsiTheme="majorHAnsi" w:cstheme="majorHAnsi"/>
+        </w:rPr>
+        <w:t>` default = `none` a partir da 3.5 (era `unrestricted`</w:t>
       </w:r>
     </w:p>
     <w:p>
@@ -2694,7 +3278,35 @@
         <w:rPr>
           <w:rFonts w:asciiTheme="majorHAnsi" w:hAnsiTheme="majorHAnsi" w:cstheme="majorHAnsi"/>
         </w:rPr>
-        <w:t xml:space="preserve">   config; presente após `management.endpoint.heapdump.access=unrestricted` — única variável</w:t>
+        <w:t xml:space="preserve">   config; presente após `</w:t>
+      </w:r>
+      <w:proofErr w:type="gramStart"/>
+      <w:r>
+        <w:rPr>
+          <w:rFonts w:asciiTheme="majorHAnsi" w:hAnsiTheme="majorHAnsi" w:cstheme="majorHAnsi"/>
+        </w:rPr>
+        <w:t>management.endpoint</w:t>
+      </w:r>
+      <w:proofErr w:type="gramEnd"/>
+      <w:r>
+        <w:rPr>
+          <w:rFonts w:asciiTheme="majorHAnsi" w:hAnsiTheme="majorHAnsi" w:cstheme="majorHAnsi"/>
+        </w:rPr>
+        <w:t>.</w:t>
+      </w:r>
+      <w:proofErr w:type="gramStart"/>
+      <w:r>
+        <w:rPr>
+          <w:rFonts w:asciiTheme="majorHAnsi" w:hAnsiTheme="majorHAnsi" w:cstheme="majorHAnsi"/>
+        </w:rPr>
+        <w:t>heapdump.access</w:t>
+      </w:r>
+      <w:proofErr w:type="gramEnd"/>
+      <w:r>
+        <w:rPr>
+          <w:rFonts w:asciiTheme="majorHAnsi" w:hAnsiTheme="majorHAnsi" w:cstheme="majorHAnsi"/>
+        </w:rPr>
+        <w:t>=unrestricted` — única variável</w:t>
       </w:r>
     </w:p>
     <w:p>
@@ -2730,21 +3342,77 @@
         <w:rPr>
           <w:rFonts w:asciiTheme="majorHAnsi" w:hAnsiTheme="majorHAnsi" w:cstheme="majorHAnsi"/>
         </w:rPr>
-        <w:t>Correção implementada: `ActuatorExposureRule.isRestricted()` agora reconhece</w:t>
-      </w:r>
-    </w:p>
-    <w:p>
-      <w:pPr>
-        <w:spacing w:after="0"/>
-        <w:rPr>
-          <w:rFonts w:asciiTheme="majorHAnsi" w:hAnsiTheme="majorHAnsi" w:cstheme="majorHAnsi"/>
-        </w:rPr>
-      </w:pPr>
-      <w:r>
-        <w:rPr>
-          <w:rFonts w:asciiTheme="majorHAnsi" w:hAnsiTheme="majorHAnsi" w:cstheme="majorHAnsi"/>
-        </w:rPr>
-        <w:t>`management.endpoint.&lt;id&gt;.access=none` (mecanismo atual) além de `.enabled=false` (legado),</w:t>
+        <w:t>Correção implementada: `ActuatorExposureRule.isRestricted</w:t>
+      </w:r>
+      <w:proofErr w:type="gramStart"/>
+      <w:r>
+        <w:rPr>
+          <w:rFonts w:asciiTheme="majorHAnsi" w:hAnsiTheme="majorHAnsi" w:cstheme="majorHAnsi"/>
+        </w:rPr>
+        <w:t>()`</w:t>
+      </w:r>
+      <w:proofErr w:type="gramEnd"/>
+      <w:r>
+        <w:rPr>
+          <w:rFonts w:asciiTheme="majorHAnsi" w:hAnsiTheme="majorHAnsi" w:cstheme="majorHAnsi"/>
+        </w:rPr>
+        <w:t xml:space="preserve"> agora reconhece</w:t>
+      </w:r>
+    </w:p>
+    <w:p>
+      <w:pPr>
+        <w:spacing w:after="0"/>
+        <w:rPr>
+          <w:rFonts w:asciiTheme="majorHAnsi" w:hAnsiTheme="majorHAnsi" w:cstheme="majorHAnsi"/>
+        </w:rPr>
+      </w:pPr>
+      <w:r>
+        <w:rPr>
+          <w:rFonts w:asciiTheme="majorHAnsi" w:hAnsiTheme="majorHAnsi" w:cstheme="majorHAnsi"/>
+        </w:rPr>
+        <w:t>`</w:t>
+      </w:r>
+      <w:proofErr w:type="gramStart"/>
+      <w:r>
+        <w:rPr>
+          <w:rFonts w:asciiTheme="majorHAnsi" w:hAnsiTheme="majorHAnsi" w:cstheme="majorHAnsi"/>
+        </w:rPr>
+        <w:t>management.endpoint</w:t>
+      </w:r>
+      <w:proofErr w:type="gramEnd"/>
+      <w:r>
+        <w:rPr>
+          <w:rFonts w:asciiTheme="majorHAnsi" w:hAnsiTheme="majorHAnsi" w:cstheme="majorHAnsi"/>
+        </w:rPr>
+        <w:t>.&lt;id</w:t>
+      </w:r>
+      <w:proofErr w:type="gramStart"/>
+      <w:r>
+        <w:rPr>
+          <w:rFonts w:asciiTheme="majorHAnsi" w:hAnsiTheme="majorHAnsi" w:cstheme="majorHAnsi"/>
+        </w:rPr>
+        <w:t>&gt;.access</w:t>
+      </w:r>
+      <w:proofErr w:type="gramEnd"/>
+      <w:r>
+        <w:rPr>
+          <w:rFonts w:asciiTheme="majorHAnsi" w:hAnsiTheme="majorHAnsi" w:cstheme="majorHAnsi"/>
+        </w:rPr>
+        <w:t xml:space="preserve">=none` (mecanismo atual) além de </w:t>
+      </w:r>
+      <w:proofErr w:type="gramStart"/>
+      <w:r>
+        <w:rPr>
+          <w:rFonts w:asciiTheme="majorHAnsi" w:hAnsiTheme="majorHAnsi" w:cstheme="majorHAnsi"/>
+        </w:rPr>
+        <w:t>`.enabled</w:t>
+      </w:r>
+      <w:proofErr w:type="gramEnd"/>
+      <w:r>
+        <w:rPr>
+          <w:rFonts w:asciiTheme="majorHAnsi" w:hAnsiTheme="majorHAnsi" w:cstheme="majorHAnsi"/>
+        </w:rPr>
+        <w:t>=false` (legado),</w:t>
       </w:r>
     </w:p>
     <w:p>
@@ -3203,7 +3871,23 @@
           <w:rFonts w:asciiTheme="majorHAnsi" w:hAnsiTheme="majorHAnsi" w:cstheme="majorHAnsi"/>
           <w:lang w:val="pt-BR"/>
         </w:rPr>
-        <w:t>mecanismo de detectar/receber essa informação (nem lê `pom.xml`/`build.gradle` do projeto</w:t>
+        <w:t>mecanismo de detectar/receber essa informação (nem lê `pom.xml`/`</w:t>
+      </w:r>
+      <w:proofErr w:type="gramStart"/>
+      <w:r>
+        <w:rPr>
+          <w:rFonts w:asciiTheme="majorHAnsi" w:hAnsiTheme="majorHAnsi" w:cstheme="majorHAnsi"/>
+          <w:lang w:val="pt-BR"/>
+        </w:rPr>
+        <w:t>build.gradle</w:t>
+      </w:r>
+      <w:proofErr w:type="gramEnd"/>
+      <w:r>
+        <w:rPr>
+          <w:rFonts w:asciiTheme="majorHAnsi" w:hAnsiTheme="majorHAnsi" w:cstheme="majorHAnsi"/>
+          <w:lang w:val="pt-BR"/>
+        </w:rPr>
+        <w:t>` do projeto</w:t>
       </w:r>
     </w:p>
     <w:p>
@@ -3316,7 +4000,18 @@
           <w:highlight w:val="yellow"/>
           <w:lang w:val="pt-BR"/>
         </w:rPr>
-        <w:t xml:space="preserve"> BL-13 — H2ConsoleExposedRule pode gerar falso positivo em cenários onde a propriedade não tem efeito prático</w:t>
+        <w:t xml:space="preserve"> BL-13 — H2ConsoleExposedRule pode gerar falso positivo em cenários onde a propriedade não tem efeito </w:t>
+      </w:r>
+      <w:proofErr w:type="gramStart"/>
+      <w:r>
+        <w:rPr>
+          <w:rFonts w:asciiTheme="majorHAnsi" w:hAnsiTheme="majorHAnsi" w:cstheme="majorHAnsi"/>
+          <w:b/>
+          <w:bCs/>
+          <w:highlight w:val="yellow"/>
+          <w:lang w:val="pt-BR"/>
+        </w:rPr>
+        <w:t>prático</w:t>
       </w:r>
       <w:r>
         <w:rPr>
@@ -3336,6 +4031,7 @@
         </w:rPr>
         <w:t>🟢</w:t>
       </w:r>
+      <w:proofErr w:type="gramEnd"/>
       <w:r>
         <w:rPr>
           <w:rFonts w:asciiTheme="majorHAnsi" w:hAnsiTheme="majorHAnsi" w:cstheme="majorHAnsi"/>
@@ -3389,32 +4085,64 @@
           <w:rFonts w:asciiTheme="majorHAnsi" w:hAnsiTheme="majorHAnsi" w:cstheme="majorHAnsi"/>
           <w:lang w:val="pt-BR"/>
         </w:rPr>
-        <w:t>Onde: `H2ConsoleExposedRule.check()`.</w:t>
-      </w:r>
-    </w:p>
-    <w:p>
-      <w:pPr>
-        <w:spacing w:after="0"/>
-        <w:rPr>
-          <w:rFonts w:asciiTheme="majorHAnsi" w:hAnsiTheme="majorHAnsi" w:cstheme="majorHAnsi"/>
-          <w:lang w:val="pt-BR"/>
-        </w:rPr>
-      </w:pPr>
-    </w:p>
-    <w:p>
-      <w:pPr>
-        <w:spacing w:after="0"/>
-        <w:rPr>
-          <w:rFonts w:asciiTheme="majorHAnsi" w:hAnsiTheme="majorHAnsi" w:cstheme="majorHAnsi"/>
-          <w:lang w:val="pt-BR"/>
-        </w:rPr>
-      </w:pPr>
-      <w:r>
-        <w:rPr>
-          <w:rFonts w:asciiTheme="majorHAnsi" w:hAnsiTheme="majorHAnsi" w:cstheme="majorHAnsi"/>
-          <w:lang w:val="pt-BR"/>
-        </w:rPr>
-        <w:t>Problema: a regra assume que `spring.h2.console.enabled=true` sempre resulta em exposição</w:t>
+        <w:t>Onde: `H2ConsoleExposedRule.check</w:t>
+      </w:r>
+      <w:proofErr w:type="gramStart"/>
+      <w:r>
+        <w:rPr>
+          <w:rFonts w:asciiTheme="majorHAnsi" w:hAnsiTheme="majorHAnsi" w:cstheme="majorHAnsi"/>
+          <w:lang w:val="pt-BR"/>
+        </w:rPr>
+        <w:t>()`</w:t>
+      </w:r>
+      <w:proofErr w:type="gramEnd"/>
+      <w:r>
+        <w:rPr>
+          <w:rFonts w:asciiTheme="majorHAnsi" w:hAnsiTheme="majorHAnsi" w:cstheme="majorHAnsi"/>
+          <w:lang w:val="pt-BR"/>
+        </w:rPr>
+        <w:t>.</w:t>
+      </w:r>
+    </w:p>
+    <w:p>
+      <w:pPr>
+        <w:spacing w:after="0"/>
+        <w:rPr>
+          <w:rFonts w:asciiTheme="majorHAnsi" w:hAnsiTheme="majorHAnsi" w:cstheme="majorHAnsi"/>
+          <w:lang w:val="pt-BR"/>
+        </w:rPr>
+      </w:pPr>
+    </w:p>
+    <w:p>
+      <w:pPr>
+        <w:spacing w:after="0"/>
+        <w:rPr>
+          <w:rFonts w:asciiTheme="majorHAnsi" w:hAnsiTheme="majorHAnsi" w:cstheme="majorHAnsi"/>
+          <w:lang w:val="pt-BR"/>
+        </w:rPr>
+      </w:pPr>
+      <w:r>
+        <w:rPr>
+          <w:rFonts w:asciiTheme="majorHAnsi" w:hAnsiTheme="majorHAnsi" w:cstheme="majorHAnsi"/>
+          <w:lang w:val="pt-BR"/>
+        </w:rPr>
+        <w:t>Problema: a regra assume que `spring.h</w:t>
+      </w:r>
+      <w:proofErr w:type="gramStart"/>
+      <w:r>
+        <w:rPr>
+          <w:rFonts w:asciiTheme="majorHAnsi" w:hAnsiTheme="majorHAnsi" w:cstheme="majorHAnsi"/>
+          <w:lang w:val="pt-BR"/>
+        </w:rPr>
+        <w:t>2.console</w:t>
+      </w:r>
+      <w:proofErr w:type="gramEnd"/>
+      <w:r>
+        <w:rPr>
+          <w:rFonts w:asciiTheme="majorHAnsi" w:hAnsiTheme="majorHAnsi" w:cstheme="majorHAnsi"/>
+          <w:lang w:val="pt-BR"/>
+        </w:rPr>
+        <w:t>.enabled=true` sempre resulta em exposição</w:t>
       </w:r>
       <w:r>
         <w:rPr>
@@ -3499,7 +4227,39 @@
           <w:rFonts w:asciiTheme="majorHAnsi" w:hAnsiTheme="majorHAnsi" w:cstheme="majorHAnsi"/>
           <w:lang w:val="pt-BR"/>
         </w:rPr>
-        <w:t xml:space="preserve">   (`org.springframework.boot.autoconfigure.h2`) e virou um módulo opcional separado</w:t>
+        <w:t xml:space="preserve">   (`</w:t>
+      </w:r>
+      <w:proofErr w:type="gramStart"/>
+      <w:r>
+        <w:rPr>
+          <w:rFonts w:asciiTheme="majorHAnsi" w:hAnsiTheme="majorHAnsi" w:cstheme="majorHAnsi"/>
+          <w:lang w:val="pt-BR"/>
+        </w:rPr>
+        <w:t>org.springframework</w:t>
+      </w:r>
+      <w:proofErr w:type="gramEnd"/>
+      <w:r>
+        <w:rPr>
+          <w:rFonts w:asciiTheme="majorHAnsi" w:hAnsiTheme="majorHAnsi" w:cstheme="majorHAnsi"/>
+          <w:lang w:val="pt-BR"/>
+        </w:rPr>
+        <w:t>.</w:t>
+      </w:r>
+      <w:proofErr w:type="gramStart"/>
+      <w:r>
+        <w:rPr>
+          <w:rFonts w:asciiTheme="majorHAnsi" w:hAnsiTheme="majorHAnsi" w:cstheme="majorHAnsi"/>
+          <w:lang w:val="pt-BR"/>
+        </w:rPr>
+        <w:t>boot.autoconfigure</w:t>
+      </w:r>
+      <w:proofErr w:type="gramEnd"/>
+      <w:r>
+        <w:rPr>
+          <w:rFonts w:asciiTheme="majorHAnsi" w:hAnsiTheme="majorHAnsi" w:cstheme="majorHAnsi"/>
+          <w:lang w:val="pt-BR"/>
+        </w:rPr>
+        <w:t>.h2`) e virou um módulo opcional separado</w:t>
       </w:r>
     </w:p>
     <w:p>
@@ -3516,7 +4276,39 @@
           <w:lang w:val="pt-BR"/>
         </w:rPr>
         <w:lastRenderedPageBreak/>
-        <w:t xml:space="preserve">   (`org.springframework.boot.h2console.autoconfigure`). Sem essa dependência explícita</w:t>
+        <w:t xml:space="preserve">   (`</w:t>
+      </w:r>
+      <w:proofErr w:type="gramStart"/>
+      <w:r>
+        <w:rPr>
+          <w:rFonts w:asciiTheme="majorHAnsi" w:hAnsiTheme="majorHAnsi" w:cstheme="majorHAnsi"/>
+          <w:lang w:val="pt-BR"/>
+        </w:rPr>
+        <w:t>org.springframework</w:t>
+      </w:r>
+      <w:proofErr w:type="gramEnd"/>
+      <w:r>
+        <w:rPr>
+          <w:rFonts w:asciiTheme="majorHAnsi" w:hAnsiTheme="majorHAnsi" w:cstheme="majorHAnsi"/>
+          <w:lang w:val="pt-BR"/>
+        </w:rPr>
+        <w:t>.</w:t>
+      </w:r>
+      <w:proofErr w:type="gramStart"/>
+      <w:r>
+        <w:rPr>
+          <w:rFonts w:asciiTheme="majorHAnsi" w:hAnsiTheme="majorHAnsi" w:cstheme="majorHAnsi"/>
+          <w:lang w:val="pt-BR"/>
+        </w:rPr>
+        <w:t>boot.h2console.autoconfigure</w:t>
+      </w:r>
+      <w:proofErr w:type="gramEnd"/>
+      <w:r>
+        <w:rPr>
+          <w:rFonts w:asciiTheme="majorHAnsi" w:hAnsiTheme="majorHAnsi" w:cstheme="majorHAnsi"/>
+          <w:lang w:val="pt-BR"/>
+        </w:rPr>
+        <w:t>`). Sem essa dependência explícita</w:t>
       </w:r>
     </w:p>
     <w:p>
@@ -3564,7 +4356,23 @@
           <w:rFonts w:asciiTheme="majorHAnsi" w:hAnsiTheme="majorHAnsi" w:cstheme="majorHAnsi"/>
           <w:lang w:val="pt-BR"/>
         </w:rPr>
-        <w:t xml:space="preserve">   `@ConditionalOnWebApplication(type=SERVLET)` — contrato de framework, não uma</w:t>
+        <w:t xml:space="preserve">   `@ConditionalOnWebApplication(type=</w:t>
+      </w:r>
+      <w:proofErr w:type="gramStart"/>
+      <w:r>
+        <w:rPr>
+          <w:rFonts w:asciiTheme="majorHAnsi" w:hAnsiTheme="majorHAnsi" w:cstheme="majorHAnsi"/>
+          <w:lang w:val="pt-BR"/>
+        </w:rPr>
+        <w:t>SERVLET)`</w:t>
+      </w:r>
+      <w:proofErr w:type="gramEnd"/>
+      <w:r>
+        <w:rPr>
+          <w:rFonts w:asciiTheme="majorHAnsi" w:hAnsiTheme="majorHAnsi" w:cstheme="majorHAnsi"/>
+          <w:lang w:val="pt-BR"/>
+        </w:rPr>
+        <w:t xml:space="preserve"> — contrato de framework, não uma</w:t>
       </w:r>
     </w:p>
     <w:p>
@@ -3742,7 +4550,23 @@
           <w:rFonts w:asciiTheme="majorHAnsi" w:hAnsiTheme="majorHAnsi" w:cstheme="majorHAnsi"/>
           <w:lang w:val="pt-BR"/>
         </w:rPr>
-        <w:t>lê apenas arquivos de configuração (`ConfigLoader`), nunca `pom.xml`/`build.gradle`/</w:t>
+        <w:t>lê apenas arquivos de configuração (`ConfigLoader`), nunca `pom.xml`/`</w:t>
+      </w:r>
+      <w:proofErr w:type="gramStart"/>
+      <w:r>
+        <w:rPr>
+          <w:rFonts w:asciiTheme="majorHAnsi" w:hAnsiTheme="majorHAnsi" w:cstheme="majorHAnsi"/>
+          <w:lang w:val="pt-BR"/>
+        </w:rPr>
+        <w:t>build.gradle</w:t>
+      </w:r>
+      <w:proofErr w:type="gramEnd"/>
+      <w:r>
+        <w:rPr>
+          <w:rFonts w:asciiTheme="majorHAnsi" w:hAnsiTheme="majorHAnsi" w:cstheme="majorHAnsi"/>
+          <w:lang w:val="pt-BR"/>
+        </w:rPr>
+        <w:t>`/</w:t>
       </w:r>
     </w:p>
     <w:p>
@@ -3945,267 +4769,10 @@
           <w:highlight w:val="yellow"/>
           <w:lang w:val="pt-BR"/>
         </w:rPr>
-        <w:t xml:space="preserve"> BL-14 — Main.run() não permite injetar PrintStream, testes de integração dependem de System.setOut() global</w:t>
-      </w:r>
-    </w:p>
-    <w:p>
-      <w:pPr>
-        <w:spacing w:after="0"/>
-        <w:rPr>
-          <w:rFonts w:asciiTheme="majorHAnsi" w:hAnsiTheme="majorHAnsi" w:cstheme="majorHAnsi"/>
-          <w:lang w:val="pt-BR"/>
-        </w:rPr>
-      </w:pPr>
-    </w:p>
-    <w:p>
-      <w:pPr>
-        <w:spacing w:after="0"/>
-        <w:rPr>
-          <w:rFonts w:asciiTheme="majorHAnsi" w:hAnsiTheme="majorHAnsi" w:cstheme="majorHAnsi"/>
-          <w:lang w:val="pt-BR"/>
-        </w:rPr>
-      </w:pPr>
-      <w:r>
-        <w:rPr>
-          <w:rFonts w:asciiTheme="majorHAnsi" w:hAnsiTheme="majorHAnsi" w:cstheme="majorHAnsi"/>
-          <w:lang w:val="pt-BR"/>
-        </w:rPr>
-        <w:t>Onde: `Main.run(String[])`, chamada `reporter.report(findings, System.out)`.</w:t>
-      </w:r>
-    </w:p>
-    <w:p>
-      <w:pPr>
-        <w:spacing w:after="0"/>
-        <w:rPr>
-          <w:rFonts w:asciiTheme="majorHAnsi" w:hAnsiTheme="majorHAnsi" w:cstheme="majorHAnsi"/>
-          <w:lang w:val="pt-BR"/>
-        </w:rPr>
-      </w:pPr>
-    </w:p>
-    <w:p>
-      <w:pPr>
-        <w:spacing w:after="0"/>
-        <w:rPr>
-          <w:rFonts w:asciiTheme="majorHAnsi" w:hAnsiTheme="majorHAnsi" w:cstheme="majorHAnsi"/>
-          <w:lang w:val="pt-BR"/>
-        </w:rPr>
-      </w:pPr>
-      <w:r>
-        <w:rPr>
-          <w:rFonts w:asciiTheme="majorHAnsi" w:hAnsiTheme="majorHAnsi" w:cstheme="majorHAnsi"/>
-          <w:lang w:val="pt-BR"/>
-        </w:rPr>
-        <w:t>Problema: `System.out` está hardcoded dentro do `Main`, não é injetável de fora.</w:t>
-      </w:r>
-    </w:p>
-    <w:p>
-      <w:pPr>
-        <w:spacing w:after="0"/>
-        <w:rPr>
-          <w:rFonts w:asciiTheme="majorHAnsi" w:hAnsiTheme="majorHAnsi" w:cstheme="majorHAnsi"/>
-          <w:lang w:val="pt-BR"/>
-        </w:rPr>
-      </w:pPr>
-      <w:r>
-        <w:rPr>
-          <w:rFonts w:asciiTheme="majorHAnsi" w:hAnsiTheme="majorHAnsi" w:cstheme="majorHAnsi"/>
-          <w:lang w:val="pt-BR"/>
-        </w:rPr>
-        <w:t>Testes de integração (ex: `MainSmokeTest`) precisam mexer no `System.out` global via</w:t>
-      </w:r>
-    </w:p>
-    <w:p>
-      <w:pPr>
-        <w:spacing w:after="0"/>
-        <w:rPr>
-          <w:rFonts w:asciiTheme="majorHAnsi" w:hAnsiTheme="majorHAnsi" w:cstheme="majorHAnsi"/>
-          <w:lang w:val="pt-BR"/>
-        </w:rPr>
-      </w:pPr>
-      <w:r>
-        <w:rPr>
-          <w:rFonts w:asciiTheme="majorHAnsi" w:hAnsiTheme="majorHAnsi" w:cstheme="majorHAnsi"/>
-          <w:lang w:val="pt-BR"/>
-        </w:rPr>
-        <w:t>`System.setOut(...)`/restaurar depois, em vez de passar um `PrintStream` local como já</w:t>
-      </w:r>
-    </w:p>
-    <w:p>
-      <w:pPr>
-        <w:spacing w:after="0"/>
-        <w:rPr>
-          <w:rFonts w:asciiTheme="majorHAnsi" w:hAnsiTheme="majorHAnsi" w:cstheme="majorHAnsi"/>
-          <w:lang w:val="pt-BR"/>
-        </w:rPr>
-      </w:pPr>
-      <w:r>
-        <w:rPr>
-          <w:rFonts w:asciiTheme="majorHAnsi" w:hAnsiTheme="majorHAnsi" w:cstheme="majorHAnsi"/>
-          <w:lang w:val="pt-BR"/>
-        </w:rPr>
-        <w:t>fazem os testes de `Reporter` isoladamente (`ConsoleReporterTest`, `JsonReporterTest`).</w:t>
-      </w:r>
-    </w:p>
-    <w:p>
-      <w:pPr>
-        <w:spacing w:after="0"/>
-        <w:rPr>
-          <w:rFonts w:asciiTheme="majorHAnsi" w:hAnsiTheme="majorHAnsi" w:cstheme="majorHAnsi"/>
-          <w:lang w:val="pt-BR"/>
-        </w:rPr>
-      </w:pPr>
-    </w:p>
-    <w:p>
-      <w:pPr>
-        <w:spacing w:after="0"/>
-        <w:rPr>
-          <w:rFonts w:asciiTheme="majorHAnsi" w:hAnsiTheme="majorHAnsi" w:cstheme="majorHAnsi"/>
-          <w:lang w:val="pt-BR"/>
-        </w:rPr>
-      </w:pPr>
-      <w:r>
-        <w:rPr>
-          <w:rFonts w:asciiTheme="majorHAnsi" w:hAnsiTheme="majorHAnsi" w:cstheme="majorHAnsi"/>
-          <w:lang w:val="pt-BR"/>
-        </w:rPr>
-        <w:t>Por que importa: funciona bem com testes sequenciais (padrão hoje), mas é fonte</w:t>
-      </w:r>
-    </w:p>
-    <w:p>
-      <w:pPr>
-        <w:spacing w:after="0"/>
-        <w:rPr>
-          <w:rFonts w:asciiTheme="majorHAnsi" w:hAnsiTheme="majorHAnsi" w:cstheme="majorHAnsi"/>
-          <w:lang w:val="pt-BR"/>
-        </w:rPr>
-      </w:pPr>
-      <w:r>
-        <w:rPr>
-          <w:rFonts w:asciiTheme="majorHAnsi" w:hAnsiTheme="majorHAnsi" w:cstheme="majorHAnsi"/>
-          <w:lang w:val="pt-BR"/>
-        </w:rPr>
-        <w:t>conhecida de teste flaky se algum dia os testes rodarem em paralelo.</w:t>
-      </w:r>
-    </w:p>
-    <w:p>
-      <w:pPr>
-        <w:spacing w:after="0"/>
-        <w:rPr>
-          <w:rFonts w:asciiTheme="majorHAnsi" w:hAnsiTheme="majorHAnsi" w:cstheme="majorHAnsi"/>
-          <w:lang w:val="pt-BR"/>
-        </w:rPr>
-      </w:pPr>
-    </w:p>
-    <w:p>
-      <w:pPr>
-        <w:spacing w:after="0"/>
-        <w:rPr>
-          <w:rFonts w:asciiTheme="majorHAnsi" w:hAnsiTheme="majorHAnsi" w:cstheme="majorHAnsi"/>
-          <w:lang w:val="pt-BR"/>
-        </w:rPr>
-      </w:pPr>
-      <w:r>
-        <w:rPr>
-          <w:rFonts w:asciiTheme="majorHAnsi" w:hAnsiTheme="majorHAnsi" w:cstheme="majorHAnsi"/>
-          <w:lang w:val="pt-BR"/>
-        </w:rPr>
-        <w:t>Custo de correção estimado: baixo — mudar a assinatura pra</w:t>
-      </w:r>
-    </w:p>
-    <w:p>
-      <w:pPr>
-        <w:spacing w:after="0"/>
-        <w:rPr>
-          <w:rFonts w:asciiTheme="majorHAnsi" w:hAnsiTheme="majorHAnsi" w:cstheme="majorHAnsi"/>
-          <w:lang w:val="pt-BR"/>
-        </w:rPr>
-      </w:pPr>
-      <w:r>
-        <w:rPr>
-          <w:rFonts w:asciiTheme="majorHAnsi" w:hAnsiTheme="majorHAnsi" w:cstheme="majorHAnsi"/>
-          <w:lang w:val="pt-BR"/>
-        </w:rPr>
-        <w:t>`Main.run(String[] args, PrintStream out)` (com overload/default pra `System.out` na</w:t>
-      </w:r>
-    </w:p>
-    <w:p>
-      <w:pPr>
-        <w:spacing w:after="0"/>
-        <w:rPr>
-          <w:rFonts w:asciiTheme="majorHAnsi" w:hAnsiTheme="majorHAnsi" w:cstheme="majorHAnsi"/>
-          <w:lang w:val="pt-BR"/>
-        </w:rPr>
-      </w:pPr>
-      <w:r>
-        <w:rPr>
-          <w:rFonts w:asciiTheme="majorHAnsi" w:hAnsiTheme="majorHAnsi" w:cstheme="majorHAnsi"/>
-          <w:lang w:val="pt-BR"/>
-        </w:rPr>
-        <w:t>chamada real de produção).</w:t>
-      </w:r>
-    </w:p>
-    <w:p>
-      <w:pPr>
-        <w:spacing w:after="0"/>
-        <w:rPr>
-          <w:rFonts w:asciiTheme="majorHAnsi" w:hAnsiTheme="majorHAnsi" w:cstheme="majorHAnsi"/>
-          <w:lang w:val="pt-BR"/>
-        </w:rPr>
-      </w:pPr>
-    </w:p>
-    <w:p>
-      <w:pPr>
-        <w:spacing w:after="0"/>
-        <w:rPr>
-          <w:rFonts w:asciiTheme="majorHAnsi" w:hAnsiTheme="majorHAnsi" w:cstheme="majorHAnsi"/>
-          <w:lang w:val="pt-BR"/>
-        </w:rPr>
-      </w:pPr>
-      <w:r>
-        <w:rPr>
-          <w:rFonts w:asciiTheme="majorHAnsi" w:hAnsiTheme="majorHAnsi" w:cstheme="majorHAnsi"/>
-          <w:lang w:val="pt-BR"/>
-        </w:rPr>
-        <w:t>Status: registrado, não implementado. Adiado para v1.1+ — não bloqueia nada hoje.</w:t>
-      </w:r>
-    </w:p>
-    <w:p>
-      <w:pPr>
-        <w:spacing w:after="0"/>
-        <w:rPr>
-          <w:rFonts w:asciiTheme="majorHAnsi" w:hAnsiTheme="majorHAnsi" w:cstheme="majorHAnsi"/>
-          <w:lang w:val="pt-BR"/>
-        </w:rPr>
-      </w:pPr>
-    </w:p>
-    <w:p>
-      <w:pPr>
-        <w:spacing w:after="0"/>
-        <w:rPr>
-          <w:rFonts w:asciiTheme="majorHAnsi" w:hAnsiTheme="majorHAnsi" w:cstheme="majorHAnsi"/>
-          <w:lang w:val="pt-BR"/>
-        </w:rPr>
-      </w:pPr>
-      <w:r>
-        <w:rPr>
-          <w:rFonts w:asciiTheme="majorHAnsi" w:hAnsiTheme="majorHAnsi" w:cstheme="majorHAnsi"/>
-          <w:lang w:val="pt-BR"/>
-        </w:rPr>
-        <w:t>---</w:t>
-      </w:r>
-    </w:p>
-    <w:p>
-      <w:pPr>
-        <w:spacing w:after="0"/>
-        <w:rPr>
-          <w:rFonts w:asciiTheme="majorHAnsi" w:hAnsiTheme="majorHAnsi" w:cstheme="majorHAnsi"/>
-          <w:lang w:val="pt-BR"/>
-        </w:rPr>
-      </w:pPr>
-    </w:p>
-    <w:p>
-      <w:pPr>
-        <w:spacing w:after="0"/>
+        <w:t xml:space="preserve"> BL-14 — </w:t>
+      </w:r>
+      <w:proofErr w:type="gramStart"/>
+      <w:r>
         <w:rPr>
           <w:rFonts w:asciiTheme="majorHAnsi" w:hAnsiTheme="majorHAnsi" w:cstheme="majorHAnsi"/>
           <w:b/>
@@ -4213,7 +4780,9 @@
           <w:highlight w:val="yellow"/>
           <w:lang w:val="pt-BR"/>
         </w:rPr>
-      </w:pPr>
+        <w:t>Main.run(</w:t>
+      </w:r>
+      <w:proofErr w:type="gramEnd"/>
       <w:r>
         <w:rPr>
           <w:rFonts w:asciiTheme="majorHAnsi" w:hAnsiTheme="majorHAnsi" w:cstheme="majorHAnsi"/>
@@ -4222,7 +4791,386 @@
           <w:highlight w:val="yellow"/>
           <w:lang w:val="pt-BR"/>
         </w:rPr>
-        <w:t xml:space="preserve"> BL-15 — ConfigLoader.loadDirectory() não agrupa arquivos por convenção de nome (application.yml + application-{profile}.yml), quebrando a premissa central de "config efetiva"</w:t>
+        <w:t>) não permite injetar PrintStream, testes de integração dependem de System.setOut() global</w:t>
+      </w:r>
+    </w:p>
+    <w:p>
+      <w:pPr>
+        <w:spacing w:after="0"/>
+        <w:rPr>
+          <w:rFonts w:asciiTheme="majorHAnsi" w:hAnsiTheme="majorHAnsi" w:cstheme="majorHAnsi"/>
+          <w:lang w:val="pt-BR"/>
+        </w:rPr>
+      </w:pPr>
+    </w:p>
+    <w:p>
+      <w:pPr>
+        <w:spacing w:after="0"/>
+        <w:rPr>
+          <w:rFonts w:asciiTheme="majorHAnsi" w:hAnsiTheme="majorHAnsi" w:cstheme="majorHAnsi"/>
+          <w:lang w:val="pt-BR"/>
+        </w:rPr>
+      </w:pPr>
+      <w:r>
+        <w:rPr>
+          <w:rFonts w:asciiTheme="majorHAnsi" w:hAnsiTheme="majorHAnsi" w:cstheme="majorHAnsi"/>
+          <w:lang w:val="pt-BR"/>
+        </w:rPr>
+        <w:t>Onde: `</w:t>
+      </w:r>
+      <w:proofErr w:type="gramStart"/>
+      <w:r>
+        <w:rPr>
+          <w:rFonts w:asciiTheme="majorHAnsi" w:hAnsiTheme="majorHAnsi" w:cstheme="majorHAnsi"/>
+          <w:lang w:val="pt-BR"/>
+        </w:rPr>
+        <w:t>Main.run(String[])`</w:t>
+      </w:r>
+      <w:proofErr w:type="gramEnd"/>
+      <w:r>
+        <w:rPr>
+          <w:rFonts w:asciiTheme="majorHAnsi" w:hAnsiTheme="majorHAnsi" w:cstheme="majorHAnsi"/>
+          <w:lang w:val="pt-BR"/>
+        </w:rPr>
+        <w:t>, chamada `</w:t>
+      </w:r>
+      <w:proofErr w:type="gramStart"/>
+      <w:r>
+        <w:rPr>
+          <w:rFonts w:asciiTheme="majorHAnsi" w:hAnsiTheme="majorHAnsi" w:cstheme="majorHAnsi"/>
+          <w:lang w:val="pt-BR"/>
+        </w:rPr>
+        <w:t>reporter.report</w:t>
+      </w:r>
+      <w:proofErr w:type="gramEnd"/>
+      <w:r>
+        <w:rPr>
+          <w:rFonts w:asciiTheme="majorHAnsi" w:hAnsiTheme="majorHAnsi" w:cstheme="majorHAnsi"/>
+          <w:lang w:val="pt-BR"/>
+        </w:rPr>
+        <w:t xml:space="preserve">(findings, </w:t>
+      </w:r>
+      <w:proofErr w:type="gramStart"/>
+      <w:r>
+        <w:rPr>
+          <w:rFonts w:asciiTheme="majorHAnsi" w:hAnsiTheme="majorHAnsi" w:cstheme="majorHAnsi"/>
+          <w:lang w:val="pt-BR"/>
+        </w:rPr>
+        <w:t>System.out)`</w:t>
+      </w:r>
+      <w:proofErr w:type="gramEnd"/>
+      <w:r>
+        <w:rPr>
+          <w:rFonts w:asciiTheme="majorHAnsi" w:hAnsiTheme="majorHAnsi" w:cstheme="majorHAnsi"/>
+          <w:lang w:val="pt-BR"/>
+        </w:rPr>
+        <w:t>.</w:t>
+      </w:r>
+    </w:p>
+    <w:p>
+      <w:pPr>
+        <w:spacing w:after="0"/>
+        <w:rPr>
+          <w:rFonts w:asciiTheme="majorHAnsi" w:hAnsiTheme="majorHAnsi" w:cstheme="majorHAnsi"/>
+          <w:lang w:val="pt-BR"/>
+        </w:rPr>
+      </w:pPr>
+    </w:p>
+    <w:p>
+      <w:pPr>
+        <w:spacing w:after="0"/>
+        <w:rPr>
+          <w:rFonts w:asciiTheme="majorHAnsi" w:hAnsiTheme="majorHAnsi" w:cstheme="majorHAnsi"/>
+          <w:lang w:val="pt-BR"/>
+        </w:rPr>
+      </w:pPr>
+      <w:r>
+        <w:rPr>
+          <w:rFonts w:asciiTheme="majorHAnsi" w:hAnsiTheme="majorHAnsi" w:cstheme="majorHAnsi"/>
+          <w:lang w:val="pt-BR"/>
+        </w:rPr>
+        <w:t>Problema: `System.out` está hardcoded dentro do `Main`, não é injetável de fora.</w:t>
+      </w:r>
+    </w:p>
+    <w:p>
+      <w:pPr>
+        <w:spacing w:after="0"/>
+        <w:rPr>
+          <w:rFonts w:asciiTheme="majorHAnsi" w:hAnsiTheme="majorHAnsi" w:cstheme="majorHAnsi"/>
+          <w:lang w:val="pt-BR"/>
+        </w:rPr>
+      </w:pPr>
+      <w:r>
+        <w:rPr>
+          <w:rFonts w:asciiTheme="majorHAnsi" w:hAnsiTheme="majorHAnsi" w:cstheme="majorHAnsi"/>
+          <w:lang w:val="pt-BR"/>
+        </w:rPr>
+        <w:t>Testes de integração (ex: `MainSmokeTest`) precisam mexer no `System.out` global via</w:t>
+      </w:r>
+    </w:p>
+    <w:p>
+      <w:pPr>
+        <w:spacing w:after="0"/>
+        <w:rPr>
+          <w:rFonts w:asciiTheme="majorHAnsi" w:hAnsiTheme="majorHAnsi" w:cstheme="majorHAnsi"/>
+          <w:lang w:val="pt-BR"/>
+        </w:rPr>
+      </w:pPr>
+      <w:r>
+        <w:rPr>
+          <w:rFonts w:asciiTheme="majorHAnsi" w:hAnsiTheme="majorHAnsi" w:cstheme="majorHAnsi"/>
+          <w:lang w:val="pt-BR"/>
+        </w:rPr>
+        <w:t>`System.setOut(...)`/restaurar depois, em vez de passar um `PrintStream` local como já</w:t>
+      </w:r>
+    </w:p>
+    <w:p>
+      <w:pPr>
+        <w:spacing w:after="0"/>
+        <w:rPr>
+          <w:rFonts w:asciiTheme="majorHAnsi" w:hAnsiTheme="majorHAnsi" w:cstheme="majorHAnsi"/>
+          <w:lang w:val="pt-BR"/>
+        </w:rPr>
+      </w:pPr>
+      <w:r>
+        <w:rPr>
+          <w:rFonts w:asciiTheme="majorHAnsi" w:hAnsiTheme="majorHAnsi" w:cstheme="majorHAnsi"/>
+          <w:lang w:val="pt-BR"/>
+        </w:rPr>
+        <w:t>fazem os testes de `Reporter` isoladamente (`ConsoleReporterTest`, `JsonReporterTest`).</w:t>
+      </w:r>
+    </w:p>
+    <w:p>
+      <w:pPr>
+        <w:spacing w:after="0"/>
+        <w:rPr>
+          <w:rFonts w:asciiTheme="majorHAnsi" w:hAnsiTheme="majorHAnsi" w:cstheme="majorHAnsi"/>
+          <w:lang w:val="pt-BR"/>
+        </w:rPr>
+      </w:pPr>
+    </w:p>
+    <w:p>
+      <w:pPr>
+        <w:spacing w:after="0"/>
+        <w:rPr>
+          <w:rFonts w:asciiTheme="majorHAnsi" w:hAnsiTheme="majorHAnsi" w:cstheme="majorHAnsi"/>
+          <w:lang w:val="pt-BR"/>
+        </w:rPr>
+      </w:pPr>
+      <w:r>
+        <w:rPr>
+          <w:rFonts w:asciiTheme="majorHAnsi" w:hAnsiTheme="majorHAnsi" w:cstheme="majorHAnsi"/>
+          <w:lang w:val="pt-BR"/>
+        </w:rPr>
+        <w:t>Por que importa: funciona bem com testes sequenciais (padrão hoje), mas é fonte</w:t>
+      </w:r>
+    </w:p>
+    <w:p>
+      <w:pPr>
+        <w:spacing w:after="0"/>
+        <w:rPr>
+          <w:rFonts w:asciiTheme="majorHAnsi" w:hAnsiTheme="majorHAnsi" w:cstheme="majorHAnsi"/>
+          <w:lang w:val="pt-BR"/>
+        </w:rPr>
+      </w:pPr>
+      <w:r>
+        <w:rPr>
+          <w:rFonts w:asciiTheme="majorHAnsi" w:hAnsiTheme="majorHAnsi" w:cstheme="majorHAnsi"/>
+          <w:lang w:val="pt-BR"/>
+        </w:rPr>
+        <w:t>conhecida de teste flaky se algum dia os testes rodarem em paralelo.</w:t>
+      </w:r>
+    </w:p>
+    <w:p>
+      <w:pPr>
+        <w:spacing w:after="0"/>
+        <w:rPr>
+          <w:rFonts w:asciiTheme="majorHAnsi" w:hAnsiTheme="majorHAnsi" w:cstheme="majorHAnsi"/>
+          <w:lang w:val="pt-BR"/>
+        </w:rPr>
+      </w:pPr>
+    </w:p>
+    <w:p>
+      <w:pPr>
+        <w:spacing w:after="0"/>
+        <w:rPr>
+          <w:rFonts w:asciiTheme="majorHAnsi" w:hAnsiTheme="majorHAnsi" w:cstheme="majorHAnsi"/>
+          <w:lang w:val="pt-BR"/>
+        </w:rPr>
+      </w:pPr>
+      <w:r>
+        <w:rPr>
+          <w:rFonts w:asciiTheme="majorHAnsi" w:hAnsiTheme="majorHAnsi" w:cstheme="majorHAnsi"/>
+          <w:lang w:val="pt-BR"/>
+        </w:rPr>
+        <w:t>Custo de correção estimado: baixo — mudar a assinatura pra</w:t>
+      </w:r>
+    </w:p>
+    <w:p>
+      <w:pPr>
+        <w:spacing w:after="0"/>
+        <w:rPr>
+          <w:rFonts w:asciiTheme="majorHAnsi" w:hAnsiTheme="majorHAnsi" w:cstheme="majorHAnsi"/>
+          <w:lang w:val="pt-BR"/>
+        </w:rPr>
+      </w:pPr>
+      <w:r>
+        <w:rPr>
+          <w:rFonts w:asciiTheme="majorHAnsi" w:hAnsiTheme="majorHAnsi" w:cstheme="majorHAnsi"/>
+          <w:lang w:val="pt-BR"/>
+        </w:rPr>
+        <w:t>`</w:t>
+      </w:r>
+      <w:proofErr w:type="gramStart"/>
+      <w:r>
+        <w:rPr>
+          <w:rFonts w:asciiTheme="majorHAnsi" w:hAnsiTheme="majorHAnsi" w:cstheme="majorHAnsi"/>
+          <w:lang w:val="pt-BR"/>
+        </w:rPr>
+        <w:t>Main.run(String[</w:t>
+      </w:r>
+      <w:proofErr w:type="gramEnd"/>
+      <w:r>
+        <w:rPr>
+          <w:rFonts w:asciiTheme="majorHAnsi" w:hAnsiTheme="majorHAnsi" w:cstheme="majorHAnsi"/>
+          <w:lang w:val="pt-BR"/>
+        </w:rPr>
+        <w:t xml:space="preserve">] args, PrintStream </w:t>
+      </w:r>
+      <w:proofErr w:type="gramStart"/>
+      <w:r>
+        <w:rPr>
+          <w:rFonts w:asciiTheme="majorHAnsi" w:hAnsiTheme="majorHAnsi" w:cstheme="majorHAnsi"/>
+          <w:lang w:val="pt-BR"/>
+        </w:rPr>
+        <w:t>out)`</w:t>
+      </w:r>
+      <w:proofErr w:type="gramEnd"/>
+      <w:r>
+        <w:rPr>
+          <w:rFonts w:asciiTheme="majorHAnsi" w:hAnsiTheme="majorHAnsi" w:cstheme="majorHAnsi"/>
+          <w:lang w:val="pt-BR"/>
+        </w:rPr>
+        <w:t xml:space="preserve"> (com overload/default pra `System.out` na</w:t>
+      </w:r>
+    </w:p>
+    <w:p>
+      <w:pPr>
+        <w:spacing w:after="0"/>
+        <w:rPr>
+          <w:rFonts w:asciiTheme="majorHAnsi" w:hAnsiTheme="majorHAnsi" w:cstheme="majorHAnsi"/>
+          <w:lang w:val="pt-BR"/>
+        </w:rPr>
+      </w:pPr>
+      <w:r>
+        <w:rPr>
+          <w:rFonts w:asciiTheme="majorHAnsi" w:hAnsiTheme="majorHAnsi" w:cstheme="majorHAnsi"/>
+          <w:lang w:val="pt-BR"/>
+        </w:rPr>
+        <w:t>chamada real de produção).</w:t>
+      </w:r>
+    </w:p>
+    <w:p>
+      <w:pPr>
+        <w:spacing w:after="0"/>
+        <w:rPr>
+          <w:rFonts w:asciiTheme="majorHAnsi" w:hAnsiTheme="majorHAnsi" w:cstheme="majorHAnsi"/>
+          <w:lang w:val="pt-BR"/>
+        </w:rPr>
+      </w:pPr>
+    </w:p>
+    <w:p>
+      <w:pPr>
+        <w:spacing w:after="0"/>
+        <w:rPr>
+          <w:rFonts w:asciiTheme="majorHAnsi" w:hAnsiTheme="majorHAnsi" w:cstheme="majorHAnsi"/>
+          <w:lang w:val="pt-BR"/>
+        </w:rPr>
+      </w:pPr>
+      <w:r>
+        <w:rPr>
+          <w:rFonts w:asciiTheme="majorHAnsi" w:hAnsiTheme="majorHAnsi" w:cstheme="majorHAnsi"/>
+          <w:lang w:val="pt-BR"/>
+        </w:rPr>
+        <w:t>Status: registrado, não implementado. Adiado para v1.1+ — não bloqueia nada hoje.</w:t>
+      </w:r>
+    </w:p>
+    <w:p>
+      <w:pPr>
+        <w:spacing w:after="0"/>
+        <w:rPr>
+          <w:rFonts w:asciiTheme="majorHAnsi" w:hAnsiTheme="majorHAnsi" w:cstheme="majorHAnsi"/>
+          <w:lang w:val="pt-BR"/>
+        </w:rPr>
+      </w:pPr>
+    </w:p>
+    <w:p>
+      <w:pPr>
+        <w:spacing w:after="0"/>
+        <w:rPr>
+          <w:rFonts w:asciiTheme="majorHAnsi" w:hAnsiTheme="majorHAnsi" w:cstheme="majorHAnsi"/>
+          <w:lang w:val="pt-BR"/>
+        </w:rPr>
+      </w:pPr>
+      <w:r>
+        <w:rPr>
+          <w:rFonts w:asciiTheme="majorHAnsi" w:hAnsiTheme="majorHAnsi" w:cstheme="majorHAnsi"/>
+          <w:lang w:val="pt-BR"/>
+        </w:rPr>
+        <w:t>---</w:t>
+      </w:r>
+    </w:p>
+    <w:p>
+      <w:pPr>
+        <w:spacing w:after="0"/>
+        <w:rPr>
+          <w:rFonts w:asciiTheme="majorHAnsi" w:hAnsiTheme="majorHAnsi" w:cstheme="majorHAnsi"/>
+          <w:lang w:val="pt-BR"/>
+        </w:rPr>
+      </w:pPr>
+    </w:p>
+    <w:p>
+      <w:pPr>
+        <w:spacing w:after="0"/>
+        <w:rPr>
+          <w:rFonts w:asciiTheme="majorHAnsi" w:hAnsiTheme="majorHAnsi" w:cstheme="majorHAnsi"/>
+          <w:b/>
+          <w:bCs/>
+          <w:highlight w:val="yellow"/>
+          <w:lang w:val="pt-BR"/>
+        </w:rPr>
+      </w:pPr>
+      <w:r>
+        <w:rPr>
+          <w:rFonts w:asciiTheme="majorHAnsi" w:hAnsiTheme="majorHAnsi" w:cstheme="majorHAnsi"/>
+          <w:b/>
+          <w:bCs/>
+          <w:highlight w:val="yellow"/>
+          <w:lang w:val="pt-BR"/>
+        </w:rPr>
+        <w:t xml:space="preserve"> BL-15 — ConfigLoader.loadDirectory() não agrupa arquivos por convenção de nome (application.yml + application-{profile</w:t>
+      </w:r>
+      <w:proofErr w:type="gramStart"/>
+      <w:r>
+        <w:rPr>
+          <w:rFonts w:asciiTheme="majorHAnsi" w:hAnsiTheme="majorHAnsi" w:cstheme="majorHAnsi"/>
+          <w:b/>
+          <w:bCs/>
+          <w:highlight w:val="yellow"/>
+          <w:lang w:val="pt-BR"/>
+        </w:rPr>
+        <w:t>}.yml</w:t>
+      </w:r>
+      <w:proofErr w:type="gramEnd"/>
+      <w:r>
+        <w:rPr>
+          <w:rFonts w:asciiTheme="majorHAnsi" w:hAnsiTheme="majorHAnsi" w:cstheme="majorHAnsi"/>
+          <w:b/>
+          <w:bCs/>
+          <w:highlight w:val="yellow"/>
+          <w:lang w:val="pt-BR"/>
+        </w:rPr>
+        <w:t>), quebrando a premissa central de "config efetiva"</w:t>
       </w:r>
     </w:p>
     <w:p>
@@ -4302,7 +5250,23 @@
           <w:rFonts w:asciiTheme="majorHAnsi" w:hAnsiTheme="majorHAnsi" w:cstheme="majorHAnsi"/>
           <w:lang w:val="pt-BR"/>
         </w:rPr>
-        <w:t>Onde: `ConfigLoader.loadDirectory()`.</w:t>
+        <w:t>Onde: `ConfigLoader.loadDirectory</w:t>
+      </w:r>
+      <w:proofErr w:type="gramStart"/>
+      <w:r>
+        <w:rPr>
+          <w:rFonts w:asciiTheme="majorHAnsi" w:hAnsiTheme="majorHAnsi" w:cstheme="majorHAnsi"/>
+          <w:lang w:val="pt-BR"/>
+        </w:rPr>
+        <w:t>()`</w:t>
+      </w:r>
+      <w:proofErr w:type="gramEnd"/>
+      <w:r>
+        <w:rPr>
+          <w:rFonts w:asciiTheme="majorHAnsi" w:hAnsiTheme="majorHAnsi" w:cstheme="majorHAnsi"/>
+          <w:lang w:val="pt-BR"/>
+        </w:rPr>
+        <w:t>.</w:t>
       </w:r>
     </w:p>
     <w:p>
@@ -4375,7 +5339,23 @@
           <w:rFonts w:asciiTheme="majorHAnsi" w:hAnsiTheme="majorHAnsi" w:cstheme="majorHAnsi"/>
           <w:lang w:val="pt-BR"/>
         </w:rPr>
-        <w:t>`application-{profile}.yml` (overlay), que o Spring Boot funde em runtime, são tratados</w:t>
+        <w:t>`application-{profile</w:t>
+      </w:r>
+      <w:proofErr w:type="gramStart"/>
+      <w:r>
+        <w:rPr>
+          <w:rFonts w:asciiTheme="majorHAnsi" w:hAnsiTheme="majorHAnsi" w:cstheme="majorHAnsi"/>
+          <w:lang w:val="pt-BR"/>
+        </w:rPr>
+        <w:t>}.yml</w:t>
+      </w:r>
+      <w:proofErr w:type="gramEnd"/>
+      <w:r>
+        <w:rPr>
+          <w:rFonts w:asciiTheme="majorHAnsi" w:hAnsiTheme="majorHAnsi" w:cstheme="majorHAnsi"/>
+          <w:lang w:val="pt-BR"/>
+        </w:rPr>
+        <w:t>` (overlay), que o Spring Boot funde em runtime, são tratados</w:t>
       </w:r>
     </w:p>
     <w:p>
@@ -4506,7 +5486,23 @@
           <w:lang w:val="pt-BR"/>
         </w:rPr>
         <w:lastRenderedPageBreak/>
-        <w:t>Confirmado com código: sim — `loadDirectory()` lido linha a linha, sem lógica de</w:t>
+        <w:t>Confirmado com código: sim — `</w:t>
+      </w:r>
+      <w:proofErr w:type="gramStart"/>
+      <w:r>
+        <w:rPr>
+          <w:rFonts w:asciiTheme="majorHAnsi" w:hAnsiTheme="majorHAnsi" w:cstheme="majorHAnsi"/>
+          <w:lang w:val="pt-BR"/>
+        </w:rPr>
+        <w:t>loadDirectory(</w:t>
+      </w:r>
+      <w:proofErr w:type="gramEnd"/>
+      <w:r>
+        <w:rPr>
+          <w:rFonts w:asciiTheme="majorHAnsi" w:hAnsiTheme="majorHAnsi" w:cstheme="majorHAnsi"/>
+          <w:lang w:val="pt-BR"/>
+        </w:rPr>
+        <w:t>)` lido linha a linha, sem lógica de</w:t>
       </w:r>
     </w:p>
     <w:p>
@@ -4961,7 +5957,39 @@
           <w:rFonts w:asciiTheme="majorHAnsi" w:hAnsiTheme="majorHAnsi" w:cstheme="majorHAnsi"/>
           <w:lang w:val="pt-BR"/>
         </w:rPr>
-        <w:t>BL-17 — mesmo arquivo (`.spring-config-guard.yml` ou nome a definir), evitando duas</w:t>
+        <w:t xml:space="preserve">BL-17 — </w:t>
+      </w:r>
+      <w:proofErr w:type="gramStart"/>
+      <w:r>
+        <w:rPr>
+          <w:rFonts w:asciiTheme="majorHAnsi" w:hAnsiTheme="majorHAnsi" w:cstheme="majorHAnsi"/>
+          <w:lang w:val="pt-BR"/>
+        </w:rPr>
+        <w:t>mesmo</w:t>
+      </w:r>
+      <w:proofErr w:type="gramEnd"/>
+      <w:r>
+        <w:rPr>
+          <w:rFonts w:asciiTheme="majorHAnsi" w:hAnsiTheme="majorHAnsi" w:cstheme="majorHAnsi"/>
+          <w:lang w:val="pt-BR"/>
+        </w:rPr>
+        <w:t xml:space="preserve"> arquivo (</w:t>
+      </w:r>
+      <w:proofErr w:type="gramStart"/>
+      <w:r>
+        <w:rPr>
+          <w:rFonts w:asciiTheme="majorHAnsi" w:hAnsiTheme="majorHAnsi" w:cstheme="majorHAnsi"/>
+          <w:lang w:val="pt-BR"/>
+        </w:rPr>
+        <w:t>`.spring-config-guard.yml</w:t>
+      </w:r>
+      <w:proofErr w:type="gramEnd"/>
+      <w:r>
+        <w:rPr>
+          <w:rFonts w:asciiTheme="majorHAnsi" w:hAnsiTheme="majorHAnsi" w:cstheme="majorHAnsi"/>
+          <w:lang w:val="pt-BR"/>
+        </w:rPr>
+        <w:t>` ou nome a definir), evitando duas</w:t>
       </w:r>
     </w:p>
     <w:p>
@@ -5073,7 +6101,23 @@
           <w:rFonts w:asciiTheme="majorHAnsi" w:hAnsiTheme="majorHAnsi" w:cstheme="majorHAnsi"/>
           <w:lang w:val="pt-BR"/>
         </w:rPr>
-        <w:t>Onde: `ConfigLoader.loadDirectory()` — complementa a correção do BL-15.</w:t>
+        <w:t>Onde: `ConfigLoader.loadDirectory</w:t>
+      </w:r>
+      <w:proofErr w:type="gramStart"/>
+      <w:r>
+        <w:rPr>
+          <w:rFonts w:asciiTheme="majorHAnsi" w:hAnsiTheme="majorHAnsi" w:cstheme="majorHAnsi"/>
+          <w:lang w:val="pt-BR"/>
+        </w:rPr>
+        <w:t>()`</w:t>
+      </w:r>
+      <w:proofErr w:type="gramEnd"/>
+      <w:r>
+        <w:rPr>
+          <w:rFonts w:asciiTheme="majorHAnsi" w:hAnsiTheme="majorHAnsi" w:cstheme="majorHAnsi"/>
+          <w:lang w:val="pt-BR"/>
+        </w:rPr>
+        <w:t xml:space="preserve"> — complementa a correção do BL-15.</w:t>
       </w:r>
     </w:p>
     <w:p>
@@ -5172,7 +6216,23 @@
           <w:rFonts w:asciiTheme="majorHAnsi" w:hAnsiTheme="majorHAnsi" w:cstheme="majorHAnsi"/>
           <w:lang w:val="pt-BR"/>
         </w:rPr>
-        <w:t>Por que foi adiado: heurística automática pra esses casos ambíguos tem risco real</w:t>
+        <w:t xml:space="preserve">Por que foi adiado: heurística automática pra </w:t>
+      </w:r>
+      <w:proofErr w:type="gramStart"/>
+      <w:r>
+        <w:rPr>
+          <w:rFonts w:asciiTheme="majorHAnsi" w:hAnsiTheme="majorHAnsi" w:cstheme="majorHAnsi"/>
+          <w:lang w:val="pt-BR"/>
+        </w:rPr>
+        <w:t>esses casos ambíguos tem</w:t>
+      </w:r>
+      <w:proofErr w:type="gramEnd"/>
+      <w:r>
+        <w:rPr>
+          <w:rFonts w:asciiTheme="majorHAnsi" w:hAnsiTheme="majorHAnsi" w:cstheme="majorHAnsi"/>
+          <w:lang w:val="pt-BR"/>
+        </w:rPr>
+        <w:t xml:space="preserve"> risco real</w:t>
       </w:r>
     </w:p>
     <w:p>
@@ -5277,7 +6337,23 @@
           <w:rFonts w:asciiTheme="majorHAnsi" w:hAnsiTheme="majorHAnsi" w:cstheme="majorHAnsi"/>
           <w:lang w:val="pt-BR"/>
         </w:rPr>
-        <w:t>Confirmado com código: sim, indiretamente — `loadDirectory()` hoje não tem noção de</w:t>
+        <w:t>Confirmado com código: sim, indiretamente — `</w:t>
+      </w:r>
+      <w:proofErr w:type="gramStart"/>
+      <w:r>
+        <w:rPr>
+          <w:rFonts w:asciiTheme="majorHAnsi" w:hAnsiTheme="majorHAnsi" w:cstheme="majorHAnsi"/>
+          <w:lang w:val="pt-BR"/>
+        </w:rPr>
+        <w:t>loadDirectory(</w:t>
+      </w:r>
+      <w:proofErr w:type="gramEnd"/>
+      <w:r>
+        <w:rPr>
+          <w:rFonts w:asciiTheme="majorHAnsi" w:hAnsiTheme="majorHAnsi" w:cstheme="majorHAnsi"/>
+          <w:lang w:val="pt-BR"/>
+        </w:rPr>
+        <w:t>)` hoje não tem noção de</w:t>
       </w:r>
     </w:p>
     <w:p>
@@ -5448,7 +6524,23 @@
           <w:rFonts w:asciiTheme="majorHAnsi" w:hAnsiTheme="majorHAnsi" w:cstheme="majorHAnsi"/>
           <w:lang w:val="pt-BR"/>
         </w:rPr>
-        <w:t>Onde: `ActuatorExposureRule.check()`.</w:t>
+        <w:t>Onde: `ActuatorExposureRule.check</w:t>
+      </w:r>
+      <w:proofErr w:type="gramStart"/>
+      <w:r>
+        <w:rPr>
+          <w:rFonts w:asciiTheme="majorHAnsi" w:hAnsiTheme="majorHAnsi" w:cstheme="majorHAnsi"/>
+          <w:lang w:val="pt-BR"/>
+        </w:rPr>
+        <w:t>()`</w:t>
+      </w:r>
+      <w:proofErr w:type="gramEnd"/>
+      <w:r>
+        <w:rPr>
+          <w:rFonts w:asciiTheme="majorHAnsi" w:hAnsiTheme="majorHAnsi" w:cstheme="majorHAnsi"/>
+          <w:lang w:val="pt-BR"/>
+        </w:rPr>
+        <w:t>.</w:t>
       </w:r>
     </w:p>
     <w:p>
@@ -5489,7 +6581,23 @@
           <w:rFonts w:asciiTheme="majorHAnsi" w:hAnsiTheme="majorHAnsi" w:cstheme="majorHAnsi"/>
           <w:lang w:val="pt-BR"/>
         </w:rPr>
-        <w:t>YAML, `.properties`, herança e sobrescrita entre base e overlay), o teste revelou que</w:t>
+        <w:t xml:space="preserve">YAML, </w:t>
+      </w:r>
+      <w:proofErr w:type="gramStart"/>
+      <w:r>
+        <w:rPr>
+          <w:rFonts w:asciiTheme="majorHAnsi" w:hAnsiTheme="majorHAnsi" w:cstheme="majorHAnsi"/>
+          <w:lang w:val="pt-BR"/>
+        </w:rPr>
+        <w:t>`.properties</w:t>
+      </w:r>
+      <w:proofErr w:type="gramEnd"/>
+      <w:r>
+        <w:rPr>
+          <w:rFonts w:asciiTheme="majorHAnsi" w:hAnsiTheme="majorHAnsi" w:cstheme="majorHAnsi"/>
+          <w:lang w:val="pt-BR"/>
+        </w:rPr>
+        <w:t>`, herança e sobrescrita entre base e overlay), o teste revelou que</w:t>
       </w:r>
     </w:p>
     <w:p>
@@ -5521,7 +6629,23 @@
           <w:rFonts w:asciiTheme="majorHAnsi" w:hAnsiTheme="majorHAnsi" w:cstheme="majorHAnsi"/>
           <w:lang w:val="pt-BR"/>
         </w:rPr>
-        <w:t>`exposure.include=*` sem redefinir — incluindo profiles normalmente considerados seguros</w:t>
+        <w:t>`</w:t>
+      </w:r>
+      <w:proofErr w:type="gramStart"/>
+      <w:r>
+        <w:rPr>
+          <w:rFonts w:asciiTheme="majorHAnsi" w:hAnsiTheme="majorHAnsi" w:cstheme="majorHAnsi"/>
+          <w:lang w:val="pt-BR"/>
+        </w:rPr>
+        <w:t>exposure.include</w:t>
+      </w:r>
+      <w:proofErr w:type="gramEnd"/>
+      <w:r>
+        <w:rPr>
+          <w:rFonts w:asciiTheme="majorHAnsi" w:hAnsiTheme="majorHAnsi" w:cstheme="majorHAnsi"/>
+          <w:lang w:val="pt-BR"/>
+        </w:rPr>
+        <w:t>=*` sem redefinir — incluindo profiles normalmente considerados seguros</w:t>
       </w:r>
     </w:p>
     <w:p>
@@ -5821,7 +6945,23 @@
           <w:rFonts w:asciiTheme="majorHAnsi" w:hAnsiTheme="majorHAnsi" w:cstheme="majorHAnsi"/>
           <w:lang w:val="pt-BR"/>
         </w:rPr>
-        <w:t>YAML com profile `dev`, arquivo `.properties` com profile `qa`, e `application-prod.yml`</w:t>
+        <w:t xml:space="preserve">YAML com profile `dev`, arquivo </w:t>
+      </w:r>
+      <w:proofErr w:type="gramStart"/>
+      <w:r>
+        <w:rPr>
+          <w:rFonts w:asciiTheme="majorHAnsi" w:hAnsiTheme="majorHAnsi" w:cstheme="majorHAnsi"/>
+          <w:lang w:val="pt-BR"/>
+        </w:rPr>
+        <w:t>`.properties</w:t>
+      </w:r>
+      <w:proofErr w:type="gramEnd"/>
+      <w:r>
+        <w:rPr>
+          <w:rFonts w:asciiTheme="majorHAnsi" w:hAnsiTheme="majorHAnsi" w:cstheme="majorHAnsi"/>
+          <w:lang w:val="pt-BR"/>
+        </w:rPr>
+        <w:t>` com profile `qa`, e `application-prod.yml`</w:t>
       </w:r>
     </w:p>
     <w:p>
@@ -6128,7 +7268,23 @@
           <w:rFonts w:asciiTheme="majorHAnsi" w:hAnsiTheme="majorHAnsi" w:cstheme="majorHAnsi"/>
           <w:lang w:val="pt-BR"/>
         </w:rPr>
-        <w:t>RelaxedProperties (novo em dev.scg.core), ActuatorExposureRule, H2ConsoleExposedRule e ConfigLoader.</w:t>
+        <w:t xml:space="preserve">RelaxedProperties (novo em </w:t>
+      </w:r>
+      <w:proofErr w:type="gramStart"/>
+      <w:r>
+        <w:rPr>
+          <w:rFonts w:asciiTheme="majorHAnsi" w:hAnsiTheme="majorHAnsi" w:cstheme="majorHAnsi"/>
+          <w:lang w:val="pt-BR"/>
+        </w:rPr>
+        <w:t>dev.scg.core</w:t>
+      </w:r>
+      <w:proofErr w:type="gramEnd"/>
+      <w:r>
+        <w:rPr>
+          <w:rFonts w:asciiTheme="majorHAnsi" w:hAnsiTheme="majorHAnsi" w:cstheme="majorHAnsi"/>
+          <w:lang w:val="pt-BR"/>
+        </w:rPr>
+        <w:t>), ActuatorExposureRule, H2ConsoleExposedRule e ConfigLoader.</w:t>
       </w:r>
     </w:p>
     <w:p>
@@ -6153,7 +7309,23 @@
           <w:rFonts w:asciiTheme="majorHAnsi" w:hAnsiTheme="majorHAnsi" w:cstheme="majorHAnsi"/>
           <w:lang w:val="pt-BR"/>
         </w:rPr>
-        <w:t xml:space="preserve"> Todas as buscas por chaves de propriedade na aplicação (tanto nas regras do linter quanto na detecção interna de spring.config.activate.on-profile no ConfigLoader) utilizavam comparação exata de </w:t>
+        <w:t xml:space="preserve"> Todas as buscas por chaves de propriedade na aplicação (tanto nas regras do linter quanto na detecção interna de spring.</w:t>
+      </w:r>
+      <w:proofErr w:type="gramStart"/>
+      <w:r>
+        <w:rPr>
+          <w:rFonts w:asciiTheme="majorHAnsi" w:hAnsiTheme="majorHAnsi" w:cstheme="majorHAnsi"/>
+          <w:lang w:val="pt-BR"/>
+        </w:rPr>
+        <w:t>config.activate</w:t>
+      </w:r>
+      <w:proofErr w:type="gramEnd"/>
+      <w:r>
+        <w:rPr>
+          <w:rFonts w:asciiTheme="majorHAnsi" w:hAnsiTheme="majorHAnsi" w:cstheme="majorHAnsi"/>
+          <w:lang w:val="pt-BR"/>
+        </w:rPr>
+        <w:t xml:space="preserve">.on-profile no ConfigLoader) utilizavam comparação exata de </w:t>
       </w:r>
       <w:r>
         <w:rPr>
@@ -6265,7 +7437,39 @@
           <w:rFonts w:asciiTheme="majorHAnsi" w:hAnsiTheme="majorHAnsi" w:cstheme="majorHAnsi"/>
           <w:lang w:val="pt-BR"/>
         </w:rPr>
-        <w:t xml:space="preserve"> no mesmo segmento delimitado por ponto como a mesma propriedade. Por exemplo, spring.jpa.database-platform, spring.jpa.databasePlatform e spring.JPA.database_platform resolvem para a mesma propriedade canônica. </w:t>
+        <w:t xml:space="preserve"> no mesmo segmento delimitado por ponto como a mesma propriedade. Por exemplo, </w:t>
+      </w:r>
+      <w:proofErr w:type="gramStart"/>
+      <w:r>
+        <w:rPr>
+          <w:rFonts w:asciiTheme="majorHAnsi" w:hAnsiTheme="majorHAnsi" w:cstheme="majorHAnsi"/>
+          <w:lang w:val="pt-BR"/>
+        </w:rPr>
+        <w:t>spring.jpa.database</w:t>
+      </w:r>
+      <w:proofErr w:type="gramEnd"/>
+      <w:r>
+        <w:rPr>
+          <w:rFonts w:asciiTheme="majorHAnsi" w:hAnsiTheme="majorHAnsi" w:cstheme="majorHAnsi"/>
+          <w:lang w:val="pt-BR"/>
+        </w:rPr>
+        <w:t xml:space="preserve">-platform, </w:t>
+      </w:r>
+      <w:proofErr w:type="gramStart"/>
+      <w:r>
+        <w:rPr>
+          <w:rFonts w:asciiTheme="majorHAnsi" w:hAnsiTheme="majorHAnsi" w:cstheme="majorHAnsi"/>
+          <w:lang w:val="pt-BR"/>
+        </w:rPr>
+        <w:t>spring.jpa.databasePlatform</w:t>
+      </w:r>
+      <w:proofErr w:type="gramEnd"/>
+      <w:r>
+        <w:rPr>
+          <w:rFonts w:asciiTheme="majorHAnsi" w:hAnsiTheme="majorHAnsi" w:cstheme="majorHAnsi"/>
+          <w:lang w:val="pt-BR"/>
+        </w:rPr>
+        <w:t xml:space="preserve"> e spring.JPA.database_platform resolvem para a mesma propriedade canônica. </w:t>
       </w:r>
     </w:p>
     <w:p>
@@ -6461,7 +7665,39 @@
           <w:rFonts w:asciiTheme="majorHAnsi" w:hAnsiTheme="majorHAnsi" w:cstheme="majorHAnsi"/>
           <w:lang w:val="pt-BR"/>
         </w:rPr>
-        <w:t xml:space="preserve"> no lugar de ponto, ex: SPRING_H2_CONSOLE_ENABLED) é exclusiva de variáveis de ambiente do sistema operacional e ficou fora de escopo, pois o ConfigLoader analisa exclusivamente arquivos .properties e .yml/.yaml. </w:t>
+        <w:t xml:space="preserve"> no lugar de ponto, ex: SPRING_H2_CONSOLE_ENABLED) é exclusiva de variáveis de ambiente do sistema operacional e ficou fora de escopo, pois o ConfigLoader analisa exclusivamente </w:t>
+      </w:r>
+      <w:proofErr w:type="gramStart"/>
+      <w:r>
+        <w:rPr>
+          <w:rFonts w:asciiTheme="majorHAnsi" w:hAnsiTheme="majorHAnsi" w:cstheme="majorHAnsi"/>
+          <w:lang w:val="pt-BR"/>
+        </w:rPr>
+        <w:t>arquivos .properties</w:t>
+      </w:r>
+      <w:proofErr w:type="gramEnd"/>
+      <w:r>
+        <w:rPr>
+          <w:rFonts w:asciiTheme="majorHAnsi" w:hAnsiTheme="majorHAnsi" w:cstheme="majorHAnsi"/>
+          <w:lang w:val="pt-BR"/>
+        </w:rPr>
+        <w:t xml:space="preserve"> </w:t>
+      </w:r>
+      <w:proofErr w:type="gramStart"/>
+      <w:r>
+        <w:rPr>
+          <w:rFonts w:asciiTheme="majorHAnsi" w:hAnsiTheme="majorHAnsi" w:cstheme="majorHAnsi"/>
+          <w:lang w:val="pt-BR"/>
+        </w:rPr>
+        <w:t>e .yml/.yaml</w:t>
+      </w:r>
+      <w:proofErr w:type="gramEnd"/>
+      <w:r>
+        <w:rPr>
+          <w:rFonts w:asciiTheme="majorHAnsi" w:hAnsiTheme="majorHAnsi" w:cstheme="majorHAnsi"/>
+          <w:lang w:val="pt-BR"/>
+        </w:rPr>
+        <w:t xml:space="preserve">. </w:t>
       </w:r>
     </w:p>
     <w:p>
@@ -6598,7 +7834,23 @@
           <w:rFonts w:asciiTheme="majorHAnsi" w:hAnsiTheme="majorHAnsi" w:cstheme="majorHAnsi"/>
           <w:lang w:val="pt-BR"/>
         </w:rPr>
-        <w:t xml:space="preserve">Método get(): busca exata orientada ao modelo </w:t>
+        <w:t xml:space="preserve">Método </w:t>
+      </w:r>
+      <w:proofErr w:type="gramStart"/>
+      <w:r>
+        <w:rPr>
+          <w:rFonts w:asciiTheme="majorHAnsi" w:hAnsiTheme="majorHAnsi" w:cstheme="majorHAnsi"/>
+          <w:lang w:val="pt-BR"/>
+        </w:rPr>
+        <w:t>get(</w:t>
+      </w:r>
+      <w:proofErr w:type="gramEnd"/>
+      <w:r>
+        <w:rPr>
+          <w:rFonts w:asciiTheme="majorHAnsi" w:hAnsiTheme="majorHAnsi" w:cstheme="majorHAnsi"/>
+          <w:lang w:val="pt-BR"/>
+        </w:rPr>
+        <w:t xml:space="preserve">): busca exata orientada ao modelo </w:t>
       </w:r>
       <w:r>
         <w:rPr>
@@ -6634,7 +7886,23 @@
           <w:rFonts w:asciiTheme="majorHAnsi" w:hAnsiTheme="majorHAnsi" w:cstheme="majorHAnsi"/>
           <w:lang w:val="pt-BR"/>
         </w:rPr>
-        <w:t xml:space="preserve">Método valuesForKeyOrListChildren(): suporta leitura de valores escalares ou listas YAML indexadas, necessário para a ActuatorExposureRule. </w:t>
+        <w:t xml:space="preserve">Método </w:t>
+      </w:r>
+      <w:proofErr w:type="gramStart"/>
+      <w:r>
+        <w:rPr>
+          <w:rFonts w:asciiTheme="majorHAnsi" w:hAnsiTheme="majorHAnsi" w:cstheme="majorHAnsi"/>
+          <w:lang w:val="pt-BR"/>
+        </w:rPr>
+        <w:t>valuesForKeyOrListChildren(</w:t>
+      </w:r>
+      <w:proofErr w:type="gramEnd"/>
+      <w:r>
+        <w:rPr>
+          <w:rFonts w:asciiTheme="majorHAnsi" w:hAnsiTheme="majorHAnsi" w:cstheme="majorHAnsi"/>
+          <w:lang w:val="pt-BR"/>
+        </w:rPr>
+        <w:t xml:space="preserve">): suporta leitura de valores escalares ou listas YAML indexadas, necessário para a ActuatorExposureRule. </w:t>
       </w:r>
     </w:p>
     <w:p>
@@ -6654,7 +7922,23 @@
           <w:rFonts w:asciiTheme="majorHAnsi" w:hAnsiTheme="majorHAnsi" w:cstheme="majorHAnsi"/>
           <w:lang w:val="pt-BR"/>
         </w:rPr>
-        <w:t xml:space="preserve">Método findActualKey(): recupera a chave literal exata como foi escrita no arquivo original, necessária para remoção física de chaves de infraestrutura sem corromper o mapa. </w:t>
+        <w:t xml:space="preserve">Método </w:t>
+      </w:r>
+      <w:proofErr w:type="gramStart"/>
+      <w:r>
+        <w:rPr>
+          <w:rFonts w:asciiTheme="majorHAnsi" w:hAnsiTheme="majorHAnsi" w:cstheme="majorHAnsi"/>
+          <w:lang w:val="pt-BR"/>
+        </w:rPr>
+        <w:t>findActualKey(</w:t>
+      </w:r>
+      <w:proofErr w:type="gramEnd"/>
+      <w:r>
+        <w:rPr>
+          <w:rFonts w:asciiTheme="majorHAnsi" w:hAnsiTheme="majorHAnsi" w:cstheme="majorHAnsi"/>
+          <w:lang w:val="pt-BR"/>
+        </w:rPr>
+        <w:t xml:space="preserve">): recupera a chave literal exata como foi escrita no arquivo original, necessária para remoção física de chaves de infraestrutura sem corromper o mapa. </w:t>
       </w:r>
     </w:p>
     <w:p>
@@ -6696,7 +7980,23 @@
           <w:rFonts w:asciiTheme="majorHAnsi" w:hAnsiTheme="majorHAnsi" w:cstheme="majorHAnsi"/>
           <w:lang w:val="pt-BR"/>
         </w:rPr>
-        <w:t xml:space="preserve">Refatoradas para ler propriedades via RelaxedProperties em vez de Map.get() direto ou filtros manuais por prefixo. Lógica de detecção mantida 100% idêntica. </w:t>
+        <w:t xml:space="preserve">Refatoradas para ler propriedades via RelaxedProperties em vez de </w:t>
+      </w:r>
+      <w:proofErr w:type="gramStart"/>
+      <w:r>
+        <w:rPr>
+          <w:rFonts w:asciiTheme="majorHAnsi" w:hAnsiTheme="majorHAnsi" w:cstheme="majorHAnsi"/>
+          <w:lang w:val="pt-BR"/>
+        </w:rPr>
+        <w:t>Map.get(</w:t>
+      </w:r>
+      <w:proofErr w:type="gramEnd"/>
+      <w:r>
+        <w:rPr>
+          <w:rFonts w:asciiTheme="majorHAnsi" w:hAnsiTheme="majorHAnsi" w:cstheme="majorHAnsi"/>
+          <w:lang w:val="pt-BR"/>
+        </w:rPr>
+        <w:t xml:space="preserve">) direto ou filtros manuais por prefixo. Lógica de detecção mantida 100% idêntica. </w:t>
       </w:r>
     </w:p>
     <w:p>
@@ -6738,7 +8038,23 @@
           <w:rFonts w:asciiTheme="majorHAnsi" w:hAnsiTheme="majorHAnsi" w:cstheme="majorHAnsi"/>
           <w:lang w:val="pt-BR"/>
         </w:rPr>
-        <w:t xml:space="preserve">Ambas as rotinas (loadYaml e processPropertiesDocument) passam a usar RelaxedProperties.findActualKey() para identificar e remover a chave spring.config.activate.on-profile independentemente de como foi escrita (onProfile, on-profile, etc.). </w:t>
+        <w:t>Ambas as rotinas (loadYaml e processPropertiesDocument) passam a usar RelaxedProperties.findActualKey() para identificar e remover a chave spring.</w:t>
+      </w:r>
+      <w:proofErr w:type="gramStart"/>
+      <w:r>
+        <w:rPr>
+          <w:rFonts w:asciiTheme="majorHAnsi" w:hAnsiTheme="majorHAnsi" w:cstheme="majorHAnsi"/>
+          <w:lang w:val="pt-BR"/>
+        </w:rPr>
+        <w:t>config.activate</w:t>
+      </w:r>
+      <w:proofErr w:type="gramEnd"/>
+      <w:r>
+        <w:rPr>
+          <w:rFonts w:asciiTheme="majorHAnsi" w:hAnsiTheme="majorHAnsi" w:cstheme="majorHAnsi"/>
+          <w:lang w:val="pt-BR"/>
+        </w:rPr>
+        <w:t xml:space="preserve">.on-profile independentemente de como foi escrita (onProfile, on-profile, etc.). </w:t>
       </w:r>
     </w:p>
     <w:p>
@@ -6900,483 +8216,9 @@
           <w:highlight w:val="yellow"/>
           <w:lang w:val="pt-BR"/>
         </w:rPr>
-        <w:t xml:space="preserve"> BL-20 — EnvironmentPlaceholder não distingue chave literal `{` de abertura de placeholder aninhado</w:t>
-      </w:r>
-    </w:p>
-    <w:p>
-      <w:pPr>
-        <w:spacing w:after="0"/>
-        <w:rPr>
-          <w:rFonts w:asciiTheme="majorHAnsi" w:hAnsiTheme="majorHAnsi" w:cstheme="majorHAnsi"/>
-          <w:lang w:val="pt-BR"/>
-        </w:rPr>
-      </w:pPr>
-    </w:p>
-    <w:p>
-      <w:pPr>
-        <w:spacing w:after="0"/>
-        <w:rPr>
-          <w:rFonts w:asciiTheme="majorHAnsi" w:hAnsiTheme="majorHAnsi" w:cstheme="majorHAnsi"/>
-          <w:lang w:val="pt-BR"/>
-        </w:rPr>
-      </w:pPr>
-      <w:r>
-        <w:rPr>
-          <w:rFonts w:asciiTheme="majorHAnsi" w:hAnsiTheme="majorHAnsi" w:cstheme="majorHAnsi"/>
-          <w:lang w:val="pt-BR"/>
-        </w:rPr>
-        <w:t>Onde: `EnvironmentPlaceholder.findMatchingBrace()` / `findTopLevelSeparator()`.</w:t>
-      </w:r>
-    </w:p>
-    <w:p>
-      <w:pPr>
-        <w:spacing w:after="0"/>
-        <w:rPr>
-          <w:rFonts w:asciiTheme="majorHAnsi" w:hAnsiTheme="majorHAnsi" w:cstheme="majorHAnsi"/>
-          <w:lang w:val="pt-BR"/>
-        </w:rPr>
-      </w:pPr>
-    </w:p>
-    <w:p>
-      <w:pPr>
-        <w:spacing w:after="0"/>
-        <w:rPr>
-          <w:rFonts w:asciiTheme="majorHAnsi" w:hAnsiTheme="majorHAnsi" w:cstheme="majorHAnsi"/>
-          <w:lang w:val="pt-BR"/>
-        </w:rPr>
-      </w:pPr>
-      <w:r>
-        <w:rPr>
-          <w:rFonts w:asciiTheme="majorHAnsi" w:hAnsiTheme="majorHAnsi" w:cstheme="majorHAnsi"/>
-          <w:lang w:val="pt-BR"/>
-        </w:rPr>
-        <w:t>Problema: o rastreador de profundidade de chaves só incrementa a profundidade quando</w:t>
-      </w:r>
-    </w:p>
-    <w:p>
-      <w:pPr>
-        <w:spacing w:after="0"/>
-        <w:rPr>
-          <w:rFonts w:asciiTheme="majorHAnsi" w:hAnsiTheme="majorHAnsi" w:cstheme="majorHAnsi"/>
-          <w:lang w:val="pt-BR"/>
-        </w:rPr>
-      </w:pPr>
-      <w:r>
-        <w:rPr>
-          <w:rFonts w:asciiTheme="majorHAnsi" w:hAnsiTheme="majorHAnsi" w:cstheme="majorHAnsi"/>
-          <w:lang w:val="pt-BR"/>
-        </w:rPr>
-        <w:lastRenderedPageBreak/>
-        <w:t>encontra `{` precedido de `$` (abertura de um novo `${...}`), mas decrementa em</w:t>
-      </w:r>
-    </w:p>
-    <w:p>
-      <w:pPr>
-        <w:spacing w:after="0"/>
-        <w:rPr>
-          <w:rFonts w:asciiTheme="majorHAnsi" w:hAnsiTheme="majorHAnsi" w:cstheme="majorHAnsi"/>
-          <w:lang w:val="pt-BR"/>
-        </w:rPr>
-      </w:pPr>
-      <w:r>
-        <w:rPr>
-          <w:rFonts w:asciiTheme="majorHAnsi" w:hAnsiTheme="majorHAnsi" w:cstheme="majorHAnsi"/>
-          <w:lang w:val="pt-BR"/>
-        </w:rPr>
-        <w:t>qualquer `}`, sem distinguir se aquele `}` fecha um placeholder aninhado ou é só um</w:t>
-      </w:r>
-    </w:p>
-    <w:p>
-      <w:pPr>
-        <w:spacing w:after="0"/>
-        <w:rPr>
-          <w:rFonts w:asciiTheme="majorHAnsi" w:hAnsiTheme="majorHAnsi" w:cstheme="majorHAnsi"/>
-          <w:lang w:val="pt-BR"/>
-        </w:rPr>
-      </w:pPr>
-      <w:r>
-        <w:rPr>
-          <w:rFonts w:asciiTheme="majorHAnsi" w:hAnsiTheme="majorHAnsi" w:cstheme="majorHAnsi"/>
-          <w:lang w:val="pt-BR"/>
-        </w:rPr>
-        <w:t>caractere literal `{`/`}` dentro do valor de default. Se um default contiver uma chave</w:t>
-      </w:r>
-    </w:p>
-    <w:p>
-      <w:pPr>
-        <w:spacing w:after="0"/>
-        <w:rPr>
-          <w:rFonts w:asciiTheme="majorHAnsi" w:hAnsiTheme="majorHAnsi" w:cstheme="majorHAnsi"/>
-          <w:lang w:val="pt-BR"/>
-        </w:rPr>
-      </w:pPr>
-      <w:r>
-        <w:rPr>
-          <w:rFonts w:asciiTheme="majorHAnsi" w:hAnsiTheme="majorHAnsi" w:cstheme="majorHAnsi"/>
-          <w:lang w:val="pt-BR"/>
-        </w:rPr>
-        <w:t>solta não relacionada a placeholder (ex: `${PATTERN:{literal}}`, onde `{literal}` é um</w:t>
-      </w:r>
-    </w:p>
-    <w:p>
-      <w:pPr>
-        <w:spacing w:after="0"/>
-        <w:rPr>
-          <w:rFonts w:asciiTheme="majorHAnsi" w:hAnsiTheme="majorHAnsi" w:cstheme="majorHAnsi"/>
-          <w:lang w:val="pt-BR"/>
-        </w:rPr>
-      </w:pPr>
-      <w:r>
-        <w:rPr>
-          <w:rFonts w:asciiTheme="majorHAnsi" w:hAnsiTheme="majorHAnsi" w:cstheme="majorHAnsi"/>
-          <w:lang w:val="pt-BR"/>
-        </w:rPr>
-        <w:t>valor de texto comum, não um aninhamento), o parser fecha o placeholder externo cedo</w:t>
-      </w:r>
-    </w:p>
-    <w:p>
-      <w:pPr>
-        <w:spacing w:after="0"/>
-        <w:rPr>
-          <w:rFonts w:asciiTheme="majorHAnsi" w:hAnsiTheme="majorHAnsi" w:cstheme="majorHAnsi"/>
-          <w:lang w:val="pt-BR"/>
-        </w:rPr>
-      </w:pPr>
-      <w:r>
-        <w:rPr>
-          <w:rFonts w:asciiTheme="majorHAnsi" w:hAnsiTheme="majorHAnsi" w:cstheme="majorHAnsi"/>
-          <w:lang w:val="pt-BR"/>
-        </w:rPr>
-        <w:t>demais, no `}` da chave solta, produzindo um resultado incorreto.</w:t>
-      </w:r>
-    </w:p>
-    <w:p>
-      <w:pPr>
-        <w:spacing w:after="0"/>
-        <w:rPr>
-          <w:rFonts w:asciiTheme="majorHAnsi" w:hAnsiTheme="majorHAnsi" w:cstheme="majorHAnsi"/>
-          <w:lang w:val="pt-BR"/>
-        </w:rPr>
-      </w:pPr>
-    </w:p>
-    <w:p>
-      <w:pPr>
-        <w:spacing w:after="0"/>
-        <w:rPr>
-          <w:rFonts w:asciiTheme="majorHAnsi" w:hAnsiTheme="majorHAnsi" w:cstheme="majorHAnsi"/>
-          <w:lang w:val="pt-BR"/>
-        </w:rPr>
-      </w:pPr>
-      <w:r>
-        <w:rPr>
-          <w:rFonts w:asciiTheme="majorHAnsi" w:hAnsiTheme="majorHAnsi" w:cstheme="majorHAnsi"/>
-          <w:lang w:val="pt-BR"/>
-        </w:rPr>
-        <w:t>Por que a prioridade é baixa: essa é uma limitação pré-existente, não introduzida</w:t>
-      </w:r>
-    </w:p>
-    <w:p>
-      <w:pPr>
-        <w:spacing w:after="0"/>
-        <w:rPr>
-          <w:rFonts w:asciiTheme="majorHAnsi" w:hAnsiTheme="majorHAnsi" w:cstheme="majorHAnsi"/>
-          <w:lang w:val="pt-BR"/>
-        </w:rPr>
-      </w:pPr>
-      <w:r>
-        <w:rPr>
-          <w:rFonts w:asciiTheme="majorHAnsi" w:hAnsiTheme="majorHAnsi" w:cstheme="majorHAnsi"/>
-          <w:lang w:val="pt-BR"/>
-        </w:rPr>
-        <w:t>pela reescrita do parser (sessão de hoje) — a implementação anterior baseada em regex já</w:t>
-      </w:r>
-    </w:p>
-    <w:p>
-      <w:pPr>
-        <w:spacing w:after="0"/>
-        <w:rPr>
-          <w:rFonts w:asciiTheme="majorHAnsi" w:hAnsiTheme="majorHAnsi" w:cstheme="majorHAnsi"/>
-          <w:lang w:val="pt-BR"/>
-        </w:rPr>
-      </w:pPr>
-      <w:r>
-        <w:rPr>
-          <w:rFonts w:asciiTheme="majorHAnsi" w:hAnsiTheme="majorHAnsi" w:cstheme="majorHAnsi"/>
-          <w:lang w:val="pt-BR"/>
-        </w:rPr>
-        <w:t>tinha o mesmo problema (o grupo de captura `[^}]*` do valor default já parava no primeiro</w:t>
-      </w:r>
-    </w:p>
-    <w:p>
-      <w:pPr>
-        <w:spacing w:after="0"/>
-        <w:rPr>
-          <w:rFonts w:asciiTheme="majorHAnsi" w:hAnsiTheme="majorHAnsi" w:cstheme="majorHAnsi"/>
-          <w:lang w:val="pt-BR"/>
-        </w:rPr>
-      </w:pPr>
-      <w:r>
-        <w:rPr>
-          <w:rFonts w:asciiTheme="majorHAnsi" w:hAnsiTheme="majorHAnsi" w:cstheme="majorHAnsi"/>
-          <w:lang w:val="pt-BR"/>
-        </w:rPr>
-        <w:t>`}` que encontrasse, aninhado ou não). Não é regressão, é uma lacuna que sempre existiu e</w:t>
-      </w:r>
-    </w:p>
-    <w:p>
-      <w:pPr>
-        <w:spacing w:after="0"/>
-        <w:rPr>
-          <w:rFonts w:asciiTheme="majorHAnsi" w:hAnsiTheme="majorHAnsi" w:cstheme="majorHAnsi"/>
-          <w:lang w:val="pt-BR"/>
-        </w:rPr>
-      </w:pPr>
-      <w:r>
-        <w:rPr>
-          <w:rFonts w:asciiTheme="majorHAnsi" w:hAnsiTheme="majorHAnsi" w:cstheme="majorHAnsi"/>
-          <w:lang w:val="pt-BR"/>
-        </w:rPr>
-        <w:t>só ficou documentada agora, ao formalizar o suporte a aninhamento real.</w:t>
-      </w:r>
-    </w:p>
-    <w:p>
-      <w:pPr>
-        <w:spacing w:after="0"/>
-        <w:rPr>
-          <w:rFonts w:asciiTheme="majorHAnsi" w:hAnsiTheme="majorHAnsi" w:cstheme="majorHAnsi"/>
-          <w:lang w:val="pt-BR"/>
-        </w:rPr>
-      </w:pPr>
-    </w:p>
-    <w:p>
-      <w:pPr>
-        <w:spacing w:after="0"/>
-        <w:rPr>
-          <w:rFonts w:asciiTheme="majorHAnsi" w:hAnsiTheme="majorHAnsi" w:cstheme="majorHAnsi"/>
-          <w:lang w:val="pt-BR"/>
-        </w:rPr>
-      </w:pPr>
-      <w:r>
-        <w:rPr>
-          <w:rFonts w:asciiTheme="majorHAnsi" w:hAnsiTheme="majorHAnsi" w:cstheme="majorHAnsi"/>
-          <w:lang w:val="pt-BR"/>
-        </w:rPr>
-        <w:t>Confirmado com código: sim, por inspeção — não foi escrito teste de regressão</w:t>
-      </w:r>
-    </w:p>
-    <w:p>
-      <w:pPr>
-        <w:spacing w:after="0"/>
-        <w:rPr>
-          <w:rFonts w:asciiTheme="majorHAnsi" w:hAnsiTheme="majorHAnsi" w:cstheme="majorHAnsi"/>
-          <w:lang w:val="pt-BR"/>
-        </w:rPr>
-      </w:pPr>
-      <w:r>
-        <w:rPr>
-          <w:rFonts w:asciiTheme="majorHAnsi" w:hAnsiTheme="majorHAnsi" w:cstheme="majorHAnsi"/>
-          <w:lang w:val="pt-BR"/>
-        </w:rPr>
-        <w:t>reproduzindo o cenário exato (chave solta dentro de um default), já que o cenário em si é</w:t>
-      </w:r>
-    </w:p>
-    <w:p>
-      <w:pPr>
-        <w:spacing w:after="0"/>
-        <w:rPr>
-          <w:rFonts w:asciiTheme="majorHAnsi" w:hAnsiTheme="majorHAnsi" w:cstheme="majorHAnsi"/>
-          <w:lang w:val="pt-BR"/>
-        </w:rPr>
-      </w:pPr>
-      <w:r>
-        <w:rPr>
-          <w:rFonts w:asciiTheme="majorHAnsi" w:hAnsiTheme="majorHAnsi" w:cstheme="majorHAnsi"/>
-          <w:lang w:val="pt-BR"/>
-        </w:rPr>
-        <w:t>raro em configuração real do Spring Boot (não é uma sintaxe documentada/incentivada) e</w:t>
-      </w:r>
-    </w:p>
-    <w:p>
-      <w:pPr>
-        <w:spacing w:after="0"/>
-        <w:rPr>
-          <w:rFonts w:asciiTheme="majorHAnsi" w:hAnsiTheme="majorHAnsi" w:cstheme="majorHAnsi"/>
-          <w:lang w:val="pt-BR"/>
-        </w:rPr>
-      </w:pPr>
-      <w:r>
-        <w:rPr>
-          <w:rFonts w:asciiTheme="majorHAnsi" w:hAnsiTheme="majorHAnsi" w:cstheme="majorHAnsi"/>
-          <w:lang w:val="pt-BR"/>
-        </w:rPr>
-        <w:t>resolver corretamente exigiria sintaxe de escape que o próprio Spring não define com</w:t>
-      </w:r>
-    </w:p>
-    <w:p>
-      <w:pPr>
-        <w:spacing w:after="0"/>
-        <w:rPr>
-          <w:rFonts w:asciiTheme="majorHAnsi" w:hAnsiTheme="majorHAnsi" w:cstheme="majorHAnsi"/>
-          <w:lang w:val="pt-BR"/>
-        </w:rPr>
-      </w:pPr>
-      <w:r>
-        <w:rPr>
-          <w:rFonts w:asciiTheme="majorHAnsi" w:hAnsiTheme="majorHAnsi" w:cstheme="majorHAnsi"/>
-          <w:lang w:val="pt-BR"/>
-        </w:rPr>
-        <w:t>clareza para esse caso.</w:t>
-      </w:r>
-    </w:p>
-    <w:p>
-      <w:pPr>
-        <w:spacing w:after="0"/>
-        <w:rPr>
-          <w:rFonts w:asciiTheme="majorHAnsi" w:hAnsiTheme="majorHAnsi" w:cstheme="majorHAnsi"/>
-          <w:lang w:val="pt-BR"/>
-        </w:rPr>
-      </w:pPr>
-    </w:p>
-    <w:p>
-      <w:pPr>
-        <w:spacing w:after="0"/>
-        <w:rPr>
-          <w:rFonts w:asciiTheme="majorHAnsi" w:hAnsiTheme="majorHAnsi" w:cstheme="majorHAnsi"/>
-          <w:lang w:val="pt-BR"/>
-        </w:rPr>
-      </w:pPr>
-      <w:r>
-        <w:rPr>
-          <w:rFonts w:asciiTheme="majorHAnsi" w:hAnsiTheme="majorHAnsi" w:cstheme="majorHAnsi"/>
-          <w:lang w:val="pt-BR"/>
-        </w:rPr>
-        <w:t>Custo de correção estimado: médio-alto — exigiria decidir uma convenção de escape</w:t>
-      </w:r>
-    </w:p>
-    <w:p>
-      <w:pPr>
-        <w:spacing w:after="0"/>
-        <w:rPr>
-          <w:rFonts w:asciiTheme="majorHAnsi" w:hAnsiTheme="majorHAnsi" w:cstheme="majorHAnsi"/>
-          <w:lang w:val="pt-BR"/>
-        </w:rPr>
-      </w:pPr>
-      <w:r>
-        <w:rPr>
-          <w:rFonts w:asciiTheme="majorHAnsi" w:hAnsiTheme="majorHAnsi" w:cstheme="majorHAnsi"/>
-          <w:lang w:val="pt-BR"/>
-        </w:rPr>
-        <w:t>própria (já que o Spring não prescreve uma), o que é mais uma decisão de design do que um</w:t>
-      </w:r>
-    </w:p>
-    <w:p>
-      <w:pPr>
-        <w:spacing w:after="0"/>
-        <w:rPr>
-          <w:rFonts w:asciiTheme="majorHAnsi" w:hAnsiTheme="majorHAnsi" w:cstheme="majorHAnsi"/>
-          <w:lang w:val="pt-BR"/>
-        </w:rPr>
-      </w:pPr>
-      <w:r>
-        <w:rPr>
-          <w:rFonts w:asciiTheme="majorHAnsi" w:hAnsiTheme="majorHAnsi" w:cstheme="majorHAnsi"/>
-          <w:lang w:val="pt-BR"/>
-        </w:rPr>
-        <w:t>ajuste de parser.</w:t>
-      </w:r>
-    </w:p>
-    <w:p>
-      <w:pPr>
-        <w:spacing w:after="0"/>
-        <w:rPr>
-          <w:rFonts w:asciiTheme="majorHAnsi" w:hAnsiTheme="majorHAnsi" w:cstheme="majorHAnsi"/>
-          <w:lang w:val="pt-BR"/>
-        </w:rPr>
-      </w:pPr>
-    </w:p>
-    <w:p>
-      <w:pPr>
-        <w:spacing w:after="0"/>
-        <w:rPr>
-          <w:rFonts w:asciiTheme="majorHAnsi" w:hAnsiTheme="majorHAnsi" w:cstheme="majorHAnsi"/>
-          <w:lang w:val="pt-BR"/>
-        </w:rPr>
-      </w:pPr>
-      <w:r>
-        <w:rPr>
-          <w:rFonts w:asciiTheme="majorHAnsi" w:hAnsiTheme="majorHAnsi" w:cstheme="majorHAnsi"/>
-          <w:lang w:val="pt-BR"/>
-        </w:rPr>
-        <w:t>Status: registrado, não iniciado. Baixa prioridade — nenhuma evidência de que isso</w:t>
-      </w:r>
-    </w:p>
-    <w:p>
-      <w:pPr>
-        <w:spacing w:after="0"/>
-        <w:rPr>
-          <w:rFonts w:asciiTheme="majorHAnsi" w:hAnsiTheme="majorHAnsi" w:cstheme="majorHAnsi"/>
-          <w:lang w:val="pt-BR"/>
-        </w:rPr>
-      </w:pPr>
-      <w:r>
-        <w:rPr>
-          <w:rFonts w:asciiTheme="majorHAnsi" w:hAnsiTheme="majorHAnsi" w:cstheme="majorHAnsi"/>
-          <w:lang w:val="pt-BR"/>
-        </w:rPr>
-        <w:t>ocorre em configuração real; revisitar apenas se surgir um caso concreto.</w:t>
-      </w:r>
-    </w:p>
-    <w:p>
-      <w:pPr>
-        <w:spacing w:after="0"/>
-        <w:rPr>
-          <w:rFonts w:asciiTheme="majorHAnsi" w:hAnsiTheme="majorHAnsi" w:cstheme="majorHAnsi"/>
-          <w:lang w:val="pt-BR"/>
-        </w:rPr>
-      </w:pPr>
-    </w:p>
-    <w:p>
-      <w:pPr>
-        <w:spacing w:after="0"/>
-        <w:rPr>
-          <w:rFonts w:asciiTheme="majorHAnsi" w:hAnsiTheme="majorHAnsi" w:cstheme="majorHAnsi"/>
-          <w:lang w:val="pt-BR"/>
-        </w:rPr>
-      </w:pPr>
-      <w:r>
-        <w:rPr>
-          <w:rFonts w:asciiTheme="majorHAnsi" w:hAnsiTheme="majorHAnsi" w:cstheme="majorHAnsi"/>
-          <w:lang w:val="pt-BR"/>
-        </w:rPr>
-        <w:t># Itens Novos (sessão de hoje — revisão das regras de CORS)</w:t>
-      </w:r>
-    </w:p>
-    <w:p>
-      <w:pPr>
-        <w:spacing w:after="0"/>
-        <w:rPr>
-          <w:rFonts w:asciiTheme="majorHAnsi" w:hAnsiTheme="majorHAnsi" w:cstheme="majorHAnsi"/>
-          <w:lang w:val="pt-BR"/>
-        </w:rPr>
-      </w:pPr>
-    </w:p>
-    <w:p>
-      <w:pPr>
-        <w:spacing w:after="0"/>
-        <w:rPr>
-          <w:rFonts w:asciiTheme="majorHAnsi" w:hAnsiTheme="majorHAnsi" w:cstheme="majorHAnsi"/>
-          <w:b/>
-          <w:bCs/>
-          <w:lang w:val="pt-BR"/>
-        </w:rPr>
-      </w:pPr>
-      <w:r>
-        <w:rPr>
-          <w:rFonts w:asciiTheme="majorHAnsi" w:hAnsiTheme="majorHAnsi" w:cstheme="majorHAnsi"/>
-          <w:lang w:val="pt-BR"/>
-        </w:rPr>
-        <w:t xml:space="preserve"> </w:t>
-      </w:r>
+        <w:t xml:space="preserve"> BL-20 — EnvironmentPlaceholder não distingue chave literal </w:t>
+      </w:r>
+      <w:proofErr w:type="gramStart"/>
       <w:r>
         <w:rPr>
           <w:rFonts w:asciiTheme="majorHAnsi" w:hAnsiTheme="majorHAnsi" w:cstheme="majorHAnsi"/>
@@ -7385,8 +8227,9 @@
           <w:highlight w:val="yellow"/>
           <w:lang w:val="pt-BR"/>
         </w:rPr>
-        <w:t>BL-2</w:t>
-      </w:r>
+        <w:t>`{</w:t>
+      </w:r>
+      <w:proofErr w:type="gramEnd"/>
       <w:r>
         <w:rPr>
           <w:rFonts w:asciiTheme="majorHAnsi" w:hAnsiTheme="majorHAnsi" w:cstheme="majorHAnsi"/>
@@ -7395,7 +8238,667 @@
           <w:highlight w:val="yellow"/>
           <w:lang w:val="pt-BR"/>
         </w:rPr>
-        <w:t>1</w:t>
+        <w:t>` de abertura de placeholder aninhado</w:t>
+      </w:r>
+    </w:p>
+    <w:p>
+      <w:pPr>
+        <w:spacing w:after="0"/>
+        <w:rPr>
+          <w:rFonts w:asciiTheme="majorHAnsi" w:hAnsiTheme="majorHAnsi" w:cstheme="majorHAnsi"/>
+          <w:lang w:val="pt-BR"/>
+        </w:rPr>
+      </w:pPr>
+    </w:p>
+    <w:p>
+      <w:pPr>
+        <w:spacing w:after="0"/>
+        <w:rPr>
+          <w:rFonts w:asciiTheme="majorHAnsi" w:hAnsiTheme="majorHAnsi" w:cstheme="majorHAnsi"/>
+          <w:lang w:val="pt-BR"/>
+        </w:rPr>
+      </w:pPr>
+      <w:r>
+        <w:rPr>
+          <w:rFonts w:asciiTheme="majorHAnsi" w:hAnsiTheme="majorHAnsi" w:cstheme="majorHAnsi"/>
+          <w:lang w:val="pt-BR"/>
+        </w:rPr>
+        <w:t>Onde: `EnvironmentPlaceholder.findMatchingBrace</w:t>
+      </w:r>
+      <w:proofErr w:type="gramStart"/>
+      <w:r>
+        <w:rPr>
+          <w:rFonts w:asciiTheme="majorHAnsi" w:hAnsiTheme="majorHAnsi" w:cstheme="majorHAnsi"/>
+          <w:lang w:val="pt-BR"/>
+        </w:rPr>
+        <w:t>()`</w:t>
+      </w:r>
+      <w:proofErr w:type="gramEnd"/>
+      <w:r>
+        <w:rPr>
+          <w:rFonts w:asciiTheme="majorHAnsi" w:hAnsiTheme="majorHAnsi" w:cstheme="majorHAnsi"/>
+          <w:lang w:val="pt-BR"/>
+        </w:rPr>
+        <w:t xml:space="preserve"> / `</w:t>
+      </w:r>
+      <w:proofErr w:type="gramStart"/>
+      <w:r>
+        <w:rPr>
+          <w:rFonts w:asciiTheme="majorHAnsi" w:hAnsiTheme="majorHAnsi" w:cstheme="majorHAnsi"/>
+          <w:lang w:val="pt-BR"/>
+        </w:rPr>
+        <w:t>findTopLevelSeparator(</w:t>
+      </w:r>
+      <w:proofErr w:type="gramEnd"/>
+      <w:r>
+        <w:rPr>
+          <w:rFonts w:asciiTheme="majorHAnsi" w:hAnsiTheme="majorHAnsi" w:cstheme="majorHAnsi"/>
+          <w:lang w:val="pt-BR"/>
+        </w:rPr>
+        <w:t>)`.</w:t>
+      </w:r>
+    </w:p>
+    <w:p>
+      <w:pPr>
+        <w:spacing w:after="0"/>
+        <w:rPr>
+          <w:rFonts w:asciiTheme="majorHAnsi" w:hAnsiTheme="majorHAnsi" w:cstheme="majorHAnsi"/>
+          <w:lang w:val="pt-BR"/>
+        </w:rPr>
+      </w:pPr>
+    </w:p>
+    <w:p>
+      <w:pPr>
+        <w:spacing w:after="0"/>
+        <w:rPr>
+          <w:rFonts w:asciiTheme="majorHAnsi" w:hAnsiTheme="majorHAnsi" w:cstheme="majorHAnsi"/>
+          <w:lang w:val="pt-BR"/>
+        </w:rPr>
+      </w:pPr>
+      <w:r>
+        <w:rPr>
+          <w:rFonts w:asciiTheme="majorHAnsi" w:hAnsiTheme="majorHAnsi" w:cstheme="majorHAnsi"/>
+          <w:lang w:val="pt-BR"/>
+        </w:rPr>
+        <w:t>Problema: o rastreador de profundidade de chaves só incrementa a profundidade quando</w:t>
+      </w:r>
+    </w:p>
+    <w:p>
+      <w:pPr>
+        <w:spacing w:after="0"/>
+        <w:rPr>
+          <w:rFonts w:asciiTheme="majorHAnsi" w:hAnsiTheme="majorHAnsi" w:cstheme="majorHAnsi"/>
+          <w:lang w:val="pt-BR"/>
+        </w:rPr>
+      </w:pPr>
+      <w:r>
+        <w:rPr>
+          <w:rFonts w:asciiTheme="majorHAnsi" w:hAnsiTheme="majorHAnsi" w:cstheme="majorHAnsi"/>
+          <w:lang w:val="pt-BR"/>
+        </w:rPr>
+        <w:lastRenderedPageBreak/>
+        <w:t xml:space="preserve">encontra </w:t>
+      </w:r>
+      <w:proofErr w:type="gramStart"/>
+      <w:r>
+        <w:rPr>
+          <w:rFonts w:asciiTheme="majorHAnsi" w:hAnsiTheme="majorHAnsi" w:cstheme="majorHAnsi"/>
+          <w:lang w:val="pt-BR"/>
+        </w:rPr>
+        <w:t>`{</w:t>
+      </w:r>
+      <w:proofErr w:type="gramEnd"/>
+      <w:r>
+        <w:rPr>
+          <w:rFonts w:asciiTheme="majorHAnsi" w:hAnsiTheme="majorHAnsi" w:cstheme="majorHAnsi"/>
+          <w:lang w:val="pt-BR"/>
+        </w:rPr>
+        <w:t>` precedido de `$` (abertura de um novo `${...}`), mas decrementa em</w:t>
+      </w:r>
+    </w:p>
+    <w:p>
+      <w:pPr>
+        <w:spacing w:after="0"/>
+        <w:rPr>
+          <w:rFonts w:asciiTheme="majorHAnsi" w:hAnsiTheme="majorHAnsi" w:cstheme="majorHAnsi"/>
+          <w:lang w:val="pt-BR"/>
+        </w:rPr>
+      </w:pPr>
+      <w:r>
+        <w:rPr>
+          <w:rFonts w:asciiTheme="majorHAnsi" w:hAnsiTheme="majorHAnsi" w:cstheme="majorHAnsi"/>
+          <w:lang w:val="pt-BR"/>
+        </w:rPr>
+        <w:t xml:space="preserve">qualquer </w:t>
+      </w:r>
+      <w:proofErr w:type="gramStart"/>
+      <w:r>
+        <w:rPr>
+          <w:rFonts w:asciiTheme="majorHAnsi" w:hAnsiTheme="majorHAnsi" w:cstheme="majorHAnsi"/>
+          <w:lang w:val="pt-BR"/>
+        </w:rPr>
+        <w:t>`}`</w:t>
+      </w:r>
+      <w:proofErr w:type="gramEnd"/>
+      <w:r>
+        <w:rPr>
+          <w:rFonts w:asciiTheme="majorHAnsi" w:hAnsiTheme="majorHAnsi" w:cstheme="majorHAnsi"/>
+          <w:lang w:val="pt-BR"/>
+        </w:rPr>
+        <w:t xml:space="preserve">, sem distinguir se aquele </w:t>
+      </w:r>
+      <w:proofErr w:type="gramStart"/>
+      <w:r>
+        <w:rPr>
+          <w:rFonts w:asciiTheme="majorHAnsi" w:hAnsiTheme="majorHAnsi" w:cstheme="majorHAnsi"/>
+          <w:lang w:val="pt-BR"/>
+        </w:rPr>
+        <w:t>`}`</w:t>
+      </w:r>
+      <w:proofErr w:type="gramEnd"/>
+      <w:r>
+        <w:rPr>
+          <w:rFonts w:asciiTheme="majorHAnsi" w:hAnsiTheme="majorHAnsi" w:cstheme="majorHAnsi"/>
+          <w:lang w:val="pt-BR"/>
+        </w:rPr>
+        <w:t xml:space="preserve"> fecha um placeholder aninhado ou é só um</w:t>
+      </w:r>
+    </w:p>
+    <w:p>
+      <w:pPr>
+        <w:spacing w:after="0"/>
+        <w:rPr>
+          <w:rFonts w:asciiTheme="majorHAnsi" w:hAnsiTheme="majorHAnsi" w:cstheme="majorHAnsi"/>
+          <w:lang w:val="pt-BR"/>
+        </w:rPr>
+      </w:pPr>
+      <w:r>
+        <w:rPr>
+          <w:rFonts w:asciiTheme="majorHAnsi" w:hAnsiTheme="majorHAnsi" w:cstheme="majorHAnsi"/>
+          <w:lang w:val="pt-BR"/>
+        </w:rPr>
+        <w:t xml:space="preserve">caractere literal </w:t>
+      </w:r>
+      <w:proofErr w:type="gramStart"/>
+      <w:r>
+        <w:rPr>
+          <w:rFonts w:asciiTheme="majorHAnsi" w:hAnsiTheme="majorHAnsi" w:cstheme="majorHAnsi"/>
+          <w:lang w:val="pt-BR"/>
+        </w:rPr>
+        <w:t>`{</w:t>
+      </w:r>
+      <w:proofErr w:type="gramEnd"/>
+      <w:r>
+        <w:rPr>
+          <w:rFonts w:asciiTheme="majorHAnsi" w:hAnsiTheme="majorHAnsi" w:cstheme="majorHAnsi"/>
+          <w:lang w:val="pt-BR"/>
+        </w:rPr>
+        <w:t>`/</w:t>
+      </w:r>
+      <w:proofErr w:type="gramStart"/>
+      <w:r>
+        <w:rPr>
+          <w:rFonts w:asciiTheme="majorHAnsi" w:hAnsiTheme="majorHAnsi" w:cstheme="majorHAnsi"/>
+          <w:lang w:val="pt-BR"/>
+        </w:rPr>
+        <w:t>`}`</w:t>
+      </w:r>
+      <w:proofErr w:type="gramEnd"/>
+      <w:r>
+        <w:rPr>
+          <w:rFonts w:asciiTheme="majorHAnsi" w:hAnsiTheme="majorHAnsi" w:cstheme="majorHAnsi"/>
+          <w:lang w:val="pt-BR"/>
+        </w:rPr>
+        <w:t xml:space="preserve"> dentro do valor de default. Se um default contiver uma chave</w:t>
+      </w:r>
+    </w:p>
+    <w:p>
+      <w:pPr>
+        <w:spacing w:after="0"/>
+        <w:rPr>
+          <w:rFonts w:asciiTheme="majorHAnsi" w:hAnsiTheme="majorHAnsi" w:cstheme="majorHAnsi"/>
+          <w:lang w:val="pt-BR"/>
+        </w:rPr>
+      </w:pPr>
+      <w:r>
+        <w:rPr>
+          <w:rFonts w:asciiTheme="majorHAnsi" w:hAnsiTheme="majorHAnsi" w:cstheme="majorHAnsi"/>
+          <w:lang w:val="pt-BR"/>
+        </w:rPr>
+        <w:t>solta não relacionada a placeholder (ex: `${PATTERN:{literal</w:t>
+      </w:r>
+      <w:proofErr w:type="gramStart"/>
+      <w:r>
+        <w:rPr>
+          <w:rFonts w:asciiTheme="majorHAnsi" w:hAnsiTheme="majorHAnsi" w:cstheme="majorHAnsi"/>
+          <w:lang w:val="pt-BR"/>
+        </w:rPr>
+        <w:t>}}`</w:t>
+      </w:r>
+      <w:proofErr w:type="gramEnd"/>
+      <w:r>
+        <w:rPr>
+          <w:rFonts w:asciiTheme="majorHAnsi" w:hAnsiTheme="majorHAnsi" w:cstheme="majorHAnsi"/>
+          <w:lang w:val="pt-BR"/>
+        </w:rPr>
+        <w:t>, onde `{literal}` é um</w:t>
+      </w:r>
+    </w:p>
+    <w:p>
+      <w:pPr>
+        <w:spacing w:after="0"/>
+        <w:rPr>
+          <w:rFonts w:asciiTheme="majorHAnsi" w:hAnsiTheme="majorHAnsi" w:cstheme="majorHAnsi"/>
+          <w:lang w:val="pt-BR"/>
+        </w:rPr>
+      </w:pPr>
+      <w:r>
+        <w:rPr>
+          <w:rFonts w:asciiTheme="majorHAnsi" w:hAnsiTheme="majorHAnsi" w:cstheme="majorHAnsi"/>
+          <w:lang w:val="pt-BR"/>
+        </w:rPr>
+        <w:t>valor de texto comum, não um aninhamento), o parser fecha o placeholder externo cedo</w:t>
+      </w:r>
+    </w:p>
+    <w:p>
+      <w:pPr>
+        <w:spacing w:after="0"/>
+        <w:rPr>
+          <w:rFonts w:asciiTheme="majorHAnsi" w:hAnsiTheme="majorHAnsi" w:cstheme="majorHAnsi"/>
+          <w:lang w:val="pt-BR"/>
+        </w:rPr>
+      </w:pPr>
+      <w:r>
+        <w:rPr>
+          <w:rFonts w:asciiTheme="majorHAnsi" w:hAnsiTheme="majorHAnsi" w:cstheme="majorHAnsi"/>
+          <w:lang w:val="pt-BR"/>
+        </w:rPr>
+        <w:t xml:space="preserve">demais, no </w:t>
+      </w:r>
+      <w:proofErr w:type="gramStart"/>
+      <w:r>
+        <w:rPr>
+          <w:rFonts w:asciiTheme="majorHAnsi" w:hAnsiTheme="majorHAnsi" w:cstheme="majorHAnsi"/>
+          <w:lang w:val="pt-BR"/>
+        </w:rPr>
+        <w:t>`}`</w:t>
+      </w:r>
+      <w:proofErr w:type="gramEnd"/>
+      <w:r>
+        <w:rPr>
+          <w:rFonts w:asciiTheme="majorHAnsi" w:hAnsiTheme="majorHAnsi" w:cstheme="majorHAnsi"/>
+          <w:lang w:val="pt-BR"/>
+        </w:rPr>
+        <w:t xml:space="preserve"> da chave solta, produzindo um resultado incorreto.</w:t>
+      </w:r>
+    </w:p>
+    <w:p>
+      <w:pPr>
+        <w:spacing w:after="0"/>
+        <w:rPr>
+          <w:rFonts w:asciiTheme="majorHAnsi" w:hAnsiTheme="majorHAnsi" w:cstheme="majorHAnsi"/>
+          <w:lang w:val="pt-BR"/>
+        </w:rPr>
+      </w:pPr>
+    </w:p>
+    <w:p>
+      <w:pPr>
+        <w:spacing w:after="0"/>
+        <w:rPr>
+          <w:rFonts w:asciiTheme="majorHAnsi" w:hAnsiTheme="majorHAnsi" w:cstheme="majorHAnsi"/>
+          <w:lang w:val="pt-BR"/>
+        </w:rPr>
+      </w:pPr>
+      <w:r>
+        <w:rPr>
+          <w:rFonts w:asciiTheme="majorHAnsi" w:hAnsiTheme="majorHAnsi" w:cstheme="majorHAnsi"/>
+          <w:lang w:val="pt-BR"/>
+        </w:rPr>
+        <w:t>Por que a prioridade é baixa: essa é uma limitação pré-existente, não introduzida</w:t>
+      </w:r>
+    </w:p>
+    <w:p>
+      <w:pPr>
+        <w:spacing w:after="0"/>
+        <w:rPr>
+          <w:rFonts w:asciiTheme="majorHAnsi" w:hAnsiTheme="majorHAnsi" w:cstheme="majorHAnsi"/>
+          <w:lang w:val="pt-BR"/>
+        </w:rPr>
+      </w:pPr>
+      <w:r>
+        <w:rPr>
+          <w:rFonts w:asciiTheme="majorHAnsi" w:hAnsiTheme="majorHAnsi" w:cstheme="majorHAnsi"/>
+          <w:lang w:val="pt-BR"/>
+        </w:rPr>
+        <w:t>pela reescrita do parser (sessão de hoje) — a implementação anterior baseada em regex já</w:t>
+      </w:r>
+    </w:p>
+    <w:p>
+      <w:pPr>
+        <w:spacing w:after="0"/>
+        <w:rPr>
+          <w:rFonts w:asciiTheme="majorHAnsi" w:hAnsiTheme="majorHAnsi" w:cstheme="majorHAnsi"/>
+          <w:lang w:val="pt-BR"/>
+        </w:rPr>
+      </w:pPr>
+      <w:r>
+        <w:rPr>
+          <w:rFonts w:asciiTheme="majorHAnsi" w:hAnsiTheme="majorHAnsi" w:cstheme="majorHAnsi"/>
+          <w:lang w:val="pt-BR"/>
+        </w:rPr>
+        <w:t xml:space="preserve">tinha o mesmo problema (o grupo de captura </w:t>
+      </w:r>
+      <w:proofErr w:type="gramStart"/>
+      <w:r>
+        <w:rPr>
+          <w:rFonts w:asciiTheme="majorHAnsi" w:hAnsiTheme="majorHAnsi" w:cstheme="majorHAnsi"/>
+          <w:lang w:val="pt-BR"/>
+        </w:rPr>
+        <w:t>`[</w:t>
+      </w:r>
+      <w:proofErr w:type="gramEnd"/>
+      <w:r>
+        <w:rPr>
+          <w:rFonts w:asciiTheme="majorHAnsi" w:hAnsiTheme="majorHAnsi" w:cstheme="majorHAnsi"/>
+          <w:lang w:val="pt-BR"/>
+        </w:rPr>
+        <w:t>^</w:t>
+      </w:r>
+      <w:proofErr w:type="gramStart"/>
+      <w:r>
+        <w:rPr>
+          <w:rFonts w:asciiTheme="majorHAnsi" w:hAnsiTheme="majorHAnsi" w:cstheme="majorHAnsi"/>
+          <w:lang w:val="pt-BR"/>
+        </w:rPr>
+        <w:t>}]*</w:t>
+      </w:r>
+      <w:proofErr w:type="gramEnd"/>
+      <w:r>
+        <w:rPr>
+          <w:rFonts w:asciiTheme="majorHAnsi" w:hAnsiTheme="majorHAnsi" w:cstheme="majorHAnsi"/>
+          <w:lang w:val="pt-BR"/>
+        </w:rPr>
+        <w:t>` do valor default já parava no primeiro</w:t>
+      </w:r>
+    </w:p>
+    <w:p>
+      <w:pPr>
+        <w:spacing w:after="0"/>
+        <w:rPr>
+          <w:rFonts w:asciiTheme="majorHAnsi" w:hAnsiTheme="majorHAnsi" w:cstheme="majorHAnsi"/>
+          <w:lang w:val="pt-BR"/>
+        </w:rPr>
+      </w:pPr>
+      <w:proofErr w:type="gramStart"/>
+      <w:r>
+        <w:rPr>
+          <w:rFonts w:asciiTheme="majorHAnsi" w:hAnsiTheme="majorHAnsi" w:cstheme="majorHAnsi"/>
+          <w:lang w:val="pt-BR"/>
+        </w:rPr>
+        <w:t>`}`</w:t>
+      </w:r>
+      <w:proofErr w:type="gramEnd"/>
+      <w:r>
+        <w:rPr>
+          <w:rFonts w:asciiTheme="majorHAnsi" w:hAnsiTheme="majorHAnsi" w:cstheme="majorHAnsi"/>
+          <w:lang w:val="pt-BR"/>
+        </w:rPr>
+        <w:t xml:space="preserve"> que encontrasse, aninhado ou não). Não é regressão, é uma lacuna que sempre existiu e</w:t>
+      </w:r>
+    </w:p>
+    <w:p>
+      <w:pPr>
+        <w:spacing w:after="0"/>
+        <w:rPr>
+          <w:rFonts w:asciiTheme="majorHAnsi" w:hAnsiTheme="majorHAnsi" w:cstheme="majorHAnsi"/>
+          <w:lang w:val="pt-BR"/>
+        </w:rPr>
+      </w:pPr>
+      <w:r>
+        <w:rPr>
+          <w:rFonts w:asciiTheme="majorHAnsi" w:hAnsiTheme="majorHAnsi" w:cstheme="majorHAnsi"/>
+          <w:lang w:val="pt-BR"/>
+        </w:rPr>
+        <w:t>só ficou documentada agora, ao formalizar o suporte a aninhamento real.</w:t>
+      </w:r>
+    </w:p>
+    <w:p>
+      <w:pPr>
+        <w:spacing w:after="0"/>
+        <w:rPr>
+          <w:rFonts w:asciiTheme="majorHAnsi" w:hAnsiTheme="majorHAnsi" w:cstheme="majorHAnsi"/>
+          <w:lang w:val="pt-BR"/>
+        </w:rPr>
+      </w:pPr>
+    </w:p>
+    <w:p>
+      <w:pPr>
+        <w:spacing w:after="0"/>
+        <w:rPr>
+          <w:rFonts w:asciiTheme="majorHAnsi" w:hAnsiTheme="majorHAnsi" w:cstheme="majorHAnsi"/>
+          <w:lang w:val="pt-BR"/>
+        </w:rPr>
+      </w:pPr>
+      <w:r>
+        <w:rPr>
+          <w:rFonts w:asciiTheme="majorHAnsi" w:hAnsiTheme="majorHAnsi" w:cstheme="majorHAnsi"/>
+          <w:lang w:val="pt-BR"/>
+        </w:rPr>
+        <w:t>Confirmado com código: sim, por inspeção — não foi escrito teste de regressão</w:t>
+      </w:r>
+    </w:p>
+    <w:p>
+      <w:pPr>
+        <w:spacing w:after="0"/>
+        <w:rPr>
+          <w:rFonts w:asciiTheme="majorHAnsi" w:hAnsiTheme="majorHAnsi" w:cstheme="majorHAnsi"/>
+          <w:lang w:val="pt-BR"/>
+        </w:rPr>
+      </w:pPr>
+      <w:r>
+        <w:rPr>
+          <w:rFonts w:asciiTheme="majorHAnsi" w:hAnsiTheme="majorHAnsi" w:cstheme="majorHAnsi"/>
+          <w:lang w:val="pt-BR"/>
+        </w:rPr>
+        <w:t>reproduzindo o cenário exato (chave solta dentro de um default), já que o cenário em si é</w:t>
+      </w:r>
+    </w:p>
+    <w:p>
+      <w:pPr>
+        <w:spacing w:after="0"/>
+        <w:rPr>
+          <w:rFonts w:asciiTheme="majorHAnsi" w:hAnsiTheme="majorHAnsi" w:cstheme="majorHAnsi"/>
+          <w:lang w:val="pt-BR"/>
+        </w:rPr>
+      </w:pPr>
+      <w:r>
+        <w:rPr>
+          <w:rFonts w:asciiTheme="majorHAnsi" w:hAnsiTheme="majorHAnsi" w:cstheme="majorHAnsi"/>
+          <w:lang w:val="pt-BR"/>
+        </w:rPr>
+        <w:t>raro em configuração real do Spring Boot (não é uma sintaxe documentada/incentivada) e</w:t>
+      </w:r>
+    </w:p>
+    <w:p>
+      <w:pPr>
+        <w:spacing w:after="0"/>
+        <w:rPr>
+          <w:rFonts w:asciiTheme="majorHAnsi" w:hAnsiTheme="majorHAnsi" w:cstheme="majorHAnsi"/>
+          <w:lang w:val="pt-BR"/>
+        </w:rPr>
+      </w:pPr>
+      <w:r>
+        <w:rPr>
+          <w:rFonts w:asciiTheme="majorHAnsi" w:hAnsiTheme="majorHAnsi" w:cstheme="majorHAnsi"/>
+          <w:lang w:val="pt-BR"/>
+        </w:rPr>
+        <w:t>resolver corretamente exigiria sintaxe de escape que o próprio Spring não define com</w:t>
+      </w:r>
+    </w:p>
+    <w:p>
+      <w:pPr>
+        <w:spacing w:after="0"/>
+        <w:rPr>
+          <w:rFonts w:asciiTheme="majorHAnsi" w:hAnsiTheme="majorHAnsi" w:cstheme="majorHAnsi"/>
+          <w:lang w:val="pt-BR"/>
+        </w:rPr>
+      </w:pPr>
+      <w:r>
+        <w:rPr>
+          <w:rFonts w:asciiTheme="majorHAnsi" w:hAnsiTheme="majorHAnsi" w:cstheme="majorHAnsi"/>
+          <w:lang w:val="pt-BR"/>
+        </w:rPr>
+        <w:t>clareza para esse caso.</w:t>
+      </w:r>
+    </w:p>
+    <w:p>
+      <w:pPr>
+        <w:spacing w:after="0"/>
+        <w:rPr>
+          <w:rFonts w:asciiTheme="majorHAnsi" w:hAnsiTheme="majorHAnsi" w:cstheme="majorHAnsi"/>
+          <w:lang w:val="pt-BR"/>
+        </w:rPr>
+      </w:pPr>
+    </w:p>
+    <w:p>
+      <w:pPr>
+        <w:spacing w:after="0"/>
+        <w:rPr>
+          <w:rFonts w:asciiTheme="majorHAnsi" w:hAnsiTheme="majorHAnsi" w:cstheme="majorHAnsi"/>
+          <w:lang w:val="pt-BR"/>
+        </w:rPr>
+      </w:pPr>
+      <w:r>
+        <w:rPr>
+          <w:rFonts w:asciiTheme="majorHAnsi" w:hAnsiTheme="majorHAnsi" w:cstheme="majorHAnsi"/>
+          <w:lang w:val="pt-BR"/>
+        </w:rPr>
+        <w:t>Custo de correção estimado: médio-alto — exigiria decidir uma convenção de escape</w:t>
+      </w:r>
+    </w:p>
+    <w:p>
+      <w:pPr>
+        <w:spacing w:after="0"/>
+        <w:rPr>
+          <w:rFonts w:asciiTheme="majorHAnsi" w:hAnsiTheme="majorHAnsi" w:cstheme="majorHAnsi"/>
+          <w:lang w:val="pt-BR"/>
+        </w:rPr>
+      </w:pPr>
+      <w:r>
+        <w:rPr>
+          <w:rFonts w:asciiTheme="majorHAnsi" w:hAnsiTheme="majorHAnsi" w:cstheme="majorHAnsi"/>
+          <w:lang w:val="pt-BR"/>
+        </w:rPr>
+        <w:t>própria (já que o Spring não prescreve uma), o que é mais uma decisão de design do que um</w:t>
+      </w:r>
+    </w:p>
+    <w:p>
+      <w:pPr>
+        <w:spacing w:after="0"/>
+        <w:rPr>
+          <w:rFonts w:asciiTheme="majorHAnsi" w:hAnsiTheme="majorHAnsi" w:cstheme="majorHAnsi"/>
+          <w:lang w:val="pt-BR"/>
+        </w:rPr>
+      </w:pPr>
+      <w:r>
+        <w:rPr>
+          <w:rFonts w:asciiTheme="majorHAnsi" w:hAnsiTheme="majorHAnsi" w:cstheme="majorHAnsi"/>
+          <w:lang w:val="pt-BR"/>
+        </w:rPr>
+        <w:t>ajuste de parser.</w:t>
+      </w:r>
+    </w:p>
+    <w:p>
+      <w:pPr>
+        <w:spacing w:after="0"/>
+        <w:rPr>
+          <w:rFonts w:asciiTheme="majorHAnsi" w:hAnsiTheme="majorHAnsi" w:cstheme="majorHAnsi"/>
+          <w:lang w:val="pt-BR"/>
+        </w:rPr>
+      </w:pPr>
+    </w:p>
+    <w:p>
+      <w:pPr>
+        <w:spacing w:after="0"/>
+        <w:rPr>
+          <w:rFonts w:asciiTheme="majorHAnsi" w:hAnsiTheme="majorHAnsi" w:cstheme="majorHAnsi"/>
+          <w:lang w:val="pt-BR"/>
+        </w:rPr>
+      </w:pPr>
+      <w:r>
+        <w:rPr>
+          <w:rFonts w:asciiTheme="majorHAnsi" w:hAnsiTheme="majorHAnsi" w:cstheme="majorHAnsi"/>
+          <w:lang w:val="pt-BR"/>
+        </w:rPr>
+        <w:t>Status: registrado, não iniciado. Baixa prioridade — nenhuma evidência de que isso</w:t>
+      </w:r>
+    </w:p>
+    <w:p>
+      <w:pPr>
+        <w:spacing w:after="0"/>
+        <w:rPr>
+          <w:rFonts w:asciiTheme="majorHAnsi" w:hAnsiTheme="majorHAnsi" w:cstheme="majorHAnsi"/>
+          <w:lang w:val="pt-BR"/>
+        </w:rPr>
+      </w:pPr>
+      <w:r>
+        <w:rPr>
+          <w:rFonts w:asciiTheme="majorHAnsi" w:hAnsiTheme="majorHAnsi" w:cstheme="majorHAnsi"/>
+          <w:lang w:val="pt-BR"/>
+        </w:rPr>
+        <w:t>ocorre em configuração real; revisitar apenas se surgir um caso concreto.</w:t>
+      </w:r>
+    </w:p>
+    <w:p>
+      <w:pPr>
+        <w:spacing w:after="0"/>
+        <w:rPr>
+          <w:rFonts w:asciiTheme="majorHAnsi" w:hAnsiTheme="majorHAnsi" w:cstheme="majorHAnsi"/>
+          <w:lang w:val="pt-BR"/>
+        </w:rPr>
+      </w:pPr>
+    </w:p>
+    <w:p>
+      <w:pPr>
+        <w:spacing w:after="0"/>
+        <w:rPr>
+          <w:rFonts w:asciiTheme="majorHAnsi" w:hAnsiTheme="majorHAnsi" w:cstheme="majorHAnsi"/>
+          <w:lang w:val="pt-BR"/>
+        </w:rPr>
+      </w:pPr>
+      <w:r>
+        <w:rPr>
+          <w:rFonts w:asciiTheme="majorHAnsi" w:hAnsiTheme="majorHAnsi" w:cstheme="majorHAnsi"/>
+          <w:lang w:val="pt-BR"/>
+        </w:rPr>
+        <w:t># Itens Novos (sessão de hoje — revisão das regras de CORS)</w:t>
+      </w:r>
+    </w:p>
+    <w:p>
+      <w:pPr>
+        <w:spacing w:after="0"/>
+        <w:rPr>
+          <w:rFonts w:asciiTheme="majorHAnsi" w:hAnsiTheme="majorHAnsi" w:cstheme="majorHAnsi"/>
+          <w:lang w:val="pt-BR"/>
+        </w:rPr>
+      </w:pPr>
+    </w:p>
+    <w:p>
+      <w:pPr>
+        <w:spacing w:after="0"/>
+        <w:rPr>
+          <w:rFonts w:asciiTheme="majorHAnsi" w:hAnsiTheme="majorHAnsi" w:cstheme="majorHAnsi"/>
+          <w:b/>
+          <w:bCs/>
+          <w:lang w:val="pt-BR"/>
+        </w:rPr>
+      </w:pPr>
+      <w:r>
+        <w:rPr>
+          <w:rFonts w:asciiTheme="majorHAnsi" w:hAnsiTheme="majorHAnsi" w:cstheme="majorHAnsi"/>
+          <w:lang w:val="pt-BR"/>
+        </w:rPr>
+        <w:t xml:space="preserve"> </w:t>
       </w:r>
       <w:r>
         <w:rPr>
@@ -7405,7 +8908,37 @@
           <w:highlight w:val="yellow"/>
           <w:lang w:val="pt-BR"/>
         </w:rPr>
-        <w:t xml:space="preserve"> — Regras de CORS (SCG003/004/005) só cobrem Actuator, não CORS de aplicação configurado programaticamente</w:t>
+        <w:t>BL-2</w:t>
+      </w:r>
+      <w:r>
+        <w:rPr>
+          <w:rFonts w:asciiTheme="majorHAnsi" w:hAnsiTheme="majorHAnsi" w:cstheme="majorHAnsi"/>
+          <w:b/>
+          <w:bCs/>
+          <w:highlight w:val="yellow"/>
+          <w:lang w:val="pt-BR"/>
+        </w:rPr>
+        <w:t>1</w:t>
+      </w:r>
+      <w:r>
+        <w:rPr>
+          <w:rFonts w:asciiTheme="majorHAnsi" w:hAnsiTheme="majorHAnsi" w:cstheme="majorHAnsi"/>
+          <w:b/>
+          <w:bCs/>
+          <w:highlight w:val="yellow"/>
+          <w:lang w:val="pt-BR"/>
+        </w:rPr>
+        <w:t xml:space="preserve"> — Regras de CORS </w:t>
+      </w:r>
+      <w:r>
+        <w:rPr>
+          <w:rFonts w:asciiTheme="majorHAnsi" w:hAnsiTheme="majorHAnsi" w:cstheme="majorHAnsi"/>
+          <w:b/>
+          <w:bCs/>
+          <w:highlight w:val="yellow"/>
+          <w:lang w:val="pt-BR"/>
+        </w:rPr>
+        <w:t>(SCG003/004/005) só cobrem Actuator, não CORS de aplicação configurado programaticamente</w:t>
       </w:r>
     </w:p>
     <w:p>
@@ -7462,7 +8995,23 @@
           <w:rFonts w:asciiTheme="majorHAnsi" w:hAnsiTheme="majorHAnsi" w:cstheme="majorHAnsi"/>
           <w:lang w:val="pt-BR"/>
         </w:rPr>
-        <w:t>`management.endpoints.web.cors.*`.</w:t>
+        <w:t>`</w:t>
+      </w:r>
+      <w:proofErr w:type="gramStart"/>
+      <w:r>
+        <w:rPr>
+          <w:rFonts w:asciiTheme="majorHAnsi" w:hAnsiTheme="majorHAnsi" w:cstheme="majorHAnsi"/>
+          <w:lang w:val="pt-BR"/>
+        </w:rPr>
+        <w:t>management.endpoints.web.cors</w:t>
+      </w:r>
+      <w:proofErr w:type="gramEnd"/>
+      <w:r>
+        <w:rPr>
+          <w:rFonts w:asciiTheme="majorHAnsi" w:hAnsiTheme="majorHAnsi" w:cstheme="majorHAnsi"/>
+          <w:lang w:val="pt-BR"/>
+        </w:rPr>
+        <w:t>.*`.</w:t>
       </w:r>
     </w:p>
     <w:p>
@@ -7514,12 +9063,21 @@
           <w:lang w:val="pt-BR"/>
         </w:rPr>
       </w:pPr>
-      <w:r>
-        <w:rPr>
-          <w:rFonts w:asciiTheme="majorHAnsi" w:hAnsiTheme="majorHAnsi" w:cstheme="majorHAnsi"/>
-          <w:lang w:val="pt-BR"/>
-        </w:rPr>
-        <w:t>`.properties`. Confirmado contra o código-fonte oficial do Spring Boot</w:t>
+      <w:proofErr w:type="gramStart"/>
+      <w:r>
+        <w:rPr>
+          <w:rFonts w:asciiTheme="majorHAnsi" w:hAnsiTheme="majorHAnsi" w:cstheme="majorHAnsi"/>
+          <w:lang w:val="pt-BR"/>
+        </w:rPr>
+        <w:t>`.properties</w:t>
+      </w:r>
+      <w:proofErr w:type="gramEnd"/>
+      <w:r>
+        <w:rPr>
+          <w:rFonts w:asciiTheme="majorHAnsi" w:hAnsiTheme="majorHAnsi" w:cstheme="majorHAnsi"/>
+          <w:lang w:val="pt-BR"/>
+        </w:rPr>
+        <w:t>`. Confirmado contra o código-fonte oficial do Spring Boot</w:t>
       </w:r>
     </w:p>
     <w:p>
@@ -7551,7 +9109,23 @@
           <w:rFonts w:asciiTheme="majorHAnsi" w:hAnsiTheme="majorHAnsi" w:cstheme="majorHAnsi"/>
           <w:lang w:val="pt-BR"/>
         </w:rPr>
-        <w:t>`management.endpoints.web.cors` é um prefixo `@ConfigurationProperties` real. A</w:t>
+        <w:t>`</w:t>
+      </w:r>
+      <w:proofErr w:type="gramStart"/>
+      <w:r>
+        <w:rPr>
+          <w:rFonts w:asciiTheme="majorHAnsi" w:hAnsiTheme="majorHAnsi" w:cstheme="majorHAnsi"/>
+          <w:lang w:val="pt-BR"/>
+        </w:rPr>
+        <w:t>management.endpoints.web.cors</w:t>
+      </w:r>
+      <w:proofErr w:type="gramEnd"/>
+      <w:r>
+        <w:rPr>
+          <w:rFonts w:asciiTheme="majorHAnsi" w:hAnsiTheme="majorHAnsi" w:cstheme="majorHAnsi"/>
+          <w:lang w:val="pt-BR"/>
+        </w:rPr>
+        <w:t>` é um prefixo `@ConfigurationProperties` real. A</w:t>
       </w:r>
     </w:p>
     <w:p>
@@ -7583,7 +9157,23 @@
           <w:rFonts w:asciiTheme="majorHAnsi" w:hAnsiTheme="majorHAnsi" w:cstheme="majorHAnsi"/>
           <w:lang w:val="pt-BR"/>
         </w:rPr>
-        <w:t>programática — `WebMvcConfigurer.addCorsMappings()`, `@CrossOrigin`, ou XML</w:t>
+        <w:t>programática — `WebMvcConfigurer.addCorsMappings</w:t>
+      </w:r>
+      <w:proofErr w:type="gramStart"/>
+      <w:r>
+        <w:rPr>
+          <w:rFonts w:asciiTheme="majorHAnsi" w:hAnsiTheme="majorHAnsi" w:cstheme="majorHAnsi"/>
+          <w:lang w:val="pt-BR"/>
+        </w:rPr>
+        <w:t>()`</w:t>
+      </w:r>
+      <w:proofErr w:type="gramEnd"/>
+      <w:r>
+        <w:rPr>
+          <w:rFonts w:asciiTheme="majorHAnsi" w:hAnsiTheme="majorHAnsi" w:cstheme="majorHAnsi"/>
+          <w:lang w:val="pt-BR"/>
+        </w:rPr>
+        <w:t>, `@CrossOrigin`, ou XML</w:t>
       </w:r>
     </w:p>
     <w:p>
@@ -7615,7 +9205,23 @@
           <w:rFonts w:asciiTheme="majorHAnsi" w:hAnsiTheme="majorHAnsi" w:cstheme="majorHAnsi"/>
           <w:lang w:val="pt-BR"/>
         </w:rPr>
-        <w:t>`spring.mvc.cors.*`, presumindo (incorretamente — alucinação de outra IA, sem</w:t>
+        <w:t>`</w:t>
+      </w:r>
+      <w:proofErr w:type="gramStart"/>
+      <w:r>
+        <w:rPr>
+          <w:rFonts w:asciiTheme="majorHAnsi" w:hAnsiTheme="majorHAnsi" w:cstheme="majorHAnsi"/>
+          <w:lang w:val="pt-BR"/>
+        </w:rPr>
+        <w:t>spring.mvc.cors</w:t>
+      </w:r>
+      <w:proofErr w:type="gramEnd"/>
+      <w:r>
+        <w:rPr>
+          <w:rFonts w:asciiTheme="majorHAnsi" w:hAnsiTheme="majorHAnsi" w:cstheme="majorHAnsi"/>
+          <w:lang w:val="pt-BR"/>
+        </w:rPr>
+        <w:t>.*`, presumindo (incorretamente — alucinação de outra IA, sem</w:t>
       </w:r>
     </w:p>
     <w:p>
@@ -8163,7 +9769,23 @@
           <w:lang w:val="pt-BR"/>
         </w:rPr>
         <w:lastRenderedPageBreak/>
-        <w:t>pela origem estrutural da configuração: application.yml representa a configuração base, enquanto application-{profile}.yml representa uma configuração associada a um profile cujo nome deve ser preservado exatamente como definido pelo arquivo.</w:t>
+        <w:t>pela origem estrutural da configuração: application.yml representa a configuração base, enquanto application-{profile</w:t>
+      </w:r>
+      <w:proofErr w:type="gramStart"/>
+      <w:r>
+        <w:rPr>
+          <w:rFonts w:asciiTheme="majorHAnsi" w:hAnsiTheme="majorHAnsi" w:cstheme="majorHAnsi"/>
+          <w:lang w:val="pt-BR"/>
+        </w:rPr>
+        <w:t>}.yml</w:t>
+      </w:r>
+      <w:proofErr w:type="gramEnd"/>
+      <w:r>
+        <w:rPr>
+          <w:rFonts w:asciiTheme="majorHAnsi" w:hAnsiTheme="majorHAnsi" w:cstheme="majorHAnsi"/>
+          <w:lang w:val="pt-BR"/>
+        </w:rPr>
+        <w:t xml:space="preserve"> representa uma configuração associada a um profile cujo nome deve ser preservado exatamente como definido pelo arquivo.</w:t>
       </w:r>
     </w:p>
     <w:p>
@@ -8411,7 +10033,23 @@
           <w:rFonts w:asciiTheme="majorHAnsi" w:hAnsiTheme="majorHAnsi" w:cstheme="majorHAnsi"/>
           <w:lang w:val="pt-BR"/>
         </w:rPr>
-        <w:t>application-{profile}.yml deve continuar exibindo [profile: {profile}];</w:t>
+        <w:t>application-{profile</w:t>
+      </w:r>
+      <w:proofErr w:type="gramStart"/>
+      <w:r>
+        <w:rPr>
+          <w:rFonts w:asciiTheme="majorHAnsi" w:hAnsiTheme="majorHAnsi" w:cstheme="majorHAnsi"/>
+          <w:lang w:val="pt-BR"/>
+        </w:rPr>
+        <w:t>}.yml</w:t>
+      </w:r>
+      <w:proofErr w:type="gramEnd"/>
+      <w:r>
+        <w:rPr>
+          <w:rFonts w:asciiTheme="majorHAnsi" w:hAnsiTheme="majorHAnsi" w:cstheme="majorHAnsi"/>
+          <w:lang w:val="pt-BR"/>
+        </w:rPr>
+        <w:t xml:space="preserve"> deve continuar exibindo [profile: {profile}];</w:t>
       </w:r>
     </w:p>
     <w:p>
@@ -8685,11 +10323,19 @@
                 <w:lang w:val="pt-BR"/>
               </w:rPr>
             </w:pPr>
+            <w:proofErr w:type="gramStart"/>
             <w:r>
               <w:rPr>
                 <w:rFonts w:asciiTheme="majorHAnsi" w:hAnsiTheme="majorHAnsi" w:cstheme="majorHAnsi"/>
               </w:rPr>
-              <w:t>Main.run() não permite injetar PrintStream</w:t>
+              <w:t>Main.run(</w:t>
+            </w:r>
+            <w:proofErr w:type="gramEnd"/>
+            <w:r>
+              <w:rPr>
+                <w:rFonts w:asciiTheme="majorHAnsi" w:hAnsiTheme="majorHAnsi" w:cstheme="majorHAnsi"/>
+              </w:rPr>
+              <w:t>) não permite injetar PrintStream</w:t>
             </w:r>
           </w:p>
         </w:tc>
@@ -8776,7 +10422,21 @@
               <w:rPr>
                 <w:rFonts w:asciiTheme="majorHAnsi" w:hAnsiTheme="majorHAnsi" w:cstheme="majorHAnsi"/>
               </w:rPr>
-              <w:t>ConfigLoader não agrupa application.yml + application-{profile}.yml por convenção</w:t>
+              <w:t>ConfigLoader não agrupa application.yml + application-{profile</w:t>
+            </w:r>
+            <w:proofErr w:type="gramStart"/>
+            <w:r>
+              <w:rPr>
+                <w:rFonts w:asciiTheme="majorHAnsi" w:hAnsiTheme="majorHAnsi" w:cstheme="majorHAnsi"/>
+              </w:rPr>
+              <w:t>}.yml</w:t>
+            </w:r>
+            <w:proofErr w:type="gramEnd"/>
+            <w:r>
+              <w:rPr>
+                <w:rFonts w:asciiTheme="majorHAnsi" w:hAnsiTheme="majorHAnsi" w:cstheme="majorHAnsi"/>
+              </w:rPr>
+              <w:t xml:space="preserve"> por convenção</w:t>
             </w:r>
           </w:p>
         </w:tc>
@@ -9642,7 +11302,23 @@
           <w:rFonts w:asciiTheme="majorHAnsi" w:hAnsiTheme="majorHAnsi" w:cstheme="majorHAnsi"/>
           <w:lang w:val="pt-BR"/>
         </w:rPr>
-        <w:t xml:space="preserve"> (debug=true, logging.level.root=DEBUG — vaza informação em log, meio caminho andado pra um pentest)</w:t>
+        <w:t xml:space="preserve"> (debug=true, </w:t>
+      </w:r>
+      <w:proofErr w:type="gramStart"/>
+      <w:r>
+        <w:rPr>
+          <w:rFonts w:asciiTheme="majorHAnsi" w:hAnsiTheme="majorHAnsi" w:cstheme="majorHAnsi"/>
+          <w:lang w:val="pt-BR"/>
+        </w:rPr>
+        <w:t>logging.level</w:t>
+      </w:r>
+      <w:proofErr w:type="gramEnd"/>
+      <w:r>
+        <w:rPr>
+          <w:rFonts w:asciiTheme="majorHAnsi" w:hAnsiTheme="majorHAnsi" w:cstheme="majorHAnsi"/>
+          <w:lang w:val="pt-BR"/>
+        </w:rPr>
+        <w:t>.root=DEBUG — vaza informação em log, meio caminho andado pra um pentest)</w:t>
       </w:r>
     </w:p>
     <w:p>
@@ -11137,6 +12813,7 @@
   <w:style w:type="character" w:default="1" w:styleId="Fontepargpadro">
     <w:name w:val="Default Paragraph Font"/>
     <w:uiPriority w:val="1"/>
+    <w:semiHidden/>
     <w:unhideWhenUsed/>
   </w:style>
   <w:style w:type="table" w:default="1" w:styleId="Tabelanormal">

</xml_diff>

<commit_message>
feat(rules): implement SCG006 rule and configurable metadata architecture
- Add ConfigurableRule interface to standardise external YAML configuration loading.
- Refactor RuleEngine to a final class, forcing fail-fast startup validation and unifications of metadata errors under IllegalStateException.
- Enhance Main execution loop with try-catch handling around RuleEngine initialization for clean CLI error outputs.
- Implement HardcodedSecretsRule (SCG006) to detect hardcoded plaintext credentials and static placeholder fallbacks.
- Integrate RelaxedProperties.canonicalize() in SCG006 for Spring-compliant property matching.
- Integrate EnvironmentPlaceholder in SCG006 to inspect static fallback defaults (HIGH) while flagging unresolved dynamic values (INFO).
- Validate ignored value prefixes to reject '${' placeholders in metadata, preventing evaluation bypasses.
- Add src/main/resources/rule-metadata/SCG006.yml metadata configuration file.
</commit_message>
<xml_diff>
--- a/BACKLOG.docx
+++ b/BACKLOG.docx
@@ -5708,6 +5708,7 @@
           <w:rFonts w:asciiTheme="majorHAnsi" w:hAnsiTheme="majorHAnsi" w:cstheme="majorHAnsi"/>
           <w:b/>
           <w:bCs/>
+          <w:strike/>
           <w:highlight w:val="yellow"/>
           <w:lang w:val="pt-BR"/>
         </w:rPr>
@@ -5717,6 +5718,7 @@
           <w:rFonts w:asciiTheme="majorHAnsi" w:hAnsiTheme="majorHAnsi" w:cstheme="majorHAnsi"/>
           <w:b/>
           <w:bCs/>
+          <w:strike/>
           <w:highlight w:val="yellow"/>
           <w:lang w:val="pt-BR"/>
         </w:rPr>
@@ -5728,21 +5730,24 @@
         <w:spacing w:after="0"/>
         <w:rPr>
           <w:rFonts w:asciiTheme="majorHAnsi" w:hAnsiTheme="majorHAnsi" w:cstheme="majorHAnsi"/>
-          <w:lang w:val="pt-BR"/>
-        </w:rPr>
-      </w:pPr>
-    </w:p>
-    <w:p>
-      <w:pPr>
-        <w:spacing w:after="0"/>
-        <w:rPr>
-          <w:rFonts w:asciiTheme="majorHAnsi" w:hAnsiTheme="majorHAnsi" w:cstheme="majorHAnsi"/>
-          <w:lang w:val="pt-BR"/>
-        </w:rPr>
-      </w:pPr>
-      <w:r>
-        <w:rPr>
-          <w:rFonts w:asciiTheme="majorHAnsi" w:hAnsiTheme="majorHAnsi" w:cstheme="majorHAnsi"/>
+          <w:strike/>
+          <w:lang w:val="pt-BR"/>
+        </w:rPr>
+      </w:pPr>
+    </w:p>
+    <w:p>
+      <w:pPr>
+        <w:spacing w:after="0"/>
+        <w:rPr>
+          <w:rFonts w:asciiTheme="majorHAnsi" w:hAnsiTheme="majorHAnsi" w:cstheme="majorHAnsi"/>
+          <w:strike/>
+          <w:lang w:val="pt-BR"/>
+        </w:rPr>
+      </w:pPr>
+      <w:r>
+        <w:rPr>
+          <w:rFonts w:asciiTheme="majorHAnsi" w:hAnsiTheme="majorHAnsi" w:cstheme="majorHAnsi"/>
+          <w:strike/>
           <w:lang w:val="pt-BR"/>
         </w:rPr>
         <w:t>Onde: não existe hoje — feature nova, não uma correção.</w:t>
@@ -5753,21 +5758,24 @@
         <w:spacing w:after="0"/>
         <w:rPr>
           <w:rFonts w:asciiTheme="majorHAnsi" w:hAnsiTheme="majorHAnsi" w:cstheme="majorHAnsi"/>
-          <w:lang w:val="pt-BR"/>
-        </w:rPr>
-      </w:pPr>
-    </w:p>
-    <w:p>
-      <w:pPr>
-        <w:spacing w:after="0"/>
-        <w:rPr>
-          <w:rFonts w:asciiTheme="majorHAnsi" w:hAnsiTheme="majorHAnsi" w:cstheme="majorHAnsi"/>
-          <w:lang w:val="pt-BR"/>
-        </w:rPr>
-      </w:pPr>
-      <w:r>
-        <w:rPr>
-          <w:rFonts w:asciiTheme="majorHAnsi" w:hAnsiTheme="majorHAnsi" w:cstheme="majorHAnsi"/>
+          <w:strike/>
+          <w:lang w:val="pt-BR"/>
+        </w:rPr>
+      </w:pPr>
+    </w:p>
+    <w:p>
+      <w:pPr>
+        <w:spacing w:after="0"/>
+        <w:rPr>
+          <w:rFonts w:asciiTheme="majorHAnsi" w:hAnsiTheme="majorHAnsi" w:cstheme="majorHAnsi"/>
+          <w:strike/>
+          <w:lang w:val="pt-BR"/>
+        </w:rPr>
+      </w:pPr>
+      <w:r>
+        <w:rPr>
+          <w:rFonts w:asciiTheme="majorHAnsi" w:hAnsiTheme="majorHAnsi" w:cstheme="majorHAnsi"/>
+          <w:strike/>
           <w:lang w:val="pt-BR"/>
         </w:rPr>
         <w:t>Problema: nenhum mecanismo permite a um time dizer "sei que essa violação dispara,</w:t>
@@ -5778,12 +5786,14 @@
         <w:spacing w:after="0"/>
         <w:rPr>
           <w:rFonts w:asciiTheme="majorHAnsi" w:hAnsiTheme="majorHAnsi" w:cstheme="majorHAnsi"/>
-          <w:lang w:val="pt-BR"/>
-        </w:rPr>
-      </w:pPr>
-      <w:r>
-        <w:rPr>
-          <w:rFonts w:asciiTheme="majorHAnsi" w:hAnsiTheme="majorHAnsi" w:cstheme="majorHAnsi"/>
+          <w:strike/>
+          <w:lang w:val="pt-BR"/>
+        </w:rPr>
+      </w:pPr>
+      <w:r>
+        <w:rPr>
+          <w:rFonts w:asciiTheme="majorHAnsi" w:hAnsiTheme="majorHAnsi" w:cstheme="majorHAnsi"/>
+          <w:strike/>
           <w:lang w:val="pt-BR"/>
         </w:rPr>
         <w:t>é intencional, não quero que quebre meu CI". Sem isso, o primeiro falso positivo real</w:t>
@@ -5794,12 +5804,14 @@
         <w:spacing w:after="0"/>
         <w:rPr>
           <w:rFonts w:asciiTheme="majorHAnsi" w:hAnsiTheme="majorHAnsi" w:cstheme="majorHAnsi"/>
-          <w:lang w:val="pt-BR"/>
-        </w:rPr>
-      </w:pPr>
-      <w:r>
-        <w:rPr>
-          <w:rFonts w:asciiTheme="majorHAnsi" w:hAnsiTheme="majorHAnsi" w:cstheme="majorHAnsi"/>
+          <w:strike/>
+          <w:lang w:val="pt-BR"/>
+        </w:rPr>
+      </w:pPr>
+      <w:r>
+        <w:rPr>
+          <w:rFonts w:asciiTheme="majorHAnsi" w:hAnsiTheme="majorHAnsi" w:cstheme="majorHAnsi"/>
+          <w:strike/>
           <w:lang w:val="pt-BR"/>
         </w:rPr>
         <w:t>tende a levar o time a desabilitar a ferramenta inteira, em vez de silenciar o caso</w:t>
@@ -5810,12 +5822,14 @@
         <w:spacing w:after="0"/>
         <w:rPr>
           <w:rFonts w:asciiTheme="majorHAnsi" w:hAnsiTheme="majorHAnsi" w:cstheme="majorHAnsi"/>
-          <w:lang w:val="pt-BR"/>
-        </w:rPr>
-      </w:pPr>
-      <w:r>
-        <w:rPr>
-          <w:rFonts w:asciiTheme="majorHAnsi" w:hAnsiTheme="majorHAnsi" w:cstheme="majorHAnsi"/>
+          <w:strike/>
+          <w:lang w:val="pt-BR"/>
+        </w:rPr>
+      </w:pPr>
+      <w:r>
+        <w:rPr>
+          <w:rFonts w:asciiTheme="majorHAnsi" w:hAnsiTheme="majorHAnsi" w:cstheme="majorHAnsi"/>
+          <w:strike/>
           <w:lang w:val="pt-BR"/>
         </w:rPr>
         <w:t>específico.</w:t>
@@ -5826,21 +5840,24 @@
         <w:spacing w:after="0"/>
         <w:rPr>
           <w:rFonts w:asciiTheme="majorHAnsi" w:hAnsiTheme="majorHAnsi" w:cstheme="majorHAnsi"/>
-          <w:lang w:val="pt-BR"/>
-        </w:rPr>
-      </w:pPr>
-    </w:p>
-    <w:p>
-      <w:pPr>
-        <w:spacing w:after="0"/>
-        <w:rPr>
-          <w:rFonts w:asciiTheme="majorHAnsi" w:hAnsiTheme="majorHAnsi" w:cstheme="majorHAnsi"/>
-          <w:lang w:val="pt-BR"/>
-        </w:rPr>
-      </w:pPr>
-      <w:r>
-        <w:rPr>
-          <w:rFonts w:asciiTheme="majorHAnsi" w:hAnsiTheme="majorHAnsi" w:cstheme="majorHAnsi"/>
+          <w:strike/>
+          <w:lang w:val="pt-BR"/>
+        </w:rPr>
+      </w:pPr>
+    </w:p>
+    <w:p>
+      <w:pPr>
+        <w:spacing w:after="0"/>
+        <w:rPr>
+          <w:rFonts w:asciiTheme="majorHAnsi" w:hAnsiTheme="majorHAnsi" w:cstheme="majorHAnsi"/>
+          <w:strike/>
+          <w:lang w:val="pt-BR"/>
+        </w:rPr>
+      </w:pPr>
+      <w:r>
+        <w:rPr>
+          <w:rFonts w:asciiTheme="majorHAnsi" w:hAnsiTheme="majorHAnsi" w:cstheme="majorHAnsi"/>
+          <w:strike/>
           <w:lang w:val="pt-BR"/>
         </w:rPr>
         <w:t>Por que foi adiado: a granularidade certa (por regra? por arquivo? por profile? por</w:t>
@@ -5851,12 +5868,14 @@
         <w:spacing w:after="0"/>
         <w:rPr>
           <w:rFonts w:asciiTheme="majorHAnsi" w:hAnsiTheme="majorHAnsi" w:cstheme="majorHAnsi"/>
-          <w:lang w:val="pt-BR"/>
-        </w:rPr>
-      </w:pPr>
-      <w:r>
-        <w:rPr>
-          <w:rFonts w:asciiTheme="majorHAnsi" w:hAnsiTheme="majorHAnsi" w:cstheme="majorHAnsi"/>
+          <w:strike/>
+          <w:lang w:val="pt-BR"/>
+        </w:rPr>
+      </w:pPr>
+      <w:r>
+        <w:rPr>
+          <w:rFonts w:asciiTheme="majorHAnsi" w:hAnsiTheme="majorHAnsi" w:cstheme="majorHAnsi"/>
+          <w:strike/>
           <w:lang w:val="pt-BR"/>
         </w:rPr>
         <w:t>linha?) é uma decisão de UX de ferramenta, que se acerta observando fricção real de</w:t>
@@ -5867,12 +5886,14 @@
         <w:spacing w:after="0"/>
         <w:rPr>
           <w:rFonts w:asciiTheme="majorHAnsi" w:hAnsiTheme="majorHAnsi" w:cstheme="majorHAnsi"/>
-          <w:lang w:val="pt-BR"/>
-        </w:rPr>
-      </w:pPr>
-      <w:r>
-        <w:rPr>
-          <w:rFonts w:asciiTheme="majorHAnsi" w:hAnsiTheme="majorHAnsi" w:cstheme="majorHAnsi"/>
+          <w:strike/>
+          <w:lang w:val="pt-BR"/>
+        </w:rPr>
+      </w:pPr>
+      <w:r>
+        <w:rPr>
+          <w:rFonts w:asciiTheme="majorHAnsi" w:hAnsiTheme="majorHAnsi" w:cstheme="majorHAnsi"/>
+          <w:strike/>
           <w:lang w:val="pt-BR"/>
         </w:rPr>
         <w:t>falsos positivos vividos por usuários de verdade, não em teoria. Nenhum falso positivo</w:t>
@@ -5883,12 +5904,14 @@
         <w:spacing w:after="0"/>
         <w:rPr>
           <w:rFonts w:asciiTheme="majorHAnsi" w:hAnsiTheme="majorHAnsi" w:cstheme="majorHAnsi"/>
-          <w:lang w:val="pt-BR"/>
-        </w:rPr>
-      </w:pPr>
-      <w:r>
-        <w:rPr>
-          <w:rFonts w:asciiTheme="majorHAnsi" w:hAnsiTheme="majorHAnsi" w:cstheme="majorHAnsi"/>
+          <w:strike/>
+          <w:lang w:val="pt-BR"/>
+        </w:rPr>
+      </w:pPr>
+      <w:r>
+        <w:rPr>
+          <w:rFonts w:asciiTheme="majorHAnsi" w:hAnsiTheme="majorHAnsi" w:cstheme="majorHAnsi"/>
+          <w:strike/>
           <w:lang w:val="pt-BR"/>
         </w:rPr>
         <w:t>real (só hipotéticos/registrados como backlog) foi vivido até agora.</w:t>
@@ -5899,21 +5922,24 @@
         <w:spacing w:after="0"/>
         <w:rPr>
           <w:rFonts w:asciiTheme="majorHAnsi" w:hAnsiTheme="majorHAnsi" w:cstheme="majorHAnsi"/>
-          <w:lang w:val="pt-BR"/>
-        </w:rPr>
-      </w:pPr>
-    </w:p>
-    <w:p>
-      <w:pPr>
-        <w:spacing w:after="0"/>
-        <w:rPr>
-          <w:rFonts w:asciiTheme="majorHAnsi" w:hAnsiTheme="majorHAnsi" w:cstheme="majorHAnsi"/>
-          <w:lang w:val="pt-BR"/>
-        </w:rPr>
-      </w:pPr>
-      <w:r>
-        <w:rPr>
-          <w:rFonts w:asciiTheme="majorHAnsi" w:hAnsiTheme="majorHAnsi" w:cstheme="majorHAnsi"/>
+          <w:strike/>
+          <w:lang w:val="pt-BR"/>
+        </w:rPr>
+      </w:pPr>
+    </w:p>
+    <w:p>
+      <w:pPr>
+        <w:spacing w:after="0"/>
+        <w:rPr>
+          <w:rFonts w:asciiTheme="majorHAnsi" w:hAnsiTheme="majorHAnsi" w:cstheme="majorHAnsi"/>
+          <w:strike/>
+          <w:lang w:val="pt-BR"/>
+        </w:rPr>
+      </w:pPr>
+      <w:r>
+        <w:rPr>
+          <w:rFonts w:asciiTheme="majorHAnsi" w:hAnsiTheme="majorHAnsi" w:cstheme="majorHAnsi"/>
+          <w:strike/>
           <w:lang w:val="pt-BR"/>
         </w:rPr>
         <w:t>Custo de correção estimado: médio-alto, depende do design de granularidade.</w:t>
@@ -5924,21 +5950,24 @@
         <w:spacing w:after="0"/>
         <w:rPr>
           <w:rFonts w:asciiTheme="majorHAnsi" w:hAnsiTheme="majorHAnsi" w:cstheme="majorHAnsi"/>
-          <w:lang w:val="pt-BR"/>
-        </w:rPr>
-      </w:pPr>
-    </w:p>
-    <w:p>
-      <w:pPr>
-        <w:spacing w:after="0"/>
-        <w:rPr>
-          <w:rFonts w:asciiTheme="majorHAnsi" w:hAnsiTheme="majorHAnsi" w:cstheme="majorHAnsi"/>
-          <w:lang w:val="pt-BR"/>
-        </w:rPr>
-      </w:pPr>
-      <w:r>
-        <w:rPr>
-          <w:rFonts w:asciiTheme="majorHAnsi" w:hAnsiTheme="majorHAnsi" w:cstheme="majorHAnsi"/>
+          <w:strike/>
+          <w:lang w:val="pt-BR"/>
+        </w:rPr>
+      </w:pPr>
+    </w:p>
+    <w:p>
+      <w:pPr>
+        <w:spacing w:after="0"/>
+        <w:rPr>
+          <w:rFonts w:asciiTheme="majorHAnsi" w:hAnsiTheme="majorHAnsi" w:cstheme="majorHAnsi"/>
+          <w:strike/>
+          <w:lang w:val="pt-BR"/>
+        </w:rPr>
+      </w:pPr>
+      <w:r>
+        <w:rPr>
+          <w:rFonts w:asciiTheme="majorHAnsi" w:hAnsiTheme="majorHAnsi" w:cstheme="majorHAnsi"/>
+          <w:strike/>
           <w:lang w:val="pt-BR"/>
         </w:rPr>
         <w:t>Status: registrado, não iniciado. Compartilha superfície de configuração com</w:t>
@@ -5949,12 +5978,14 @@
         <w:spacing w:after="0"/>
         <w:rPr>
           <w:rFonts w:asciiTheme="majorHAnsi" w:hAnsiTheme="majorHAnsi" w:cstheme="majorHAnsi"/>
-          <w:lang w:val="pt-BR"/>
-        </w:rPr>
-      </w:pPr>
-      <w:r>
-        <w:rPr>
-          <w:rFonts w:asciiTheme="majorHAnsi" w:hAnsiTheme="majorHAnsi" w:cstheme="majorHAnsi"/>
+          <w:strike/>
+          <w:lang w:val="pt-BR"/>
+        </w:rPr>
+      </w:pPr>
+      <w:r>
+        <w:rPr>
+          <w:rFonts w:asciiTheme="majorHAnsi" w:hAnsiTheme="majorHAnsi" w:cstheme="majorHAnsi"/>
+          <w:strike/>
           <w:lang w:val="pt-BR"/>
         </w:rPr>
         <w:t xml:space="preserve">BL-17 — </w:t>
@@ -5963,6 +5994,7 @@
       <w:r>
         <w:rPr>
           <w:rFonts w:asciiTheme="majorHAnsi" w:hAnsiTheme="majorHAnsi" w:cstheme="majorHAnsi"/>
+          <w:strike/>
           <w:lang w:val="pt-BR"/>
         </w:rPr>
         <w:t>mesmo</w:t>
@@ -5971,6 +6003,7 @@
       <w:r>
         <w:rPr>
           <w:rFonts w:asciiTheme="majorHAnsi" w:hAnsiTheme="majorHAnsi" w:cstheme="majorHAnsi"/>
+          <w:strike/>
           <w:lang w:val="pt-BR"/>
         </w:rPr>
         <w:t xml:space="preserve"> arquivo (</w:t>
@@ -5979,6 +6012,7 @@
       <w:r>
         <w:rPr>
           <w:rFonts w:asciiTheme="majorHAnsi" w:hAnsiTheme="majorHAnsi" w:cstheme="majorHAnsi"/>
+          <w:strike/>
           <w:lang w:val="pt-BR"/>
         </w:rPr>
         <w:t>`.spring-config-guard.yml</w:t>
@@ -5987,6 +6021,7 @@
       <w:r>
         <w:rPr>
           <w:rFonts w:asciiTheme="majorHAnsi" w:hAnsiTheme="majorHAnsi" w:cstheme="majorHAnsi"/>
+          <w:strike/>
           <w:lang w:val="pt-BR"/>
         </w:rPr>
         <w:t>` ou nome a definir), evitando duas</w:t>
@@ -5997,12 +6032,14 @@
         <w:spacing w:after="0"/>
         <w:rPr>
           <w:rFonts w:asciiTheme="majorHAnsi" w:hAnsiTheme="majorHAnsi" w:cstheme="majorHAnsi"/>
-          <w:lang w:val="pt-BR"/>
-        </w:rPr>
-      </w:pPr>
-      <w:r>
-        <w:rPr>
-          <w:rFonts w:asciiTheme="majorHAnsi" w:hAnsiTheme="majorHAnsi" w:cstheme="majorHAnsi"/>
+          <w:strike/>
+          <w:lang w:val="pt-BR"/>
+        </w:rPr>
+      </w:pPr>
+      <w:r>
+        <w:rPr>
+          <w:rFonts w:asciiTheme="majorHAnsi" w:hAnsiTheme="majorHAnsi" w:cstheme="majorHAnsi"/>
+          <w:strike/>
           <w:lang w:val="pt-BR"/>
         </w:rPr>
         <w:t>fontes de config diferentes pro usuário aprender. Desenhar os dois juntos quando o</w:t>
@@ -6013,12 +6050,14 @@
         <w:spacing w:after="0"/>
         <w:rPr>
           <w:rFonts w:asciiTheme="majorHAnsi" w:hAnsiTheme="majorHAnsi" w:cstheme="majorHAnsi"/>
-          <w:lang w:val="pt-BR"/>
-        </w:rPr>
-      </w:pPr>
-      <w:r>
-        <w:rPr>
-          <w:rFonts w:asciiTheme="majorHAnsi" w:hAnsiTheme="majorHAnsi" w:cstheme="majorHAnsi"/>
+          <w:strike/>
+          <w:lang w:val="pt-BR"/>
+        </w:rPr>
+      </w:pPr>
+      <w:r>
+        <w:rPr>
+          <w:rFonts w:asciiTheme="majorHAnsi" w:hAnsiTheme="majorHAnsi" w:cstheme="majorHAnsi"/>
+          <w:strike/>
           <w:lang w:val="pt-BR"/>
         </w:rPr>
         <w:t>momento chegar, não em isolamento.</w:t>
@@ -10142,6 +10181,1041 @@
           <w:lang w:val="pt-BR"/>
         </w:rPr>
         <w:t>Status: registrado, não iniciado.</w:t>
+      </w:r>
+    </w:p>
+    <w:p>
+      <w:pPr>
+        <w:spacing w:after="0"/>
+        <w:rPr>
+          <w:rFonts w:asciiTheme="majorHAnsi" w:hAnsiTheme="majorHAnsi" w:cstheme="majorHAnsi"/>
+          <w:lang w:val="pt-BR"/>
+        </w:rPr>
+      </w:pPr>
+      <w:r>
+        <w:rPr>
+          <w:rFonts w:asciiTheme="majorHAnsi" w:hAnsiTheme="majorHAnsi" w:cstheme="majorHAnsi"/>
+          <w:lang w:val="pt-BR"/>
+        </w:rPr>
+        <w:br w:type="page"/>
+      </w:r>
+    </w:p>
+    <w:p>
+      <w:pPr>
+        <w:spacing w:after="0"/>
+        <w:rPr>
+          <w:rFonts w:asciiTheme="majorHAnsi" w:hAnsiTheme="majorHAnsi" w:cstheme="majorHAnsi"/>
+          <w:b/>
+          <w:bCs/>
+          <w:lang w:val="pt-BR"/>
+        </w:rPr>
+      </w:pPr>
+      <w:r>
+        <w:rPr>
+          <w:rFonts w:asciiTheme="majorHAnsi" w:hAnsiTheme="majorHAnsi" w:cstheme="majorHAnsi"/>
+          <w:b/>
+          <w:bCs/>
+          <w:lang w:val="pt-BR"/>
+        </w:rPr>
+        <w:lastRenderedPageBreak/>
+        <w:t xml:space="preserve"> </w:t>
+      </w:r>
+      <w:r>
+        <w:rPr>
+          <w:rFonts w:asciiTheme="majorHAnsi" w:hAnsiTheme="majorHAnsi" w:cstheme="majorHAnsi"/>
+          <w:b/>
+          <w:bCs/>
+          <w:highlight w:val="yellow"/>
+          <w:lang w:val="pt-BR"/>
+        </w:rPr>
+        <w:t>BL-23 — Camada de Policy: supressão binária de findings por regra + profile</w:t>
+      </w:r>
+    </w:p>
+    <w:p>
+      <w:pPr>
+        <w:spacing w:after="0"/>
+        <w:rPr>
+          <w:rFonts w:asciiTheme="majorHAnsi" w:hAnsiTheme="majorHAnsi" w:cstheme="majorHAnsi"/>
+          <w:lang w:val="pt-BR"/>
+        </w:rPr>
+      </w:pPr>
+    </w:p>
+    <w:p>
+      <w:pPr>
+        <w:spacing w:after="0"/>
+        <w:rPr>
+          <w:rFonts w:asciiTheme="majorHAnsi" w:hAnsiTheme="majorHAnsi" w:cstheme="majorHAnsi"/>
+          <w:lang w:val="pt-BR"/>
+        </w:rPr>
+      </w:pPr>
+      <w:r>
+        <w:rPr>
+          <w:rFonts w:asciiTheme="majorHAnsi" w:hAnsiTheme="majorHAnsi" w:cstheme="majorHAnsi"/>
+          <w:lang w:val="pt-BR"/>
+        </w:rPr>
+        <w:t>Onde: não existe hoje — feature nova. Formaliza e substitui o BL-16 original</w:t>
+      </w:r>
+    </w:p>
+    <w:p>
+      <w:pPr>
+        <w:spacing w:after="0"/>
+        <w:rPr>
+          <w:rFonts w:asciiTheme="majorHAnsi" w:hAnsiTheme="majorHAnsi" w:cstheme="majorHAnsi"/>
+          <w:lang w:val="pt-BR"/>
+        </w:rPr>
+      </w:pPr>
+      <w:r>
+        <w:rPr>
+          <w:rFonts w:asciiTheme="majorHAnsi" w:hAnsiTheme="majorHAnsi" w:cstheme="majorHAnsi"/>
+          <w:lang w:val="pt-BR"/>
+        </w:rPr>
+        <w:t>(mecanismo de supressão de falsos positivos), que ficava genérico demais; esta</w:t>
+      </w:r>
+    </w:p>
+    <w:p>
+      <w:pPr>
+        <w:spacing w:after="0"/>
+        <w:rPr>
+          <w:rFonts w:asciiTheme="majorHAnsi" w:hAnsiTheme="majorHAnsi" w:cstheme="majorHAnsi"/>
+          <w:lang w:val="pt-BR"/>
+        </w:rPr>
+      </w:pPr>
+      <w:r>
+        <w:rPr>
+          <w:rFonts w:asciiTheme="majorHAnsi" w:hAnsiTheme="majorHAnsi" w:cstheme="majorHAnsi"/>
+          <w:lang w:val="pt-BR"/>
+        </w:rPr>
+        <w:t>entrada registra o design concreto já decidido em sessão.</w:t>
+      </w:r>
+    </w:p>
+    <w:p>
+      <w:pPr>
+        <w:spacing w:after="0"/>
+        <w:rPr>
+          <w:rFonts w:asciiTheme="majorHAnsi" w:hAnsiTheme="majorHAnsi" w:cstheme="majorHAnsi"/>
+          <w:lang w:val="pt-BR"/>
+        </w:rPr>
+      </w:pPr>
+    </w:p>
+    <w:p>
+      <w:pPr>
+        <w:spacing w:after="0"/>
+        <w:rPr>
+          <w:rFonts w:asciiTheme="majorHAnsi" w:hAnsiTheme="majorHAnsi" w:cstheme="majorHAnsi"/>
+          <w:lang w:val="pt-BR"/>
+        </w:rPr>
+      </w:pPr>
+      <w:r>
+        <w:rPr>
+          <w:rFonts w:asciiTheme="majorHAnsi" w:hAnsiTheme="majorHAnsi" w:cstheme="majorHAnsi"/>
+          <w:lang w:val="pt-BR"/>
+        </w:rPr>
+        <w:t>Motivação: discussão em torno do design da SCG006 revelou que as regras do</w:t>
+      </w:r>
+    </w:p>
+    <w:p>
+      <w:pPr>
+        <w:spacing w:after="0"/>
+        <w:rPr>
+          <w:rFonts w:asciiTheme="majorHAnsi" w:hAnsiTheme="majorHAnsi" w:cstheme="majorHAnsi"/>
+          <w:lang w:val="pt-BR"/>
+        </w:rPr>
+      </w:pPr>
+      <w:r>
+        <w:rPr>
+          <w:rFonts w:asciiTheme="majorHAnsi" w:hAnsiTheme="majorHAnsi" w:cstheme="majorHAnsi"/>
+          <w:lang w:val="pt-BR"/>
+        </w:rPr>
+        <w:t>projeto são — e devem continuar sendo — agnósticas a profile: recebem uma</w:t>
+      </w:r>
+    </w:p>
+    <w:p>
+      <w:pPr>
+        <w:spacing w:after="0"/>
+        <w:rPr>
+          <w:rFonts w:asciiTheme="majorHAnsi" w:hAnsiTheme="majorHAnsi" w:cstheme="majorHAnsi"/>
+          <w:lang w:val="pt-BR"/>
+        </w:rPr>
+      </w:pPr>
+      <w:r>
+        <w:rPr>
+          <w:rFonts w:asciiTheme="majorHAnsi" w:hAnsiTheme="majorHAnsi" w:cstheme="majorHAnsi"/>
+          <w:lang w:val="pt-BR"/>
+        </w:rPr>
+        <w:t>EffectiveConfig, avaliam, emitem Finding com severidade fixa definida pela</w:t>
+      </w:r>
+    </w:p>
+    <w:p>
+      <w:pPr>
+        <w:spacing w:after="0"/>
+        <w:rPr>
+          <w:rFonts w:asciiTheme="majorHAnsi" w:hAnsiTheme="majorHAnsi" w:cstheme="majorHAnsi"/>
+          <w:lang w:val="pt-BR"/>
+        </w:rPr>
+      </w:pPr>
+      <w:r>
+        <w:rPr>
+          <w:rFonts w:asciiTheme="majorHAnsi" w:hAnsiTheme="majorHAnsi" w:cstheme="majorHAnsi"/>
+          <w:lang w:val="pt-BR"/>
+        </w:rPr>
+        <w:t>própria regra, sem embutir política de "profile X merece menos rigor". Decisões</w:t>
+      </w:r>
+    </w:p>
+    <w:p>
+      <w:pPr>
+        <w:spacing w:after="0"/>
+        <w:rPr>
+          <w:rFonts w:asciiTheme="majorHAnsi" w:hAnsiTheme="majorHAnsi" w:cstheme="majorHAnsi"/>
+          <w:lang w:val="pt-BR"/>
+        </w:rPr>
+      </w:pPr>
+      <w:r>
+        <w:rPr>
+          <w:rFonts w:asciiTheme="majorHAnsi" w:hAnsiTheme="majorHAnsi" w:cstheme="majorHAnsi"/>
+          <w:lang w:val="pt-BR"/>
+        </w:rPr>
+        <w:t>desse tipo (ex: "aceitamos segredo hardcoded em dev") pertencem a cada time</w:t>
+      </w:r>
+    </w:p>
+    <w:p>
+      <w:pPr>
+        <w:spacing w:after="0"/>
+        <w:rPr>
+          <w:rFonts w:asciiTheme="majorHAnsi" w:hAnsiTheme="majorHAnsi" w:cstheme="majorHAnsi"/>
+          <w:lang w:val="pt-BR"/>
+        </w:rPr>
+      </w:pPr>
+      <w:r>
+        <w:rPr>
+          <w:rFonts w:asciiTheme="majorHAnsi" w:hAnsiTheme="majorHAnsi" w:cstheme="majorHAnsi"/>
+          <w:lang w:val="pt-BR"/>
+        </w:rPr>
+        <w:t>analisado, não à ferramenta — por isso saem da regra e viram uma camada</w:t>
+      </w:r>
+    </w:p>
+    <w:p>
+      <w:pPr>
+        <w:spacing w:after="0"/>
+        <w:rPr>
+          <w:rFonts w:asciiTheme="majorHAnsi" w:hAnsiTheme="majorHAnsi" w:cstheme="majorHAnsi"/>
+          <w:lang w:val="pt-BR"/>
+        </w:rPr>
+      </w:pPr>
+      <w:r>
+        <w:rPr>
+          <w:rFonts w:asciiTheme="majorHAnsi" w:hAnsiTheme="majorHAnsi" w:cstheme="majorHAnsi"/>
+          <w:lang w:val="pt-BR"/>
+        </w:rPr>
+        <w:t>separada, pós-avaliação.</w:t>
+      </w:r>
+    </w:p>
+    <w:p>
+      <w:pPr>
+        <w:spacing w:after="0"/>
+        <w:rPr>
+          <w:rFonts w:asciiTheme="majorHAnsi" w:hAnsiTheme="majorHAnsi" w:cstheme="majorHAnsi"/>
+          <w:lang w:val="pt-BR"/>
+        </w:rPr>
+      </w:pPr>
+    </w:p>
+    <w:p>
+      <w:pPr>
+        <w:spacing w:after="0"/>
+        <w:rPr>
+          <w:rFonts w:asciiTheme="majorHAnsi" w:hAnsiTheme="majorHAnsi" w:cstheme="majorHAnsi"/>
+          <w:lang w:val="pt-BR"/>
+        </w:rPr>
+      </w:pPr>
+      <w:r>
+        <w:rPr>
+          <w:rFonts w:asciiTheme="majorHAnsi" w:hAnsiTheme="majorHAnsi" w:cstheme="majorHAnsi"/>
+          <w:lang w:val="pt-BR"/>
+        </w:rPr>
+        <w:t>Design confirmado em sessão:</w:t>
+      </w:r>
+    </w:p>
+    <w:p>
+      <w:pPr>
+        <w:spacing w:after="0"/>
+        <w:rPr>
+          <w:rFonts w:asciiTheme="majorHAnsi" w:hAnsiTheme="majorHAnsi" w:cstheme="majorHAnsi"/>
+          <w:lang w:val="pt-BR"/>
+        </w:rPr>
+      </w:pPr>
+      <w:r>
+        <w:rPr>
+          <w:rFonts w:asciiTheme="majorHAnsi" w:hAnsiTheme="majorHAnsi" w:cstheme="majorHAnsi"/>
+          <w:lang w:val="pt-BR"/>
+        </w:rPr>
+        <w:t xml:space="preserve">1. Posição no pipeline: entre </w:t>
+      </w:r>
+      <w:proofErr w:type="gramStart"/>
+      <w:r>
+        <w:rPr>
+          <w:rFonts w:asciiTheme="majorHAnsi" w:hAnsiTheme="majorHAnsi" w:cstheme="majorHAnsi"/>
+          <w:lang w:val="pt-BR"/>
+        </w:rPr>
+        <w:t>RuleEngine.run(</w:t>
+      </w:r>
+      <w:proofErr w:type="gramEnd"/>
+      <w:r>
+        <w:rPr>
+          <w:rFonts w:asciiTheme="majorHAnsi" w:hAnsiTheme="majorHAnsi" w:cstheme="majorHAnsi"/>
+          <w:lang w:val="pt-BR"/>
+        </w:rPr>
+        <w:t>) (produz List&lt;Finding&gt;) e</w:t>
+      </w:r>
+    </w:p>
+    <w:p>
+      <w:pPr>
+        <w:spacing w:after="0"/>
+        <w:rPr>
+          <w:rFonts w:asciiTheme="majorHAnsi" w:hAnsiTheme="majorHAnsi" w:cstheme="majorHAnsi"/>
+          <w:lang w:val="pt-BR"/>
+        </w:rPr>
+      </w:pPr>
+      <w:r>
+        <w:rPr>
+          <w:rFonts w:asciiTheme="majorHAnsi" w:hAnsiTheme="majorHAnsi" w:cstheme="majorHAnsi"/>
+          <w:lang w:val="pt-BR"/>
+        </w:rPr>
+        <w:t xml:space="preserve">   Reporter/ExitCodeResolver. Policy filtra a lista antes que qualquer</w:t>
+      </w:r>
+    </w:p>
+    <w:p>
+      <w:pPr>
+        <w:spacing w:after="0"/>
+        <w:rPr>
+          <w:rFonts w:asciiTheme="majorHAnsi" w:hAnsiTheme="majorHAnsi" w:cstheme="majorHAnsi"/>
+          <w:lang w:val="pt-BR"/>
+        </w:rPr>
+      </w:pPr>
+      <w:r>
+        <w:rPr>
+          <w:rFonts w:asciiTheme="majorHAnsi" w:hAnsiTheme="majorHAnsi" w:cstheme="majorHAnsi"/>
+          <w:lang w:val="pt-BR"/>
+        </w:rPr>
+        <w:t xml:space="preserve">   consumidor downstream a veja — Reporter e ExitCodeResolver não precisam</w:t>
+      </w:r>
+    </w:p>
+    <w:p>
+      <w:pPr>
+        <w:spacing w:after="0"/>
+        <w:rPr>
+          <w:rFonts w:asciiTheme="majorHAnsi" w:hAnsiTheme="majorHAnsi" w:cstheme="majorHAnsi"/>
+          <w:lang w:val="pt-BR"/>
+        </w:rPr>
+      </w:pPr>
+      <w:r>
+        <w:rPr>
+          <w:rFonts w:asciiTheme="majorHAnsi" w:hAnsiTheme="majorHAnsi" w:cstheme="majorHAnsi"/>
+          <w:lang w:val="pt-BR"/>
+        </w:rPr>
+        <w:t xml:space="preserve">   saber que política existe.</w:t>
+      </w:r>
+    </w:p>
+    <w:p>
+      <w:pPr>
+        <w:spacing w:after="0"/>
+        <w:rPr>
+          <w:rFonts w:asciiTheme="majorHAnsi" w:hAnsiTheme="majorHAnsi" w:cstheme="majorHAnsi"/>
+          <w:lang w:val="pt-BR"/>
+        </w:rPr>
+      </w:pPr>
+      <w:r>
+        <w:rPr>
+          <w:rFonts w:asciiTheme="majorHAnsi" w:hAnsiTheme="majorHAnsi" w:cstheme="majorHAnsi"/>
+          <w:lang w:val="pt-BR"/>
+        </w:rPr>
+        <w:t>2. Escopo inicial: supressão binária apenas (ignora o finding inteiro).</w:t>
+      </w:r>
+    </w:p>
+    <w:p>
+      <w:pPr>
+        <w:spacing w:after="0"/>
+        <w:rPr>
+          <w:rFonts w:asciiTheme="majorHAnsi" w:hAnsiTheme="majorHAnsi" w:cstheme="majorHAnsi"/>
+          <w:lang w:val="pt-BR"/>
+        </w:rPr>
+      </w:pPr>
+      <w:r>
+        <w:rPr>
+          <w:rFonts w:asciiTheme="majorHAnsi" w:hAnsiTheme="majorHAnsi" w:cstheme="majorHAnsi"/>
+          <w:lang w:val="pt-BR"/>
+        </w:rPr>
+        <w:t xml:space="preserve">   Ajuste gradual de severidade (rebaixar em vez de suprimir) foi cogitado e</w:t>
+      </w:r>
+    </w:p>
+    <w:p>
+      <w:pPr>
+        <w:spacing w:after="0"/>
+        <w:rPr>
+          <w:rFonts w:asciiTheme="majorHAnsi" w:hAnsiTheme="majorHAnsi" w:cstheme="majorHAnsi"/>
+          <w:lang w:val="pt-BR"/>
+        </w:rPr>
+      </w:pPr>
+      <w:r>
+        <w:rPr>
+          <w:rFonts w:asciiTheme="majorHAnsi" w:hAnsiTheme="majorHAnsi" w:cstheme="majorHAnsi"/>
+          <w:lang w:val="pt-BR"/>
+        </w:rPr>
+        <w:t xml:space="preserve">   deliberadamente adiado — mesmo raciocínio YAGNI já aplicado a</w:t>
+      </w:r>
+    </w:p>
+    <w:p>
+      <w:pPr>
+        <w:spacing w:after="0"/>
+        <w:rPr>
+          <w:rFonts w:asciiTheme="majorHAnsi" w:hAnsiTheme="majorHAnsi" w:cstheme="majorHAnsi"/>
+          <w:lang w:val="pt-BR"/>
+        </w:rPr>
+      </w:pPr>
+      <w:r>
+        <w:rPr>
+          <w:rFonts w:asciiTheme="majorHAnsi" w:hAnsiTheme="majorHAnsi" w:cstheme="majorHAnsi"/>
+          <w:lang w:val="pt-BR"/>
+        </w:rPr>
+        <w:t xml:space="preserve">   SafeProfileClassifier/RelaxedBoolean: não generalizar antes de uma segunda</w:t>
+      </w:r>
+    </w:p>
+    <w:p>
+      <w:pPr>
+        <w:spacing w:after="0"/>
+        <w:rPr>
+          <w:rFonts w:asciiTheme="majorHAnsi" w:hAnsiTheme="majorHAnsi" w:cstheme="majorHAnsi"/>
+          <w:lang w:val="pt-BR"/>
+        </w:rPr>
+      </w:pPr>
+      <w:r>
+        <w:rPr>
+          <w:rFonts w:asciiTheme="majorHAnsi" w:hAnsiTheme="majorHAnsi" w:cstheme="majorHAnsi"/>
+          <w:lang w:val="pt-BR"/>
+        </w:rPr>
+        <w:t xml:space="preserve">   necessidade real aparecer.</w:t>
+      </w:r>
+    </w:p>
+    <w:p>
+      <w:pPr>
+        <w:spacing w:after="0"/>
+        <w:rPr>
+          <w:rFonts w:asciiTheme="majorHAnsi" w:hAnsiTheme="majorHAnsi" w:cstheme="majorHAnsi"/>
+          <w:lang w:val="pt-BR"/>
+        </w:rPr>
+      </w:pPr>
+      <w:r>
+        <w:rPr>
+          <w:rFonts w:asciiTheme="majorHAnsi" w:hAnsiTheme="majorHAnsi" w:cstheme="majorHAnsi"/>
+          <w:lang w:val="pt-BR"/>
+        </w:rPr>
+        <w:t>3. Granularidade: por regra + profile (não só por profile) — motivação</w:t>
+      </w:r>
+    </w:p>
+    <w:p>
+      <w:pPr>
+        <w:spacing w:after="0"/>
+        <w:rPr>
+          <w:rFonts w:asciiTheme="majorHAnsi" w:hAnsiTheme="majorHAnsi" w:cstheme="majorHAnsi"/>
+          <w:lang w:val="pt-BR"/>
+        </w:rPr>
+      </w:pPr>
+      <w:r>
+        <w:rPr>
+          <w:rFonts w:asciiTheme="majorHAnsi" w:hAnsiTheme="majorHAnsi" w:cstheme="majorHAnsi"/>
+          <w:lang w:val="pt-BR"/>
+        </w:rPr>
+        <w:t xml:space="preserve">   explícita: um time pode querer manter algumas regras ativas mesmo em</w:t>
+      </w:r>
+    </w:p>
+    <w:p>
+      <w:pPr>
+        <w:spacing w:after="0"/>
+        <w:rPr>
+          <w:rFonts w:asciiTheme="majorHAnsi" w:hAnsiTheme="majorHAnsi" w:cstheme="majorHAnsi"/>
+          <w:lang w:val="pt-BR"/>
+        </w:rPr>
+      </w:pPr>
+      <w:r>
+        <w:rPr>
+          <w:rFonts w:asciiTheme="majorHAnsi" w:hAnsiTheme="majorHAnsi" w:cstheme="majorHAnsi"/>
+          <w:lang w:val="pt-BR"/>
+        </w:rPr>
+        <w:t xml:space="preserve">   profiles seguros (ex: SCG002 suprimida em dev, mas SCG006 continua ativa</w:t>
+      </w:r>
+    </w:p>
+    <w:p>
+      <w:pPr>
+        <w:spacing w:after="0"/>
+        <w:rPr>
+          <w:rFonts w:asciiTheme="majorHAnsi" w:hAnsiTheme="majorHAnsi" w:cstheme="majorHAnsi"/>
+          <w:lang w:val="pt-BR"/>
+        </w:rPr>
+      </w:pPr>
+      <w:r>
+        <w:rPr>
+          <w:rFonts w:asciiTheme="majorHAnsi" w:hAnsiTheme="majorHAnsi" w:cstheme="majorHAnsi"/>
+          <w:lang w:val="pt-BR"/>
+        </w:rPr>
+        <w:t xml:space="preserve">   em dev).</w:t>
+      </w:r>
+    </w:p>
+    <w:p>
+      <w:pPr>
+        <w:spacing w:after="0"/>
+        <w:rPr>
+          <w:rFonts w:asciiTheme="majorHAnsi" w:hAnsiTheme="majorHAnsi" w:cstheme="majorHAnsi"/>
+          <w:lang w:val="pt-BR"/>
+        </w:rPr>
+      </w:pPr>
+    </w:p>
+    <w:p>
+      <w:pPr>
+        <w:spacing w:after="0"/>
+        <w:rPr>
+          <w:rFonts w:asciiTheme="majorHAnsi" w:hAnsiTheme="majorHAnsi" w:cstheme="majorHAnsi"/>
+          <w:lang w:val="pt-BR"/>
+        </w:rPr>
+      </w:pPr>
+      <w:r>
+        <w:rPr>
+          <w:rFonts w:asciiTheme="majorHAnsi" w:hAnsiTheme="majorHAnsi" w:cstheme="majorHAnsi"/>
+          <w:lang w:val="pt-BR"/>
+        </w:rPr>
+        <w:t>Em aberto, não decidido ainda:</w:t>
+      </w:r>
+    </w:p>
+    <w:p>
+      <w:pPr>
+        <w:spacing w:after="0"/>
+        <w:rPr>
+          <w:rFonts w:asciiTheme="majorHAnsi" w:hAnsiTheme="majorHAnsi" w:cstheme="majorHAnsi"/>
+          <w:lang w:val="pt-BR"/>
+        </w:rPr>
+      </w:pPr>
+      <w:r>
+        <w:rPr>
+          <w:rFonts w:asciiTheme="majorHAnsi" w:hAnsiTheme="majorHAnsi" w:cstheme="majorHAnsi"/>
+          <w:lang w:val="pt-BR"/>
+        </w:rPr>
+        <w:t>- Onde o arquivo de política mora. Diferente de rule-metadata/*.yml (metadado</w:t>
+      </w:r>
+    </w:p>
+    <w:p>
+      <w:pPr>
+        <w:spacing w:after="0"/>
+        <w:rPr>
+          <w:rFonts w:asciiTheme="majorHAnsi" w:hAnsiTheme="majorHAnsi" w:cstheme="majorHAnsi"/>
+          <w:lang w:val="pt-BR"/>
+        </w:rPr>
+      </w:pPr>
+      <w:r>
+        <w:rPr>
+          <w:rFonts w:asciiTheme="majorHAnsi" w:hAnsiTheme="majorHAnsi" w:cstheme="majorHAnsi"/>
+          <w:lang w:val="pt-BR"/>
+        </w:rPr>
+        <w:t xml:space="preserve">  da ferramenta, vive no classpath do linter), o arquivo de Policy é decisão</w:t>
+      </w:r>
+    </w:p>
+    <w:p>
+      <w:pPr>
+        <w:spacing w:after="0"/>
+        <w:rPr>
+          <w:rFonts w:asciiTheme="majorHAnsi" w:hAnsiTheme="majorHAnsi" w:cstheme="majorHAnsi"/>
+          <w:lang w:val="pt-BR"/>
+        </w:rPr>
+      </w:pPr>
+      <w:r>
+        <w:rPr>
+          <w:rFonts w:asciiTheme="majorHAnsi" w:hAnsiTheme="majorHAnsi" w:cstheme="majorHAnsi"/>
+          <w:lang w:val="pt-BR"/>
+        </w:rPr>
+        <w:t xml:space="preserve">  de cada time analisado — deveria viver no repositório/projeto sendo</w:t>
+      </w:r>
+    </w:p>
+    <w:p>
+      <w:pPr>
+        <w:spacing w:after="0"/>
+        <w:rPr>
+          <w:rFonts w:asciiTheme="majorHAnsi" w:hAnsiTheme="majorHAnsi" w:cstheme="majorHAnsi"/>
+          <w:lang w:val="pt-BR"/>
+        </w:rPr>
+      </w:pPr>
+      <w:r>
+        <w:rPr>
+          <w:rFonts w:asciiTheme="majorHAnsi" w:hAnsiTheme="majorHAnsi" w:cstheme="majorHAnsi"/>
+          <w:lang w:val="pt-BR"/>
+        </w:rPr>
+        <w:t xml:space="preserve">  lintado, não dentro do jar. Opções não resolvidas: mesmo diretório passado</w:t>
+      </w:r>
+    </w:p>
+    <w:p>
+      <w:pPr>
+        <w:spacing w:after="0"/>
+        <w:rPr>
+          <w:rFonts w:asciiTheme="majorHAnsi" w:hAnsiTheme="majorHAnsi" w:cstheme="majorHAnsi"/>
+          <w:lang w:val="pt-BR"/>
+        </w:rPr>
+      </w:pPr>
+      <w:r>
+        <w:rPr>
+          <w:rFonts w:asciiTheme="majorHAnsi" w:hAnsiTheme="majorHAnsi" w:cstheme="majorHAnsi"/>
+          <w:lang w:val="pt-BR"/>
+        </w:rPr>
+        <w:t xml:space="preserve">  via CLI, raiz do projeto por convenção, ou caminho explícito via nova flag</w:t>
+      </w:r>
+    </w:p>
+    <w:p>
+      <w:pPr>
+        <w:spacing w:after="0"/>
+        <w:rPr>
+          <w:rFonts w:asciiTheme="majorHAnsi" w:hAnsiTheme="majorHAnsi" w:cstheme="majorHAnsi"/>
+          <w:lang w:val="pt-BR"/>
+        </w:rPr>
+      </w:pPr>
+      <w:r>
+        <w:rPr>
+          <w:rFonts w:asciiTheme="majorHAnsi" w:hAnsiTheme="majorHAnsi" w:cstheme="majorHAnsi"/>
+          <w:lang w:val="pt-BR"/>
+        </w:rPr>
+        <w:t xml:space="preserve">  (ex: --policy=). Reabre a mesma pergunta já registrada no BL-17 (suporte a</w:t>
+      </w:r>
+    </w:p>
+    <w:p>
+      <w:pPr>
+        <w:spacing w:after="0"/>
+        <w:rPr>
+          <w:rFonts w:asciiTheme="majorHAnsi" w:hAnsiTheme="majorHAnsi" w:cstheme="majorHAnsi"/>
+          <w:lang w:val="pt-BR"/>
+        </w:rPr>
+      </w:pPr>
+      <w:r>
+        <w:rPr>
+          <w:rFonts w:asciiTheme="majorHAnsi" w:hAnsiTheme="majorHAnsi" w:cstheme="majorHAnsi"/>
+          <w:lang w:val="pt-BR"/>
+        </w:rPr>
+        <w:t xml:space="preserve">  estrutura de projeto não-padrão) — os dois podem acabar compartilhando</w:t>
+      </w:r>
+    </w:p>
+    <w:p>
+      <w:pPr>
+        <w:spacing w:after="0"/>
+        <w:rPr>
+          <w:rFonts w:asciiTheme="majorHAnsi" w:hAnsiTheme="majorHAnsi" w:cstheme="majorHAnsi"/>
+          <w:lang w:val="pt-BR"/>
+        </w:rPr>
+      </w:pPr>
+      <w:r>
+        <w:rPr>
+          <w:rFonts w:asciiTheme="majorHAnsi" w:hAnsiTheme="majorHAnsi" w:cstheme="majorHAnsi"/>
+          <w:lang w:val="pt-BR"/>
+        </w:rPr>
+        <w:t xml:space="preserve">  mecanismo de descoberta de arquivo de config do projeto-alvo.</w:t>
+      </w:r>
+    </w:p>
+    <w:p>
+      <w:pPr>
+        <w:spacing w:after="0"/>
+        <w:rPr>
+          <w:rFonts w:asciiTheme="majorHAnsi" w:hAnsiTheme="majorHAnsi" w:cstheme="majorHAnsi"/>
+          <w:lang w:val="pt-BR"/>
+        </w:rPr>
+      </w:pPr>
+      <w:r>
+        <w:rPr>
+          <w:rFonts w:asciiTheme="majorHAnsi" w:hAnsiTheme="majorHAnsi" w:cstheme="majorHAnsi"/>
+          <w:lang w:val="pt-BR"/>
+        </w:rPr>
+        <w:t>- Nome/extensão do arquivo (candidato: algo no espírito de</w:t>
+      </w:r>
+    </w:p>
+    <w:p>
+      <w:pPr>
+        <w:spacing w:after="0"/>
+        <w:rPr>
+          <w:rFonts w:asciiTheme="majorHAnsi" w:hAnsiTheme="majorHAnsi" w:cstheme="majorHAnsi"/>
+          <w:lang w:val="pt-BR"/>
+        </w:rPr>
+      </w:pPr>
+      <w:r>
+        <w:rPr>
+          <w:rFonts w:asciiTheme="majorHAnsi" w:hAnsiTheme="majorHAnsi" w:cstheme="majorHAnsi"/>
+          <w:lang w:val="pt-BR"/>
+        </w:rPr>
+        <w:t xml:space="preserve">  </w:t>
+      </w:r>
+      <w:proofErr w:type="gramStart"/>
+      <w:r>
+        <w:rPr>
+          <w:rFonts w:asciiTheme="majorHAnsi" w:hAnsiTheme="majorHAnsi" w:cstheme="majorHAnsi"/>
+          <w:lang w:val="pt-BR"/>
+        </w:rPr>
+        <w:t>.spring-config-guard-policy.yml</w:t>
+      </w:r>
+      <w:proofErr w:type="gramEnd"/>
+      <w:r>
+        <w:rPr>
+          <w:rFonts w:asciiTheme="majorHAnsi" w:hAnsiTheme="majorHAnsi" w:cstheme="majorHAnsi"/>
+          <w:lang w:val="pt-BR"/>
+        </w:rPr>
+        <w:t xml:space="preserve">, seguindo convenção </w:t>
+      </w:r>
+      <w:proofErr w:type="gramStart"/>
+      <w:r>
+        <w:rPr>
+          <w:rFonts w:asciiTheme="majorHAnsi" w:hAnsiTheme="majorHAnsi" w:cstheme="majorHAnsi"/>
+          <w:lang w:val="pt-BR"/>
+        </w:rPr>
+        <w:t>tipo .eslintrc</w:t>
+      </w:r>
+      <w:proofErr w:type="gramEnd"/>
+      <w:r>
+        <w:rPr>
+          <w:rFonts w:asciiTheme="majorHAnsi" w:hAnsiTheme="majorHAnsi" w:cstheme="majorHAnsi"/>
+          <w:lang w:val="pt-BR"/>
+        </w:rPr>
+        <w:t>).</w:t>
+      </w:r>
+    </w:p>
+    <w:p>
+      <w:pPr>
+        <w:spacing w:after="0"/>
+        <w:rPr>
+          <w:rFonts w:asciiTheme="majorHAnsi" w:hAnsiTheme="majorHAnsi" w:cstheme="majorHAnsi"/>
+          <w:lang w:val="pt-BR"/>
+        </w:rPr>
+      </w:pPr>
+      <w:r>
+        <w:rPr>
+          <w:rFonts w:asciiTheme="majorHAnsi" w:hAnsiTheme="majorHAnsi" w:cstheme="majorHAnsi"/>
+          <w:lang w:val="pt-BR"/>
+        </w:rPr>
+        <w:t>- Comportamento quando o arquivo de política está ausente: presumido "normal,</w:t>
+      </w:r>
+    </w:p>
+    <w:p>
+      <w:pPr>
+        <w:spacing w:after="0"/>
+        <w:rPr>
+          <w:rFonts w:asciiTheme="majorHAnsi" w:hAnsiTheme="majorHAnsi" w:cstheme="majorHAnsi"/>
+          <w:lang w:val="pt-BR"/>
+        </w:rPr>
+      </w:pPr>
+      <w:r>
+        <w:rPr>
+          <w:rFonts w:asciiTheme="majorHAnsi" w:hAnsiTheme="majorHAnsi" w:cstheme="majorHAnsi"/>
+          <w:lang w:val="pt-BR"/>
+        </w:rPr>
+        <w:t xml:space="preserve">  segue sem supressão nenhuma" (diferente de rule-metadata, cuja ausência</w:t>
+      </w:r>
+    </w:p>
+    <w:p>
+      <w:pPr>
+        <w:spacing w:after="0"/>
+        <w:rPr>
+          <w:rFonts w:asciiTheme="majorHAnsi" w:hAnsiTheme="majorHAnsi" w:cstheme="majorHAnsi"/>
+          <w:lang w:val="pt-BR"/>
+        </w:rPr>
+      </w:pPr>
+      <w:r>
+        <w:rPr>
+          <w:rFonts w:asciiTheme="majorHAnsi" w:hAnsiTheme="majorHAnsi" w:cstheme="majorHAnsi"/>
+          <w:lang w:val="pt-BR"/>
+        </w:rPr>
+        <w:t xml:space="preserve">  falha o pipeline) — não confirmado formalmente ainda.</w:t>
+      </w:r>
+    </w:p>
+    <w:p>
+      <w:pPr>
+        <w:spacing w:after="0"/>
+        <w:rPr>
+          <w:rFonts w:asciiTheme="majorHAnsi" w:hAnsiTheme="majorHAnsi" w:cstheme="majorHAnsi"/>
+          <w:lang w:val="pt-BR"/>
+        </w:rPr>
+      </w:pPr>
+    </w:p>
+    <w:p>
+      <w:pPr>
+        <w:spacing w:after="0"/>
+        <w:rPr>
+          <w:rFonts w:asciiTheme="majorHAnsi" w:hAnsiTheme="majorHAnsi" w:cstheme="majorHAnsi"/>
+          <w:lang w:val="pt-BR"/>
+        </w:rPr>
+      </w:pPr>
+      <w:r>
+        <w:rPr>
+          <w:rFonts w:asciiTheme="majorHAnsi" w:hAnsiTheme="majorHAnsi" w:cstheme="majorHAnsi"/>
+          <w:lang w:val="pt-BR"/>
+        </w:rPr>
+        <w:lastRenderedPageBreak/>
+        <w:t>Schema candidato (não implementado):</w:t>
+      </w:r>
+    </w:p>
+    <w:p>
+      <w:pPr>
+        <w:spacing w:after="0"/>
+        <w:rPr>
+          <w:rFonts w:asciiTheme="majorHAnsi" w:hAnsiTheme="majorHAnsi" w:cstheme="majorHAnsi"/>
+          <w:lang w:val="pt-BR"/>
+        </w:rPr>
+      </w:pPr>
+      <w:r>
+        <w:rPr>
+          <w:rFonts w:asciiTheme="majorHAnsi" w:hAnsiTheme="majorHAnsi" w:cstheme="majorHAnsi"/>
+          <w:lang w:val="pt-BR"/>
+        </w:rPr>
+        <w:t xml:space="preserve"> </w:t>
+      </w:r>
+    </w:p>
+    <w:p>
+      <w:pPr>
+        <w:spacing w:after="0"/>
+        <w:rPr>
+          <w:rFonts w:ascii="Consolas" w:hAnsi="Consolas" w:cstheme="majorHAnsi"/>
+          <w:sz w:val="22"/>
+          <w:szCs w:val="22"/>
+          <w:lang w:val="pt-BR"/>
+        </w:rPr>
+      </w:pPr>
+      <w:r>
+        <w:rPr>
+          <w:rFonts w:ascii="Consolas" w:hAnsi="Consolas" w:cstheme="majorHAnsi"/>
+          <w:sz w:val="22"/>
+          <w:szCs w:val="22"/>
+          <w:lang w:val="pt-BR"/>
+        </w:rPr>
+        <w:t>suppress:</w:t>
+      </w:r>
+    </w:p>
+    <w:p>
+      <w:pPr>
+        <w:spacing w:after="0"/>
+        <w:rPr>
+          <w:rFonts w:ascii="Consolas" w:hAnsi="Consolas" w:cstheme="majorHAnsi"/>
+          <w:sz w:val="22"/>
+          <w:szCs w:val="22"/>
+          <w:lang w:val="pt-BR"/>
+        </w:rPr>
+      </w:pPr>
+      <w:r>
+        <w:rPr>
+          <w:rFonts w:ascii="Consolas" w:hAnsi="Consolas" w:cstheme="majorHAnsi"/>
+          <w:sz w:val="22"/>
+          <w:szCs w:val="22"/>
+          <w:lang w:val="pt-BR"/>
+        </w:rPr>
+        <w:t xml:space="preserve">  - </w:t>
+      </w:r>
+      <w:proofErr w:type="gramStart"/>
+      <w:r>
+        <w:rPr>
+          <w:rFonts w:ascii="Consolas" w:hAnsi="Consolas" w:cstheme="majorHAnsi"/>
+          <w:sz w:val="22"/>
+          <w:szCs w:val="22"/>
+          <w:lang w:val="pt-BR"/>
+        </w:rPr>
+        <w:t>rule</w:t>
+      </w:r>
+      <w:proofErr w:type="gramEnd"/>
+      <w:r>
+        <w:rPr>
+          <w:rFonts w:ascii="Consolas" w:hAnsi="Consolas" w:cstheme="majorHAnsi"/>
+          <w:sz w:val="22"/>
+          <w:szCs w:val="22"/>
+          <w:lang w:val="pt-BR"/>
+        </w:rPr>
+        <w:t>: SCG006</w:t>
+      </w:r>
+    </w:p>
+    <w:p>
+      <w:pPr>
+        <w:spacing w:after="0"/>
+        <w:rPr>
+          <w:rFonts w:ascii="Consolas" w:hAnsi="Consolas" w:cstheme="majorHAnsi"/>
+          <w:sz w:val="22"/>
+          <w:szCs w:val="22"/>
+          <w:lang w:val="pt-BR"/>
+        </w:rPr>
+      </w:pPr>
+      <w:r>
+        <w:rPr>
+          <w:rFonts w:ascii="Consolas" w:hAnsi="Consolas" w:cstheme="majorHAnsi"/>
+          <w:sz w:val="22"/>
+          <w:szCs w:val="22"/>
+          <w:lang w:val="pt-BR"/>
+        </w:rPr>
+        <w:t xml:space="preserve">    profiles: [dev, test, local]</w:t>
+      </w:r>
+    </w:p>
+    <w:p>
+      <w:pPr>
+        <w:spacing w:after="0"/>
+        <w:rPr>
+          <w:rFonts w:ascii="Consolas" w:hAnsi="Consolas" w:cstheme="majorHAnsi"/>
+          <w:sz w:val="22"/>
+          <w:szCs w:val="22"/>
+          <w:lang w:val="pt-BR"/>
+        </w:rPr>
+      </w:pPr>
+      <w:r>
+        <w:rPr>
+          <w:rFonts w:ascii="Consolas" w:hAnsi="Consolas" w:cstheme="majorHAnsi"/>
+          <w:sz w:val="22"/>
+          <w:szCs w:val="22"/>
+          <w:lang w:val="pt-BR"/>
+        </w:rPr>
+        <w:t xml:space="preserve">  - </w:t>
+      </w:r>
+      <w:proofErr w:type="gramStart"/>
+      <w:r>
+        <w:rPr>
+          <w:rFonts w:ascii="Consolas" w:hAnsi="Consolas" w:cstheme="majorHAnsi"/>
+          <w:sz w:val="22"/>
+          <w:szCs w:val="22"/>
+          <w:lang w:val="pt-BR"/>
+        </w:rPr>
+        <w:t>rule</w:t>
+      </w:r>
+      <w:proofErr w:type="gramEnd"/>
+      <w:r>
+        <w:rPr>
+          <w:rFonts w:ascii="Consolas" w:hAnsi="Consolas" w:cstheme="majorHAnsi"/>
+          <w:sz w:val="22"/>
+          <w:szCs w:val="22"/>
+          <w:lang w:val="pt-BR"/>
+        </w:rPr>
+        <w:t>: SCG002</w:t>
+      </w:r>
+    </w:p>
+    <w:p>
+      <w:pPr>
+        <w:spacing w:after="0"/>
+        <w:rPr>
+          <w:rFonts w:ascii="Consolas" w:hAnsi="Consolas" w:cstheme="majorHAnsi"/>
+          <w:sz w:val="22"/>
+          <w:szCs w:val="22"/>
+          <w:lang w:val="pt-BR"/>
+        </w:rPr>
+      </w:pPr>
+      <w:r>
+        <w:rPr>
+          <w:rFonts w:ascii="Consolas" w:hAnsi="Consolas" w:cstheme="majorHAnsi"/>
+          <w:sz w:val="22"/>
+          <w:szCs w:val="22"/>
+          <w:lang w:val="pt-BR"/>
+        </w:rPr>
+        <w:t xml:space="preserve">    profiles: [dev]</w:t>
+      </w:r>
+    </w:p>
+    <w:p>
+      <w:pPr>
+        <w:spacing w:after="0"/>
+        <w:rPr>
+          <w:rFonts w:asciiTheme="majorHAnsi" w:hAnsiTheme="majorHAnsi" w:cstheme="majorHAnsi"/>
+          <w:lang w:val="pt-BR"/>
+        </w:rPr>
+      </w:pPr>
+      <w:r>
+        <w:rPr>
+          <w:rFonts w:asciiTheme="majorHAnsi" w:hAnsiTheme="majorHAnsi" w:cstheme="majorHAnsi"/>
+          <w:lang w:val="pt-BR"/>
+        </w:rPr>
+        <w:t xml:space="preserve"> </w:t>
+      </w:r>
+    </w:p>
+    <w:p>
+      <w:pPr>
+        <w:spacing w:after="0"/>
+        <w:rPr>
+          <w:rFonts w:asciiTheme="majorHAnsi" w:hAnsiTheme="majorHAnsi" w:cstheme="majorHAnsi"/>
+          <w:lang w:val="pt-BR"/>
+        </w:rPr>
+      </w:pPr>
+    </w:p>
+    <w:p>
+      <w:pPr>
+        <w:spacing w:after="0"/>
+        <w:rPr>
+          <w:rFonts w:asciiTheme="majorHAnsi" w:hAnsiTheme="majorHAnsi" w:cstheme="majorHAnsi"/>
+          <w:lang w:val="pt-BR"/>
+        </w:rPr>
+      </w:pPr>
+      <w:r>
+        <w:rPr>
+          <w:rFonts w:asciiTheme="majorHAnsi" w:hAnsiTheme="majorHAnsi" w:cstheme="majorHAnsi"/>
+          <w:lang w:val="pt-BR"/>
+        </w:rPr>
+        <w:t>Custo de correção estimado: médio — mecanismo de leitura de arquivo novo,</w:t>
+      </w:r>
+    </w:p>
+    <w:p>
+      <w:pPr>
+        <w:spacing w:after="0"/>
+        <w:rPr>
+          <w:rFonts w:asciiTheme="majorHAnsi" w:hAnsiTheme="majorHAnsi" w:cstheme="majorHAnsi"/>
+          <w:lang w:val="pt-BR"/>
+        </w:rPr>
+      </w:pPr>
+      <w:r>
+        <w:rPr>
+          <w:rFonts w:asciiTheme="majorHAnsi" w:hAnsiTheme="majorHAnsi" w:cstheme="majorHAnsi"/>
+          <w:lang w:val="pt-BR"/>
+        </w:rPr>
+        <w:t>integração no pipeline do Main, e resolução das perguntas de localização/</w:t>
+      </w:r>
+    </w:p>
+    <w:p>
+      <w:pPr>
+        <w:spacing w:after="0"/>
+        <w:rPr>
+          <w:rFonts w:asciiTheme="majorHAnsi" w:hAnsiTheme="majorHAnsi" w:cstheme="majorHAnsi"/>
+          <w:lang w:val="pt-BR"/>
+        </w:rPr>
+      </w:pPr>
+      <w:r>
+        <w:rPr>
+          <w:rFonts w:asciiTheme="majorHAnsi" w:hAnsiTheme="majorHAnsi" w:cstheme="majorHAnsi"/>
+          <w:lang w:val="pt-BR"/>
+        </w:rPr>
+        <w:t>convenção antes de codar.</w:t>
+      </w:r>
+    </w:p>
+    <w:p>
+      <w:pPr>
+        <w:spacing w:after="0"/>
+        <w:rPr>
+          <w:rFonts w:asciiTheme="majorHAnsi" w:hAnsiTheme="majorHAnsi" w:cstheme="majorHAnsi"/>
+          <w:lang w:val="pt-BR"/>
+        </w:rPr>
+      </w:pPr>
+    </w:p>
+    <w:p>
+      <w:pPr>
+        <w:spacing w:after="0"/>
+        <w:rPr>
+          <w:rFonts w:asciiTheme="majorHAnsi" w:hAnsiTheme="majorHAnsi" w:cstheme="majorHAnsi"/>
+          <w:lang w:val="pt-BR"/>
+        </w:rPr>
+      </w:pPr>
+      <w:r>
+        <w:rPr>
+          <w:rFonts w:asciiTheme="majorHAnsi" w:hAnsiTheme="majorHAnsi" w:cstheme="majorHAnsi"/>
+          <w:lang w:val="pt-BR"/>
+        </w:rPr>
+        <w:t>Status: registrado, não iniciado. Superset do BL-16 (retirar BL-16 da</w:t>
+      </w:r>
+    </w:p>
+    <w:p>
+      <w:pPr>
+        <w:spacing w:after="0"/>
+        <w:rPr>
+          <w:rFonts w:asciiTheme="majorHAnsi" w:hAnsiTheme="majorHAnsi" w:cstheme="majorHAnsi"/>
+          <w:lang w:val="pt-BR"/>
+        </w:rPr>
+      </w:pPr>
+      <w:r>
+        <w:rPr>
+          <w:rFonts w:asciiTheme="majorHAnsi" w:hAnsiTheme="majorHAnsi" w:cstheme="majorHAnsi"/>
+          <w:lang w:val="pt-BR"/>
+        </w:rPr>
+        <w:t>tabela de resumo, consolidado aqui).</w:t>
       </w:r>
     </w:p>
     <w:p>
@@ -10503,12 +11577,14 @@
               <w:spacing w:after="0"/>
               <w:rPr>
                 <w:rFonts w:asciiTheme="majorHAnsi" w:hAnsiTheme="majorHAnsi" w:cstheme="majorHAnsi"/>
+                <w:strike/>
                 <w:lang w:val="pt-BR"/>
               </w:rPr>
             </w:pPr>
             <w:r>
               <w:rPr>
                 <w:rFonts w:asciiTheme="majorHAnsi" w:hAnsiTheme="majorHAnsi" w:cstheme="majorHAnsi"/>
+                <w:strike/>
               </w:rPr>
               <w:t>BL-16</w:t>
             </w:r>
@@ -10523,12 +11599,14 @@
               <w:spacing w:after="0"/>
               <w:rPr>
                 <w:rFonts w:asciiTheme="majorHAnsi" w:hAnsiTheme="majorHAnsi" w:cstheme="majorHAnsi"/>
+                <w:strike/>
                 <w:lang w:val="pt-BR"/>
               </w:rPr>
             </w:pPr>
             <w:r>
               <w:rPr>
                 <w:rFonts w:asciiTheme="majorHAnsi" w:hAnsiTheme="majorHAnsi" w:cstheme="majorHAnsi"/>
+                <w:strike/>
               </w:rPr>
               <w:t>Mecanismo de supressão de falsos positivos</w:t>
             </w:r>
@@ -10543,18 +11621,21 @@
               <w:spacing w:after="0"/>
               <w:rPr>
                 <w:rFonts w:asciiTheme="majorHAnsi" w:hAnsiTheme="majorHAnsi" w:cstheme="majorHAnsi"/>
+                <w:strike/>
                 <w:lang w:val="pt-BR"/>
               </w:rPr>
             </w:pPr>
             <w:r>
               <w:rPr>
                 <w:rFonts w:ascii="Segoe UI Emoji" w:hAnsi="Segoe UI Emoji" w:cs="Segoe UI Emoji"/>
+                <w:strike/>
               </w:rPr>
               <w:t>🟢</w:t>
             </w:r>
             <w:r>
               <w:rPr>
                 <w:rFonts w:asciiTheme="majorHAnsi" w:hAnsiTheme="majorHAnsi" w:cstheme="majorHAnsi"/>
+                <w:strike/>
               </w:rPr>
               <w:t xml:space="preserve"> Baixa (aguarda fricção real)</w:t>
             </w:r>
@@ -10569,12 +11650,14 @@
               <w:spacing w:after="0"/>
               <w:rPr>
                 <w:rFonts w:asciiTheme="majorHAnsi" w:hAnsiTheme="majorHAnsi" w:cstheme="majorHAnsi"/>
+                <w:strike/>
                 <w:lang w:val="pt-BR"/>
               </w:rPr>
             </w:pPr>
             <w:r>
               <w:rPr>
                 <w:rFonts w:asciiTheme="majorHAnsi" w:hAnsiTheme="majorHAnsi" w:cstheme="majorHAnsi"/>
+                <w:strike/>
               </w:rPr>
               <w:t>Médio-alto</w:t>
             </w:r>
@@ -10685,7 +11768,6 @@
               <w:rPr>
                 <w:rFonts w:asciiTheme="majorHAnsi" w:hAnsiTheme="majorHAnsi" w:cstheme="majorHAnsi"/>
               </w:rPr>
-              <w:lastRenderedPageBreak/>
               <w:t>BL-18</w:t>
             </w:r>
           </w:p>
@@ -11076,7 +12158,14 @@
               <w:rPr>
                 <w:rFonts w:asciiTheme="majorHAnsi" w:hAnsiTheme="majorHAnsi" w:cstheme="majorHAnsi"/>
               </w:rPr>
-              <w:t>Exibição do profile base interno __spring_config_guard_base__ confunde o usuário</w:t>
+              <w:t xml:space="preserve">Exibição do profile base interno </w:t>
+            </w:r>
+            <w:r>
+              <w:rPr>
+                <w:rFonts w:asciiTheme="majorHAnsi" w:hAnsiTheme="majorHAnsi" w:cstheme="majorHAnsi"/>
+              </w:rPr>
+              <w:lastRenderedPageBreak/>
+              <w:t>__spring_config_guard_base__ confunde o usuário</w:t>
             </w:r>
           </w:p>
         </w:tc>
@@ -11095,6 +12184,7 @@
               <w:rPr>
                 <w:rFonts w:ascii="Segoe UI Emoji" w:hAnsi="Segoe UI Emoji" w:cs="Segoe UI Emoji"/>
               </w:rPr>
+              <w:lastRenderedPageBreak/>
               <w:t>Média</w:t>
             </w:r>
           </w:p>
@@ -11114,7 +12204,100 @@
               <w:rPr>
                 <w:rFonts w:asciiTheme="majorHAnsi" w:hAnsiTheme="majorHAnsi" w:cstheme="majorHAnsi"/>
               </w:rPr>
-              <w:t>Baixo, registrado não iniciado</w:t>
+              <w:t xml:space="preserve">Baixo, registrado </w:t>
+            </w:r>
+            <w:r>
+              <w:rPr>
+                <w:rFonts w:asciiTheme="majorHAnsi" w:hAnsiTheme="majorHAnsi" w:cstheme="majorHAnsi"/>
+              </w:rPr>
+              <w:lastRenderedPageBreak/>
+              <w:t>não iniciado</w:t>
+            </w:r>
+          </w:p>
+        </w:tc>
+      </w:tr>
+      <w:tr>
+        <w:tc>
+          <w:tcPr>
+            <w:tcW w:w="978" w:type="dxa"/>
+          </w:tcPr>
+          <w:p>
+            <w:pPr>
+              <w:spacing w:after="0"/>
+              <w:rPr>
+                <w:rFonts w:asciiTheme="majorHAnsi" w:hAnsiTheme="majorHAnsi" w:cstheme="majorHAnsi"/>
+              </w:rPr>
+            </w:pPr>
+            <w:r>
+              <w:rPr>
+                <w:rFonts w:asciiTheme="majorHAnsi" w:hAnsiTheme="majorHAnsi" w:cstheme="majorHAnsi"/>
+              </w:rPr>
+              <w:lastRenderedPageBreak/>
+              <w:t>BL-23</w:t>
+            </w:r>
+          </w:p>
+        </w:tc>
+        <w:tc>
+          <w:tcPr>
+            <w:tcW w:w="4479" w:type="dxa"/>
+          </w:tcPr>
+          <w:p>
+            <w:pPr>
+              <w:spacing w:after="0"/>
+              <w:jc w:val="both"/>
+              <w:rPr>
+                <w:rFonts w:asciiTheme="majorHAnsi" w:hAnsiTheme="majorHAnsi" w:cstheme="majorHAnsi"/>
+              </w:rPr>
+            </w:pPr>
+            <w:r>
+              <w:rPr>
+                <w:rFonts w:asciiTheme="majorHAnsi" w:hAnsiTheme="majorHAnsi" w:cstheme="majorHAnsi"/>
+              </w:rPr>
+              <w:t>Camada de Policy: supressão binária de findings por regra + profile (superset do BL-16)</w:t>
+            </w:r>
+          </w:p>
+        </w:tc>
+        <w:tc>
+          <w:tcPr>
+            <w:tcW w:w="1977" w:type="dxa"/>
+          </w:tcPr>
+          <w:p>
+            <w:pPr>
+              <w:spacing w:after="0"/>
+              <w:rPr>
+                <w:rFonts w:asciiTheme="majorHAnsi" w:hAnsiTheme="majorHAnsi" w:cstheme="majorHAnsi"/>
+              </w:rPr>
+            </w:pPr>
+            <w:r>
+              <w:rPr>
+                <w:rFonts w:ascii="Segoe UI Emoji" w:hAnsi="Segoe UI Emoji" w:cs="Segoe UI Emoji"/>
+              </w:rPr>
+              <w:t>🟡</w:t>
+            </w:r>
+            <w:r>
+              <w:rPr>
+                <w:rFonts w:asciiTheme="majorHAnsi" w:hAnsiTheme="majorHAnsi" w:cstheme="majorHAnsi"/>
+              </w:rPr>
+              <w:t xml:space="preserve"> Média (design parcialmente decidido, aguarda implementação)</w:t>
+            </w:r>
+          </w:p>
+        </w:tc>
+        <w:tc>
+          <w:tcPr>
+            <w:tcW w:w="2104" w:type="dxa"/>
+          </w:tcPr>
+          <w:p>
+            <w:pPr>
+              <w:spacing w:after="0"/>
+              <w:rPr>
+                <w:rFonts w:asciiTheme="majorHAnsi" w:hAnsiTheme="majorHAnsi" w:cstheme="majorHAnsi"/>
+              </w:rPr>
+            </w:pPr>
+            <w:r>
+              <w:rPr>
+                <w:rFonts w:asciiTheme="majorHAnsi" w:hAnsiTheme="majorHAnsi" w:cstheme="majorHAnsi"/>
+              </w:rPr>
+              <w:t>Médio</w:t>
             </w:r>
           </w:p>
         </w:tc>
@@ -12813,7 +13996,6 @@
   <w:style w:type="character" w:default="1" w:styleId="Fontepargpadro">
     <w:name w:val="Default Paragraph Font"/>
     <w:uiPriority w:val="1"/>
-    <w:semiHidden/>
     <w:unhideWhenUsed/>
   </w:style>
   <w:style w:type="table" w:default="1" w:styleId="Tabelanormal">

</xml_diff>